<commit_message>
Gestion de la langue et ajout de commentaire
Le spider est prêt !
</commit_message>
<xml_diff>
--- a/remise2.docx
+++ b/remise2.docx
@@ -660,7 +660,7 @@
           <w:r>
             <w:fldChar w:fldCharType="separate"/>
           </w:r>
-          <w:hyperlink w:anchor="_Toc211110067" w:history="1">
+          <w:hyperlink w:anchor="_Toc211160459" w:history="1">
             <w:r>
               <w:rPr>
                 <w:rStyle w:val="Lienhypertexte"/>
@@ -688,7 +688,7 @@
                 <w:noProof/>
                 <w:webHidden/>
               </w:rPr>
-              <w:instrText xml:space="preserve"> PAGEREF _Toc211110067 \h </w:instrText>
+              <w:instrText xml:space="preserve"> PAGEREF _Toc211160459 \h </w:instrText>
             </w:r>
             <w:r>
               <w:rPr>
@@ -733,7 +733,7 @@
               <w14:ligatures w14:val="standardContextual"/>
             </w:rPr>
           </w:pPr>
-          <w:hyperlink w:anchor="_Toc211110068" w:history="1">
+          <w:hyperlink w:anchor="_Toc211160460" w:history="1">
             <w:r>
               <w:rPr>
                 <w:rStyle w:val="Lienhypertexte"/>
@@ -761,7 +761,7 @@
                 <w:noProof/>
                 <w:webHidden/>
               </w:rPr>
-              <w:instrText xml:space="preserve"> PAGEREF _Toc211110068 \h </w:instrText>
+              <w:instrText xml:space="preserve"> PAGEREF _Toc211160460 \h </w:instrText>
             </w:r>
             <w:r>
               <w:rPr>
@@ -806,7 +806,7 @@
               <w14:ligatures w14:val="standardContextual"/>
             </w:rPr>
           </w:pPr>
-          <w:hyperlink w:anchor="_Toc211110069" w:history="1">
+          <w:hyperlink w:anchor="_Toc211160461" w:history="1">
             <w:r>
               <w:rPr>
                 <w:rStyle w:val="Lienhypertexte"/>
@@ -834,7 +834,7 @@
                 <w:noProof/>
                 <w:webHidden/>
               </w:rPr>
-              <w:instrText xml:space="preserve"> PAGEREF _Toc211110069 \h </w:instrText>
+              <w:instrText xml:space="preserve"> PAGEREF _Toc211160461 \h </w:instrText>
             </w:r>
             <w:r>
               <w:rPr>
@@ -879,7 +879,7 @@
               <w14:ligatures w14:val="standardContextual"/>
             </w:rPr>
           </w:pPr>
-          <w:hyperlink w:anchor="_Toc211110070" w:history="1">
+          <w:hyperlink w:anchor="_Toc211160462" w:history="1">
             <w:r>
               <w:rPr>
                 <w:rStyle w:val="Lienhypertexte"/>
@@ -907,7 +907,7 @@
                 <w:noProof/>
                 <w:webHidden/>
               </w:rPr>
-              <w:instrText xml:space="preserve"> PAGEREF _Toc211110070 \h </w:instrText>
+              <w:instrText xml:space="preserve"> PAGEREF _Toc211160462 \h </w:instrText>
             </w:r>
             <w:r>
               <w:rPr>
@@ -952,7 +952,7 @@
               <w14:ligatures w14:val="standardContextual"/>
             </w:rPr>
           </w:pPr>
-          <w:hyperlink w:anchor="_Toc211110071" w:history="1">
+          <w:hyperlink w:anchor="_Toc211160463" w:history="1">
             <w:r>
               <w:rPr>
                 <w:rStyle w:val="Lienhypertexte"/>
@@ -980,7 +980,7 @@
                 <w:noProof/>
                 <w:webHidden/>
               </w:rPr>
-              <w:instrText xml:space="preserve"> PAGEREF _Toc211110071 \h </w:instrText>
+              <w:instrText xml:space="preserve"> PAGEREF _Toc211160463 \h </w:instrText>
             </w:r>
             <w:r>
               <w:rPr>
@@ -1025,7 +1025,7 @@
               <w14:ligatures w14:val="standardContextual"/>
             </w:rPr>
           </w:pPr>
-          <w:hyperlink w:anchor="_Toc211110072" w:history="1">
+          <w:hyperlink w:anchor="_Toc211160464" w:history="1">
             <w:r>
               <w:rPr>
                 <w:rStyle w:val="Lienhypertexte"/>
@@ -1053,7 +1053,7 @@
                 <w:noProof/>
                 <w:webHidden/>
               </w:rPr>
-              <w:instrText xml:space="preserve"> PAGEREF _Toc211110072 \h </w:instrText>
+              <w:instrText xml:space="preserve"> PAGEREF _Toc211160464 \h </w:instrText>
             </w:r>
             <w:r>
               <w:rPr>
@@ -1098,7 +1098,7 @@
               <w14:ligatures w14:val="standardContextual"/>
             </w:rPr>
           </w:pPr>
-          <w:hyperlink w:anchor="_Toc211110073" w:history="1">
+          <w:hyperlink w:anchor="_Toc211160465" w:history="1">
             <w:r>
               <w:rPr>
                 <w:rStyle w:val="Lienhypertexte"/>
@@ -1126,7 +1126,7 @@
                 <w:noProof/>
                 <w:webHidden/>
               </w:rPr>
-              <w:instrText xml:space="preserve"> PAGEREF _Toc211110073 \h </w:instrText>
+              <w:instrText xml:space="preserve"> PAGEREF _Toc211160465 \h </w:instrText>
             </w:r>
             <w:r>
               <w:rPr>
@@ -1171,7 +1171,7 @@
               <w14:ligatures w14:val="standardContextual"/>
             </w:rPr>
           </w:pPr>
-          <w:hyperlink w:anchor="_Toc211110074" w:history="1">
+          <w:hyperlink w:anchor="_Toc211160466" w:history="1">
             <w:r>
               <w:rPr>
                 <w:rStyle w:val="Lienhypertexte"/>
@@ -1199,7 +1199,7 @@
                 <w:noProof/>
                 <w:webHidden/>
               </w:rPr>
-              <w:instrText xml:space="preserve"> PAGEREF _Toc211110074 \h </w:instrText>
+              <w:instrText xml:space="preserve"> PAGEREF _Toc211160466 \h </w:instrText>
             </w:r>
             <w:r>
               <w:rPr>
@@ -1244,7 +1244,7 @@
               <w14:ligatures w14:val="standardContextual"/>
             </w:rPr>
           </w:pPr>
-          <w:hyperlink w:anchor="_Toc211110075" w:history="1">
+          <w:hyperlink w:anchor="_Toc211160467" w:history="1">
             <w:r>
               <w:rPr>
                 <w:rStyle w:val="Lienhypertexte"/>
@@ -1272,7 +1272,7 @@
                 <w:noProof/>
                 <w:webHidden/>
               </w:rPr>
-              <w:instrText xml:space="preserve"> PAGEREF _Toc211110075 \h </w:instrText>
+              <w:instrText xml:space="preserve"> PAGEREF _Toc211160467 \h </w:instrText>
             </w:r>
             <w:r>
               <w:rPr>
@@ -1317,14 +1317,14 @@
               <w14:ligatures w14:val="standardContextual"/>
             </w:rPr>
           </w:pPr>
-          <w:hyperlink w:anchor="_Toc211110076" w:history="1">
+          <w:hyperlink w:anchor="_Toc211160468" w:history="1">
             <w:r>
               <w:rPr>
                 <w:rStyle w:val="Lienhypertexte"/>
                 <w:noProof/>
                 <w:lang w:val="fr-FR" w:eastAsia="en-US"/>
               </w:rPr>
-              <w:t>Scrappy</w:t>
+              <w:t>Scrapy</w:t>
             </w:r>
             <w:r>
               <w:rPr>
@@ -1345,7 +1345,80 @@
                 <w:noProof/>
                 <w:webHidden/>
               </w:rPr>
-              <w:instrText xml:space="preserve"> PAGEREF _Toc211110076 \h </w:instrText>
+              <w:instrText xml:space="preserve"> PAGEREF _Toc211160468 \h </w:instrText>
+            </w:r>
+            <w:r>
+              <w:rPr>
+                <w:noProof/>
+                <w:webHidden/>
+              </w:rPr>
+            </w:r>
+            <w:r>
+              <w:rPr>
+                <w:noProof/>
+                <w:webHidden/>
+              </w:rPr>
+              <w:fldChar w:fldCharType="separate"/>
+            </w:r>
+            <w:r>
+              <w:rPr>
+                <w:noProof/>
+                <w:webHidden/>
+              </w:rPr>
+              <w:t>7</w:t>
+            </w:r>
+            <w:r>
+              <w:rPr>
+                <w:noProof/>
+                <w:webHidden/>
+              </w:rPr>
+              <w:fldChar w:fldCharType="end"/>
+            </w:r>
+          </w:hyperlink>
+        </w:p>
+        <w:p>
+          <w:pPr>
+            <w:pStyle w:val="TM2"/>
+            <w:tabs>
+              <w:tab w:val="right" w:leader="dot" w:pos="9622"/>
+            </w:tabs>
+            <w:rPr>
+              <w:noProof/>
+              <w:kern w:val="2"/>
+              <w:sz w:val="24"/>
+              <w:szCs w:val="24"/>
+              <w14:ligatures w14:val="standardContextual"/>
+            </w:rPr>
+          </w:pPr>
+          <w:hyperlink w:anchor="_Toc211160469" w:history="1">
+            <w:r>
+              <w:rPr>
+                <w:rStyle w:val="Lienhypertexte"/>
+                <w:noProof/>
+                <w:lang w:val="fr-FR" w:eastAsia="en-US"/>
+              </w:rPr>
+              <w:t>MongoDB Atlas</w:t>
+            </w:r>
+            <w:r>
+              <w:rPr>
+                <w:noProof/>
+                <w:webHidden/>
+              </w:rPr>
+              <w:tab/>
+            </w:r>
+            <w:r>
+              <w:rPr>
+                <w:noProof/>
+                <w:webHidden/>
+              </w:rPr>
+              <w:fldChar w:fldCharType="begin"/>
+            </w:r>
+            <w:r>
+              <w:rPr>
+                <w:noProof/>
+                <w:webHidden/>
+              </w:rPr>
+              <w:instrText xml:space="preserve"> PAGEREF _Toc211160469 \h </w:instrText>
             </w:r>
             <w:r>
               <w:rPr>
@@ -1390,7 +1463,7 @@
               <w14:ligatures w14:val="standardContextual"/>
             </w:rPr>
           </w:pPr>
-          <w:hyperlink w:anchor="_Toc211110077" w:history="1">
+          <w:hyperlink w:anchor="_Toc211160470" w:history="1">
             <w:r>
               <w:rPr>
                 <w:rStyle w:val="Lienhypertexte"/>
@@ -1418,7 +1491,7 @@
                 <w:noProof/>
                 <w:webHidden/>
               </w:rPr>
-              <w:instrText xml:space="preserve"> PAGEREF _Toc211110077 \h </w:instrText>
+              <w:instrText xml:space="preserve"> PAGEREF _Toc211160470 \h </w:instrText>
             </w:r>
             <w:r>
               <w:rPr>
@@ -1463,7 +1536,7 @@
               <w14:ligatures w14:val="standardContextual"/>
             </w:rPr>
           </w:pPr>
-          <w:hyperlink w:anchor="_Toc211110078" w:history="1">
+          <w:hyperlink w:anchor="_Toc211160471" w:history="1">
             <w:r>
               <w:rPr>
                 <w:rStyle w:val="Lienhypertexte"/>
@@ -1491,7 +1564,7 @@
                 <w:noProof/>
                 <w:webHidden/>
               </w:rPr>
-              <w:instrText xml:space="preserve"> PAGEREF _Toc211110078 \h </w:instrText>
+              <w:instrText xml:space="preserve"> PAGEREF _Toc211160471 \h </w:instrText>
             </w:r>
             <w:r>
               <w:rPr>
@@ -1561,7 +1634,7 @@
           <w:lang w:val="fr-FR"/>
         </w:rPr>
       </w:pPr>
-      <w:bookmarkStart w:id="0" w:name="_Toc211110067"/>
+      <w:bookmarkStart w:id="0" w:name="_Toc211160459"/>
       <w:r>
         <w:rPr>
           <w:lang w:val="fr-FR"/>
@@ -1688,7 +1761,7 @@
           <w:lang w:val="fr-FR"/>
         </w:rPr>
       </w:pPr>
-      <w:bookmarkStart w:id="1" w:name="_Toc211110068"/>
+      <w:bookmarkStart w:id="1" w:name="_Toc211160460"/>
       <w:r>
         <w:rPr>
           <w:lang w:val="fr-FR"/>
@@ -2031,11 +2104,28 @@
                 <w:bCs/>
                 <w:lang w:val="fr-FR" w:eastAsia="en-US"/>
               </w:rPr>
-              <w:t>Étapes :</w:t>
+              <w:t>Étapes </w:t>
+            </w:r>
+            <w:r>
+              <w:rPr>
+                <w:b/>
+                <w:bCs/>
+                <w:lang w:val="fr-FR" w:eastAsia="en-US"/>
+              </w:rPr>
+              <w:t>(Heidi)</w:t>
+            </w:r>
+            <w:r>
+              <w:rPr>
+                <w:b/>
+                <w:bCs/>
+                <w:lang w:val="fr-FR" w:eastAsia="en-US"/>
+              </w:rPr>
+              <w:t>:</w:t>
             </w:r>
           </w:p>
           <w:p>
             <w:pPr>
+              <w:spacing w:after="0"/>
               <w:rPr>
                 <w:b/>
                 <w:bCs/>
@@ -2058,6 +2148,7 @@
                 <w:ilvl w:val="0"/>
                 <w:numId w:val="4"/>
               </w:numPr>
+              <w:spacing w:after="0"/>
               <w:rPr>
                 <w:lang w:val="fr-FR" w:eastAsia="en-US"/>
               </w:rPr>
@@ -2071,6 +2162,7 @@
           </w:p>
           <w:p>
             <w:pPr>
+              <w:spacing w:after="0"/>
               <w:rPr>
                 <w:lang w:val="fr-FR" w:eastAsia="en-US"/>
               </w:rPr>
@@ -2097,6 +2189,7 @@
                 <w:ilvl w:val="0"/>
                 <w:numId w:val="4"/>
               </w:numPr>
+              <w:spacing w:after="0"/>
               <w:rPr>
                 <w:lang w:val="fr-FR" w:eastAsia="en-US"/>
               </w:rPr>
@@ -2115,6 +2208,7 @@
                 <w:ilvl w:val="0"/>
                 <w:numId w:val="4"/>
               </w:numPr>
+              <w:spacing w:after="0"/>
               <w:rPr>
                 <w:lang w:val="fr-FR" w:eastAsia="en-US"/>
               </w:rPr>
@@ -2133,6 +2227,7 @@
                 <w:ilvl w:val="0"/>
                 <w:numId w:val="4"/>
               </w:numPr>
+              <w:spacing w:after="0"/>
               <w:rPr>
                 <w:lang w:val="fr-FR" w:eastAsia="en-US"/>
               </w:rPr>
@@ -2158,6 +2253,7 @@
           </w:p>
           <w:p>
             <w:pPr>
+              <w:spacing w:after="0"/>
               <w:rPr>
                 <w:b/>
                 <w:bCs/>
@@ -2196,6 +2292,7 @@
                 <w:ilvl w:val="0"/>
                 <w:numId w:val="4"/>
               </w:numPr>
+              <w:spacing w:after="0"/>
               <w:rPr>
                 <w:lang w:eastAsia="en-US"/>
               </w:rPr>
@@ -2226,6 +2323,7 @@
                 <w:ilvl w:val="0"/>
                 <w:numId w:val="4"/>
               </w:numPr>
+              <w:spacing w:after="0"/>
               <w:rPr>
                 <w:lang w:val="fr-FR" w:eastAsia="en-US"/>
               </w:rPr>
@@ -2234,7 +2332,6 @@
               <w:rPr>
                 <w:lang w:val="fr-FR" w:eastAsia="en-US"/>
               </w:rPr>
-              <w:lastRenderedPageBreak/>
               <w:t xml:space="preserve">python -m scrapy crawl </w:t>
             </w:r>
             <w:r>
@@ -2252,6 +2349,7 @@
           </w:p>
           <w:p>
             <w:pPr>
+              <w:spacing w:after="0"/>
               <w:rPr>
                 <w:b/>
                 <w:bCs/>
@@ -2274,6 +2372,7 @@
                 <w:ilvl w:val="0"/>
                 <w:numId w:val="4"/>
               </w:numPr>
+              <w:spacing w:after="0"/>
               <w:rPr>
                 <w:lang w:val="fr-FR" w:eastAsia="en-US"/>
               </w:rPr>
@@ -2287,6 +2386,7 @@
           </w:p>
           <w:p>
             <w:pPr>
+              <w:spacing w:after="0"/>
               <w:rPr>
                 <w:b/>
                 <w:bCs/>
@@ -2299,6 +2399,7 @@
                 <w:bCs/>
                 <w:lang w:val="fr-FR" w:eastAsia="en-US"/>
               </w:rPr>
+              <w:lastRenderedPageBreak/>
               <w:t>Modifier le fichier hl_projet2.py</w:t>
             </w:r>
             <w:r>
@@ -2317,6 +2418,7 @@
                 <w:ilvl w:val="0"/>
                 <w:numId w:val="4"/>
               </w:numPr>
+              <w:spacing w:after="0"/>
               <w:rPr>
                 <w:lang w:val="fr-FR" w:eastAsia="en-US"/>
               </w:rPr>
@@ -2336,23 +2438,89 @@
           </w:p>
           <w:p>
             <w:pPr>
-              <w:rPr>
-                <w:lang w:val="fr-FR" w:eastAsia="en-US"/>
-              </w:rPr>
-            </w:pPr>
-            <w:r>
+              <w:spacing w:after="0"/>
               <w:rPr>
                 <w:b/>
                 <w:bCs/>
                 <w:lang w:val="fr-FR" w:eastAsia="en-US"/>
               </w:rPr>
-              <w:t>Dans VSCode :</w:t>
-            </w:r>
-            <w:r>
-              <w:rPr>
-                <w:lang w:val="fr-FR" w:eastAsia="en-US"/>
-              </w:rPr>
-              <w:t xml:space="preserve"> </w:t>
+            </w:pPr>
+            <w:r>
+              <w:rPr>
+                <w:b/>
+                <w:bCs/>
+                <w:lang w:val="fr-FR" w:eastAsia="en-US"/>
+              </w:rPr>
+              <w:t>Installation d’un traducteur pour prendre les données en français :</w:t>
+            </w:r>
+          </w:p>
+          <w:p>
+            <w:pPr>
+              <w:pStyle w:val="Paragraphedeliste"/>
+              <w:numPr>
+                <w:ilvl w:val="0"/>
+                <w:numId w:val="1"/>
+              </w:numPr>
+              <w:spacing w:after="0"/>
+              <w:rPr>
+                <w:lang w:val="fr-FR" w:eastAsia="en-US"/>
+              </w:rPr>
+            </w:pPr>
+            <w:r>
+              <w:rPr>
+                <w:lang w:val="fr-FR" w:eastAsia="en-US"/>
+              </w:rPr>
+              <w:t>pip install deep-translator</w:t>
+            </w:r>
+          </w:p>
+          <w:p>
+            <w:pPr>
+              <w:spacing w:after="0"/>
+              <w:rPr>
+                <w:b/>
+                <w:bCs/>
+                <w:lang w:val="fr-FR" w:eastAsia="en-US"/>
+              </w:rPr>
+            </w:pPr>
+            <w:r>
+              <w:rPr>
+                <w:b/>
+                <w:bCs/>
+                <w:lang w:val="fr-FR" w:eastAsia="en-US"/>
+              </w:rPr>
+              <w:t xml:space="preserve">Ajouter dans le haut du </w:t>
+            </w:r>
+            <w:r>
+              <w:rPr>
+                <w:b/>
+                <w:bCs/>
+                <w:lang w:val="fr-FR" w:eastAsia="en-US"/>
+              </w:rPr>
+              <w:t>fichier hl_projet2.py</w:t>
+            </w:r>
+            <w:r>
+              <w:rPr>
+                <w:b/>
+                <w:bCs/>
+                <w:lang w:val="fr-FR" w:eastAsia="en-US"/>
+              </w:rPr>
+              <w:t> </w:t>
+            </w:r>
+            <w:r>
+              <w:rPr>
+                <w:b/>
+                <w:bCs/>
+                <w:lang w:val="fr-FR" w:eastAsia="en-US"/>
+              </w:rPr>
+              <w:t xml:space="preserve">pour la </w:t>
+            </w:r>
+            <w:r>
+              <w:rPr>
+                <w:b/>
+                <w:bCs/>
+                <w:lang w:val="fr-FR" w:eastAsia="en-US"/>
+              </w:rPr>
+              <w:t>traduction :</w:t>
             </w:r>
           </w:p>
           <w:p>
@@ -2362,15 +2530,74 @@
                 <w:ilvl w:val="0"/>
                 <w:numId w:val="4"/>
               </w:numPr>
+              <w:spacing w:after="0"/>
               <w:rPr>
                 <w:lang w:val="fr-FR" w:eastAsia="en-US"/>
               </w:rPr>
             </w:pPr>
             <w:r>
               <w:rPr>
-                <w:lang w:val="fr-FR" w:eastAsia="en-US"/>
-              </w:rPr>
-              <w:t>python -m scrapy crawl hl_projet2 -o produits.json</w:t>
+                <w:lang w:eastAsia="en-US"/>
+              </w:rPr>
+              <w:t xml:space="preserve"> </w:t>
+            </w:r>
+            <w:r>
+              <w:rPr>
+                <w:lang w:val="fr-FR" w:eastAsia="en-US"/>
+              </w:rPr>
+              <w:t>Quelques</w:t>
+            </w:r>
+            <w:r>
+              <w:rPr>
+                <w:lang w:val="fr-FR" w:eastAsia="en-US"/>
+              </w:rPr>
+              <w:t xml:space="preserve"> modifications à faire</w:t>
+            </w:r>
+            <w:r>
+              <w:rPr>
+                <w:lang w:val="fr-FR" w:eastAsia="en-US"/>
+              </w:rPr>
+              <w:t xml:space="preserve"> </w:t>
+            </w:r>
+            <w:r>
+              <w:rPr>
+                <w:lang w:val="fr-FR" w:eastAsia="en-US"/>
+              </w:rPr>
+              <w:t xml:space="preserve">(imprime écran </w:t>
+            </w:r>
+            <w:r>
+              <w:rPr>
+                <w:lang w:val="fr-FR" w:eastAsia="en-US"/>
+              </w:rPr>
+              <w:t>2</w:t>
+            </w:r>
+            <w:r>
+              <w:rPr>
+                <w:lang w:val="fr-FR" w:eastAsia="en-US"/>
+              </w:rPr>
+              <w:t>)</w:t>
+            </w:r>
+          </w:p>
+          <w:p>
+            <w:pPr>
+              <w:spacing w:after="0"/>
+              <w:rPr>
+                <w:lang w:val="fr-FR" w:eastAsia="en-US"/>
+              </w:rPr>
+            </w:pPr>
+            <w:r>
+              <w:rPr>
+                <w:b/>
+                <w:bCs/>
+                <w:lang w:val="fr-FR" w:eastAsia="en-US"/>
+              </w:rPr>
+              <w:t>Dans VSCode :</w:t>
+            </w:r>
+            <w:r>
+              <w:rPr>
+                <w:lang w:val="fr-FR" w:eastAsia="en-US"/>
+              </w:rPr>
+              <w:t xml:space="preserve"> </w:t>
             </w:r>
           </w:p>
           <w:p>
@@ -2380,6 +2607,7 @@
                 <w:ilvl w:val="0"/>
                 <w:numId w:val="4"/>
               </w:numPr>
+              <w:spacing w:after="0"/>
               <w:rPr>
                 <w:lang w:val="fr-FR" w:eastAsia="en-US"/>
               </w:rPr>
@@ -2388,7 +2616,117 @@
               <w:rPr>
                 <w:lang w:val="fr-FR" w:eastAsia="en-US"/>
               </w:rPr>
-              <w:t>Attendre longtemps</w:t>
+              <w:t>python -m scrapy crawl hl_projet2 -o produits.json</w:t>
+            </w:r>
+          </w:p>
+          <w:p>
+            <w:pPr>
+              <w:spacing w:after="0"/>
+              <w:rPr>
+                <w:b/>
+                <w:bCs/>
+                <w:lang w:val="fr-FR" w:eastAsia="en-US"/>
+              </w:rPr>
+            </w:pPr>
+            <w:r>
+              <w:rPr>
+                <w:b/>
+                <w:bCs/>
+                <w:lang w:val="fr-FR" w:eastAsia="en-US"/>
+              </w:rPr>
+              <w:t>T</w:t>
+            </w:r>
+            <w:r>
+              <w:rPr>
+                <w:b/>
+                <w:bCs/>
+                <w:lang w:val="fr-FR" w:eastAsia="en-US"/>
+              </w:rPr>
+              <w:t>est avant de récupérer toutes les données</w:t>
+            </w:r>
+            <w:r>
+              <w:rPr>
+                <w:b/>
+                <w:bCs/>
+                <w:lang w:val="fr-FR" w:eastAsia="en-US"/>
+              </w:rPr>
+              <w:t> :</w:t>
+            </w:r>
+          </w:p>
+          <w:p>
+            <w:pPr>
+              <w:pStyle w:val="Paragraphedeliste"/>
+              <w:numPr>
+                <w:ilvl w:val="0"/>
+                <w:numId w:val="4"/>
+              </w:numPr>
+              <w:spacing w:after="0"/>
+              <w:rPr>
+                <w:lang w:val="fr-FR" w:eastAsia="en-US"/>
+              </w:rPr>
+            </w:pPr>
+            <w:r>
+              <w:rPr>
+                <w:lang w:val="fr-FR" w:eastAsia="en-US"/>
+              </w:rPr>
+              <w:t>Scrape une dizaine de données</w:t>
+            </w:r>
+          </w:p>
+          <w:p>
+            <w:pPr>
+              <w:pStyle w:val="Paragraphedeliste"/>
+              <w:numPr>
+                <w:ilvl w:val="0"/>
+                <w:numId w:val="4"/>
+              </w:numPr>
+              <w:spacing w:after="0"/>
+              <w:rPr>
+                <w:lang w:val="fr-FR" w:eastAsia="en-US"/>
+              </w:rPr>
+            </w:pPr>
+            <w:r>
+              <w:rPr>
+                <w:lang w:val="fr-FR" w:eastAsia="en-US"/>
+              </w:rPr>
+              <w:t>Essayer d’importer le fichier dans MongoDB Atlas pour s’assurer que le format est bien</w:t>
+            </w:r>
+          </w:p>
+          <w:p>
+            <w:pPr>
+              <w:pStyle w:val="Paragraphedeliste"/>
+              <w:numPr>
+                <w:ilvl w:val="0"/>
+                <w:numId w:val="4"/>
+              </w:numPr>
+              <w:spacing w:after="0"/>
+              <w:rPr>
+                <w:lang w:val="fr-FR" w:eastAsia="en-US"/>
+              </w:rPr>
+            </w:pPr>
+            <w:r>
+              <w:rPr>
+                <w:lang w:val="fr-FR" w:eastAsia="en-US"/>
+              </w:rPr>
+              <w:t>Quelques modifications pour faciliter l’import dans MondoBD Atlas</w:t>
+            </w:r>
+          </w:p>
+          <w:p>
+            <w:pPr>
+              <w:pStyle w:val="Paragraphedeliste"/>
+              <w:numPr>
+                <w:ilvl w:val="0"/>
+                <w:numId w:val="4"/>
+              </w:numPr>
+              <w:spacing w:after="0"/>
+              <w:rPr>
+                <w:lang w:val="fr-FR" w:eastAsia="en-US"/>
+              </w:rPr>
+            </w:pPr>
+            <w:r>
+              <w:rPr>
+                <w:lang w:val="fr-FR" w:eastAsia="en-US"/>
+              </w:rPr>
+              <w:t>Scrape les 2500 données</w:t>
             </w:r>
           </w:p>
         </w:tc>
@@ -2408,7 +2746,7 @@
           <w:lang w:val="fr-FR"/>
         </w:rPr>
       </w:pPr>
-      <w:bookmarkStart w:id="2" w:name="_Toc211110069"/>
+      <w:bookmarkStart w:id="2" w:name="_Toc211160461"/>
       <w:r>
         <w:rPr>
           <w:lang w:val="fr-FR"/>
@@ -2445,7 +2783,7 @@
           <w:lang w:val="fr-FR"/>
         </w:rPr>
       </w:pPr>
-      <w:bookmarkStart w:id="3" w:name="_Toc211110070"/>
+      <w:bookmarkStart w:id="3" w:name="_Toc211160462"/>
       <w:r>
         <w:rPr>
           <w:lang w:val="fr-FR"/>
@@ -2483,7 +2821,7 @@
           <w:lang w:val="fr-FR"/>
         </w:rPr>
       </w:pPr>
-      <w:bookmarkStart w:id="4" w:name="_Toc211110071"/>
+      <w:bookmarkStart w:id="4" w:name="_Toc211160463"/>
       <w:r>
         <w:rPr>
           <w:lang w:val="fr-FR"/>
@@ -2702,7 +3040,7 @@
           <w:lang w:val="fr-FR"/>
         </w:rPr>
       </w:pPr>
-      <w:bookmarkStart w:id="5" w:name="_Toc211110072"/>
+      <w:bookmarkStart w:id="5" w:name="_Toc211160464"/>
       <w:r>
         <w:rPr>
           <w:lang w:val="fr-FR"/>
@@ -2724,7 +3062,7 @@
           <w:lang w:val="fr-FR"/>
         </w:rPr>
       </w:pPr>
-      <w:bookmarkStart w:id="6" w:name="_Toc211110073"/>
+      <w:bookmarkStart w:id="6" w:name="_Toc211160465"/>
       <w:r>
         <w:rPr>
           <w:lang w:val="fr-FR"/>
@@ -2747,7 +3085,7 @@
           <w:lang w:val="fr-FR"/>
         </w:rPr>
       </w:pPr>
-      <w:bookmarkStart w:id="7" w:name="_Toc211110074"/>
+      <w:bookmarkStart w:id="7" w:name="_Toc211160466"/>
       <w:r>
         <w:rPr>
           <w:lang w:val="fr-FR"/>
@@ -2817,7 +3155,7 @@
           <w:lang w:val="fr-FR"/>
         </w:rPr>
       </w:pPr>
-      <w:bookmarkStart w:id="8" w:name="_Toc211110075"/>
+      <w:bookmarkStart w:id="8" w:name="_Toc211160467"/>
       <w:r>
         <w:rPr>
           <w:lang w:val="fr-FR"/>
@@ -2847,12 +3185,12 @@
           <w:lang w:val="fr-FR" w:eastAsia="en-US"/>
         </w:rPr>
       </w:pPr>
-      <w:bookmarkStart w:id="9" w:name="_Toc211110076"/>
+      <w:bookmarkStart w:id="9" w:name="_Toc211160468"/>
       <w:r>
         <w:rPr>
           <w:lang w:val="fr-FR" w:eastAsia="en-US"/>
         </w:rPr>
-        <w:t>Scrappy</w:t>
+        <w:t>Scrapy</w:t>
       </w:r>
       <w:bookmarkEnd w:id="9"/>
       <w:r>
@@ -2868,6 +3206,100 @@
           <w:lang w:val="fr-FR" w:eastAsia="en-US"/>
         </w:rPr>
       </w:pPr>
+      <w:r>
+        <w:rPr>
+          <w:lang w:val="fr-FR" w:eastAsia="en-US"/>
+        </w:rPr>
+        <w:t xml:space="preserve">Scrapy a quand même été facile à utiliser, surtout parce qu’il y a beaucoup de documentation. Il y a quand même eu quelques défis, au début nous avions choisi le site Best Buy, mais Best Buy bloque ce genre d’outil, donc j’ai essayé de contourner les protections avec Playwright, mais même après plus d’une heure, je n’étais pas en mesure de ramasser aucune donnée (à cause des protections et du fait que les informations sont chargées avec du JavaScript et non du HTML). J’ai donc décidé de changer de site, pour en utiliser un moins protégé et qui utilisait moins de JS. Je suis tombé sur le site Books to Scrape, et j’ai décidé de l’utiliser. Avec ce site fait pour le </w:t>
+      </w:r>
+      <w:r>
+        <w:rPr>
+          <w:i/>
+          <w:iCs/>
+          <w:lang w:val="fr-FR" w:eastAsia="en-US"/>
+        </w:rPr>
+        <w:t>scrapping</w:t>
+      </w:r>
+      <w:r>
+        <w:rPr>
+          <w:lang w:val="fr-FR" w:eastAsia="en-US"/>
+        </w:rPr>
+        <w:t xml:space="preserve">, c’était vraiment plus facile d’explorer Scrapy et d’apprendre à l’utiliser. </w:t>
+      </w:r>
+      <w:r>
+        <w:rPr>
+          <w:lang w:val="fr-FR" w:eastAsia="en-US"/>
+        </w:rPr>
+        <w:t xml:space="preserve">Ensuite, même si je donnais l’URL du site en français, les données recueillies étaient en anglais, mais Scrapy </w:t>
+      </w:r>
+      <w:r>
+        <w:rPr>
+          <w:lang w:val="fr-FR" w:eastAsia="en-US"/>
+        </w:rPr>
+        <w:t>permet</w:t>
+      </w:r>
+      <w:r>
+        <w:rPr>
+          <w:lang w:val="fr-FR" w:eastAsia="en-US"/>
+        </w:rPr>
+        <w:t xml:space="preserve"> d’utiliser la traduction Google, donc j’ai adapté mon </w:t>
+      </w:r>
+      <w:r>
+        <w:rPr>
+          <w:i/>
+          <w:iCs/>
+          <w:lang w:val="fr-FR" w:eastAsia="en-US"/>
+        </w:rPr>
+        <w:t>s</w:t>
+      </w:r>
+      <w:r>
+        <w:rPr>
+          <w:i/>
+          <w:iCs/>
+          <w:lang w:val="fr-FR" w:eastAsia="en-US"/>
+        </w:rPr>
+        <w:t>pider</w:t>
+      </w:r>
+      <w:r>
+        <w:rPr>
+          <w:lang w:val="fr-FR" w:eastAsia="en-US"/>
+        </w:rPr>
+        <w:t xml:space="preserve"> et après quelques essaie</w:t>
+      </w:r>
+      <w:r>
+        <w:rPr>
+          <w:lang w:val="fr-FR" w:eastAsia="en-US"/>
+        </w:rPr>
+        <w:t>s</w:t>
+      </w:r>
+      <w:r>
+        <w:rPr>
+          <w:lang w:val="fr-FR" w:eastAsia="en-US"/>
+        </w:rPr>
+        <w:t xml:space="preserve">, les données étaient en français. </w:t>
+      </w:r>
+      <w:r>
+        <w:rPr>
+          <w:lang w:val="fr-FR" w:eastAsia="en-US"/>
+        </w:rPr>
+        <w:t>Donc pour le projet, j’ai eux quelques problèmes, mais avec un site plus accessible, Scrapy est facile à utiliser et beaucoup de choses sont possibles avec l’outil.</w:t>
+      </w:r>
+    </w:p>
+    <w:p>
+      <w:pPr>
+        <w:pStyle w:val="Titre2"/>
+        <w:rPr>
+          <w:lang w:val="fr-FR" w:eastAsia="en-US"/>
+        </w:rPr>
+      </w:pPr>
+      <w:bookmarkStart w:id="10" w:name="_Toc211160469"/>
+      <w:r>
+        <w:rPr>
+          <w:lang w:val="fr-FR" w:eastAsia="en-US"/>
+        </w:rPr>
+        <w:t>MongoDB Atlas</w:t>
+      </w:r>
+      <w:bookmarkEnd w:id="10"/>
     </w:p>
     <w:p>
       <w:pPr>
@@ -2890,7 +3322,7 @@
           <w:lang w:val="fr-FR"/>
         </w:rPr>
       </w:pPr>
-      <w:bookmarkStart w:id="10" w:name="_Toc211110077"/>
+      <w:bookmarkStart w:id="11" w:name="_Toc211160470"/>
       <w:r>
         <w:rPr>
           <w:lang w:val="fr-FR"/>
@@ -2898,7 +3330,7 @@
         <w:lastRenderedPageBreak/>
         <w:t>Tableau indiquant la contribution de chaque coéquipier</w:t>
       </w:r>
-      <w:bookmarkEnd w:id="10"/>
+      <w:bookmarkEnd w:id="11"/>
     </w:p>
     <w:p>
       <w:pPr>
@@ -3479,7 +3911,7 @@
           <w:lang w:val="fr-FR" w:eastAsia="en-US"/>
         </w:rPr>
       </w:pPr>
-      <w:bookmarkStart w:id="11" w:name="_Toc211110078"/>
+      <w:bookmarkStart w:id="12" w:name="_Toc211160471"/>
       <w:r>
         <w:rPr>
           <w:lang w:val="fr-FR" w:eastAsia="en-US"/>
@@ -3487,7 +3919,7 @@
         <w:lastRenderedPageBreak/>
         <w:t>Imprime écran</w:t>
       </w:r>
-      <w:bookmarkEnd w:id="11"/>
+      <w:bookmarkEnd w:id="12"/>
       <w:r>
         <w:rPr>
           <w:lang w:val="fr-FR" w:eastAsia="en-US"/>
@@ -3599,6 +4031,57 @@
     </w:p>
     <w:p>
       <w:pPr>
+        <w:keepNext/>
+      </w:pPr>
+      <w:r>
+        <w:lastRenderedPageBreak/>
+        <w:drawing>
+          <wp:inline distT="0" distB="0" distL="0" distR="0" wp14:anchorId="2C9ED2FB" wp14:editId="64595193">
+            <wp:extent cx="6116320" cy="1811020"/>
+            <wp:effectExtent l="0" t="0" r="0" b="0"/>
+            <wp:docPr id="316009195" name="Image 1" descr="Une image contenant texte, capture d’écran, Police&#10;&#10;Le contenu généré par l’IA peut être incorrect."/>
+            <wp:cNvGraphicFramePr>
+              <a:graphicFrameLocks xmlns:a="http://schemas.openxmlformats.org/drawingml/2006/main" noChangeAspect="1"/>
+            </wp:cNvGraphicFramePr>
+            <a:graphic xmlns:a="http://schemas.openxmlformats.org/drawingml/2006/main">
+              <a:graphicData uri="http://schemas.openxmlformats.org/drawingml/2006/picture">
+                <pic:pic xmlns:pic="http://schemas.openxmlformats.org/drawingml/2006/picture">
+                  <pic:nvPicPr>
+                    <pic:cNvPr id="316009195" name="Image 1" descr="Une image contenant texte, capture d’écran, Police&#10;&#10;Le contenu généré par l’IA peut être incorrect."/>
+                    <pic:cNvPicPr/>
+                  </pic:nvPicPr>
+                  <pic:blipFill>
+                    <a:blip r:embed="rId13"/>
+                    <a:stretch>
+                      <a:fillRect/>
+                    </a:stretch>
+                  </pic:blipFill>
+                  <pic:spPr>
+                    <a:xfrm>
+                      <a:off x="0" y="0"/>
+                      <a:ext cx="6116320" cy="1811020"/>
+                    </a:xfrm>
+                    <a:prstGeom prst="rect">
+                      <a:avLst/>
+                    </a:prstGeom>
+                  </pic:spPr>
+                </pic:pic>
+              </a:graphicData>
+            </a:graphic>
+          </wp:inline>
+        </w:drawing>
+      </w:r>
+    </w:p>
+    <w:p>
+      <w:pPr>
+        <w:pStyle w:val="Lgende"/>
+      </w:pPr>
+      <w:r>
+        <w:t>Imprime écran 2</w:t>
+      </w:r>
+    </w:p>
+    <w:p>
+      <w:pPr>
         <w:rPr>
           <w:lang w:val="fr-FR" w:eastAsia="en-US"/>
         </w:rPr>
@@ -3875,6 +4358,92 @@
     </w:lvl>
   </w:abstractNum>
   <w:abstractNum w:abstractNumId="3" w15:restartNumberingAfterBreak="0">
+    <w:nsid w:val="0A4E7FCC"/>
+    <w:multiLevelType w:val="hybridMultilevel"/>
+    <w:tmpl w:val="FDB6F64A"/>
+    <w:lvl w:ilvl="0" w:tplc="FFFFFFFF">
+      <w:start w:val="1"/>
+      <w:numFmt w:val="decimal"/>
+      <w:lvlText w:val="%1."/>
+      <w:lvlJc w:val="left"/>
+      <w:pPr>
+        <w:ind w:left="720" w:hanging="360"/>
+      </w:pPr>
+    </w:lvl>
+    <w:lvl w:ilvl="1" w:tplc="FFFFFFFF">
+      <w:start w:val="1"/>
+      <w:numFmt w:val="lowerLetter"/>
+      <w:lvlText w:val="%2."/>
+      <w:lvlJc w:val="left"/>
+      <w:pPr>
+        <w:ind w:left="1440" w:hanging="360"/>
+      </w:pPr>
+    </w:lvl>
+    <w:lvl w:ilvl="2" w:tplc="FFFFFFFF">
+      <w:start w:val="1"/>
+      <w:numFmt w:val="lowerRoman"/>
+      <w:lvlText w:val="%3."/>
+      <w:lvlJc w:val="right"/>
+      <w:pPr>
+        <w:ind w:left="2160" w:hanging="180"/>
+      </w:pPr>
+    </w:lvl>
+    <w:lvl w:ilvl="3" w:tplc="FFFFFFFF">
+      <w:start w:val="1"/>
+      <w:numFmt w:val="decimal"/>
+      <w:lvlText w:val="%4."/>
+      <w:lvlJc w:val="left"/>
+      <w:pPr>
+        <w:ind w:left="2880" w:hanging="360"/>
+      </w:pPr>
+    </w:lvl>
+    <w:lvl w:ilvl="4" w:tplc="FFFFFFFF">
+      <w:start w:val="1"/>
+      <w:numFmt w:val="lowerLetter"/>
+      <w:lvlText w:val="%5."/>
+      <w:lvlJc w:val="left"/>
+      <w:pPr>
+        <w:ind w:left="3600" w:hanging="360"/>
+      </w:pPr>
+    </w:lvl>
+    <w:lvl w:ilvl="5" w:tplc="FFFFFFFF">
+      <w:start w:val="1"/>
+      <w:numFmt w:val="lowerRoman"/>
+      <w:lvlText w:val="%6."/>
+      <w:lvlJc w:val="right"/>
+      <w:pPr>
+        <w:ind w:left="4320" w:hanging="180"/>
+      </w:pPr>
+    </w:lvl>
+    <w:lvl w:ilvl="6" w:tplc="FFFFFFFF">
+      <w:start w:val="1"/>
+      <w:numFmt w:val="decimal"/>
+      <w:lvlText w:val="%7."/>
+      <w:lvlJc w:val="left"/>
+      <w:pPr>
+        <w:ind w:left="5040" w:hanging="360"/>
+      </w:pPr>
+    </w:lvl>
+    <w:lvl w:ilvl="7" w:tplc="FFFFFFFF">
+      <w:start w:val="1"/>
+      <w:numFmt w:val="lowerLetter"/>
+      <w:lvlText w:val="%8."/>
+      <w:lvlJc w:val="left"/>
+      <w:pPr>
+        <w:ind w:left="5760" w:hanging="360"/>
+      </w:pPr>
+    </w:lvl>
+    <w:lvl w:ilvl="8" w:tplc="FFFFFFFF">
+      <w:start w:val="1"/>
+      <w:numFmt w:val="lowerRoman"/>
+      <w:lvlText w:val="%9."/>
+      <w:lvlJc w:val="right"/>
+      <w:pPr>
+        <w:ind w:left="6480" w:hanging="180"/>
+      </w:pPr>
+    </w:lvl>
+  </w:abstractNum>
+  <w:abstractNum w:abstractNumId="4" w15:restartNumberingAfterBreak="0">
     <w:nsid w:val="1B427C1D"/>
     <w:multiLevelType w:val="hybridMultilevel"/>
     <w:tmpl w:val="68A4DFA0"/>
@@ -3960,7 +4529,7 @@
       </w:pPr>
     </w:lvl>
   </w:abstractNum>
-  <w:abstractNum w:abstractNumId="4" w15:restartNumberingAfterBreak="0">
+  <w:abstractNum w:abstractNumId="5" w15:restartNumberingAfterBreak="0">
     <w:nsid w:val="1C075CE7"/>
     <w:multiLevelType w:val="hybridMultilevel"/>
     <w:tmpl w:val="9C307A64"/>
@@ -4046,11 +4615,11 @@
       </w:pPr>
     </w:lvl>
   </w:abstractNum>
-  <w:abstractNum w:abstractNumId="5" w15:restartNumberingAfterBreak="0">
-    <w:nsid w:val="295B3B22"/>
+  <w:abstractNum w:abstractNumId="6" w15:restartNumberingAfterBreak="0">
+    <w:nsid w:val="1DDD679B"/>
     <w:multiLevelType w:val="hybridMultilevel"/>
-    <w:tmpl w:val="75000FE6"/>
-    <w:lvl w:ilvl="0" w:tplc="0C0C000F">
+    <w:tmpl w:val="DDDAAA84"/>
+    <w:lvl w:ilvl="0" w:tplc="FFFFFFFF">
       <w:start w:val="1"/>
       <w:numFmt w:val="decimal"/>
       <w:lvlText w:val="%1."/>
@@ -4132,11 +4701,11 @@
       </w:pPr>
     </w:lvl>
   </w:abstractNum>
-  <w:abstractNum w:abstractNumId="6" w15:restartNumberingAfterBreak="0">
-    <w:nsid w:val="2E1803A9"/>
+  <w:abstractNum w:abstractNumId="7" w15:restartNumberingAfterBreak="0">
+    <w:nsid w:val="295B3B22"/>
     <w:multiLevelType w:val="hybridMultilevel"/>
-    <w:tmpl w:val="FDB6F64A"/>
-    <w:lvl w:ilvl="0" w:tplc="FFFFFFFF">
+    <w:tmpl w:val="987668F2"/>
+    <w:lvl w:ilvl="0" w:tplc="0C0C000F">
       <w:start w:val="1"/>
       <w:numFmt w:val="decimal"/>
       <w:lvlText w:val="%1."/>
@@ -4145,7 +4714,7 @@
         <w:ind w:left="720" w:hanging="360"/>
       </w:pPr>
     </w:lvl>
-    <w:lvl w:ilvl="1" w:tplc="FFFFFFFF">
+    <w:lvl w:ilvl="1" w:tplc="0C0C0019" w:tentative="1">
       <w:start w:val="1"/>
       <w:numFmt w:val="lowerLetter"/>
       <w:lvlText w:val="%2."/>
@@ -4154,7 +4723,7 @@
         <w:ind w:left="1440" w:hanging="360"/>
       </w:pPr>
     </w:lvl>
-    <w:lvl w:ilvl="2" w:tplc="FFFFFFFF">
+    <w:lvl w:ilvl="2" w:tplc="0C0C001B" w:tentative="1">
       <w:start w:val="1"/>
       <w:numFmt w:val="lowerRoman"/>
       <w:lvlText w:val="%3."/>
@@ -4163,7 +4732,7 @@
         <w:ind w:left="2160" w:hanging="180"/>
       </w:pPr>
     </w:lvl>
-    <w:lvl w:ilvl="3" w:tplc="FFFFFFFF">
+    <w:lvl w:ilvl="3" w:tplc="0C0C000F" w:tentative="1">
       <w:start w:val="1"/>
       <w:numFmt w:val="decimal"/>
       <w:lvlText w:val="%4."/>
@@ -4172,7 +4741,7 @@
         <w:ind w:left="2880" w:hanging="360"/>
       </w:pPr>
     </w:lvl>
-    <w:lvl w:ilvl="4" w:tplc="FFFFFFFF">
+    <w:lvl w:ilvl="4" w:tplc="0C0C0019" w:tentative="1">
       <w:start w:val="1"/>
       <w:numFmt w:val="lowerLetter"/>
       <w:lvlText w:val="%5."/>
@@ -4181,7 +4750,7 @@
         <w:ind w:left="3600" w:hanging="360"/>
       </w:pPr>
     </w:lvl>
-    <w:lvl w:ilvl="5" w:tplc="FFFFFFFF">
+    <w:lvl w:ilvl="5" w:tplc="0C0C001B" w:tentative="1">
       <w:start w:val="1"/>
       <w:numFmt w:val="lowerRoman"/>
       <w:lvlText w:val="%6."/>
@@ -4190,7 +4759,7 @@
         <w:ind w:left="4320" w:hanging="180"/>
       </w:pPr>
     </w:lvl>
-    <w:lvl w:ilvl="6" w:tplc="FFFFFFFF">
+    <w:lvl w:ilvl="6" w:tplc="0C0C000F" w:tentative="1">
       <w:start w:val="1"/>
       <w:numFmt w:val="decimal"/>
       <w:lvlText w:val="%7."/>
@@ -4199,7 +4768,7 @@
         <w:ind w:left="5040" w:hanging="360"/>
       </w:pPr>
     </w:lvl>
-    <w:lvl w:ilvl="7" w:tplc="FFFFFFFF">
+    <w:lvl w:ilvl="7" w:tplc="0C0C0019" w:tentative="1">
       <w:start w:val="1"/>
       <w:numFmt w:val="lowerLetter"/>
       <w:lvlText w:val="%8."/>
@@ -4208,7 +4777,7 @@
         <w:ind w:left="5760" w:hanging="360"/>
       </w:pPr>
     </w:lvl>
-    <w:lvl w:ilvl="8" w:tplc="FFFFFFFF">
+    <w:lvl w:ilvl="8" w:tplc="0C0C001B" w:tentative="1">
       <w:start w:val="1"/>
       <w:numFmt w:val="lowerRoman"/>
       <w:lvlText w:val="%9."/>
@@ -4218,7 +4787,179 @@
       </w:pPr>
     </w:lvl>
   </w:abstractNum>
-  <w:abstractNum w:abstractNumId="7" w15:restartNumberingAfterBreak="0">
+  <w:abstractNum w:abstractNumId="8" w15:restartNumberingAfterBreak="0">
+    <w:nsid w:val="2DD33749"/>
+    <w:multiLevelType w:val="hybridMultilevel"/>
+    <w:tmpl w:val="43F0CBF0"/>
+    <w:lvl w:ilvl="0" w:tplc="0C0C000F">
+      <w:start w:val="1"/>
+      <w:numFmt w:val="decimal"/>
+      <w:lvlText w:val="%1."/>
+      <w:lvlJc w:val="left"/>
+      <w:pPr>
+        <w:ind w:left="720" w:hanging="360"/>
+      </w:pPr>
+    </w:lvl>
+    <w:lvl w:ilvl="1" w:tplc="0C0C0019" w:tentative="1">
+      <w:start w:val="1"/>
+      <w:numFmt w:val="lowerLetter"/>
+      <w:lvlText w:val="%2."/>
+      <w:lvlJc w:val="left"/>
+      <w:pPr>
+        <w:ind w:left="1440" w:hanging="360"/>
+      </w:pPr>
+    </w:lvl>
+    <w:lvl w:ilvl="2" w:tplc="0C0C001B" w:tentative="1">
+      <w:start w:val="1"/>
+      <w:numFmt w:val="lowerRoman"/>
+      <w:lvlText w:val="%3."/>
+      <w:lvlJc w:val="right"/>
+      <w:pPr>
+        <w:ind w:left="2160" w:hanging="180"/>
+      </w:pPr>
+    </w:lvl>
+    <w:lvl w:ilvl="3" w:tplc="0C0C000F" w:tentative="1">
+      <w:start w:val="1"/>
+      <w:numFmt w:val="decimal"/>
+      <w:lvlText w:val="%4."/>
+      <w:lvlJc w:val="left"/>
+      <w:pPr>
+        <w:ind w:left="2880" w:hanging="360"/>
+      </w:pPr>
+    </w:lvl>
+    <w:lvl w:ilvl="4" w:tplc="0C0C0019" w:tentative="1">
+      <w:start w:val="1"/>
+      <w:numFmt w:val="lowerLetter"/>
+      <w:lvlText w:val="%5."/>
+      <w:lvlJc w:val="left"/>
+      <w:pPr>
+        <w:ind w:left="3600" w:hanging="360"/>
+      </w:pPr>
+    </w:lvl>
+    <w:lvl w:ilvl="5" w:tplc="0C0C001B" w:tentative="1">
+      <w:start w:val="1"/>
+      <w:numFmt w:val="lowerRoman"/>
+      <w:lvlText w:val="%6."/>
+      <w:lvlJc w:val="right"/>
+      <w:pPr>
+        <w:ind w:left="4320" w:hanging="180"/>
+      </w:pPr>
+    </w:lvl>
+    <w:lvl w:ilvl="6" w:tplc="0C0C000F" w:tentative="1">
+      <w:start w:val="1"/>
+      <w:numFmt w:val="decimal"/>
+      <w:lvlText w:val="%7."/>
+      <w:lvlJc w:val="left"/>
+      <w:pPr>
+        <w:ind w:left="5040" w:hanging="360"/>
+      </w:pPr>
+    </w:lvl>
+    <w:lvl w:ilvl="7" w:tplc="0C0C0019" w:tentative="1">
+      <w:start w:val="1"/>
+      <w:numFmt w:val="lowerLetter"/>
+      <w:lvlText w:val="%8."/>
+      <w:lvlJc w:val="left"/>
+      <w:pPr>
+        <w:ind w:left="5760" w:hanging="360"/>
+      </w:pPr>
+    </w:lvl>
+    <w:lvl w:ilvl="8" w:tplc="0C0C001B" w:tentative="1">
+      <w:start w:val="1"/>
+      <w:numFmt w:val="lowerRoman"/>
+      <w:lvlText w:val="%9."/>
+      <w:lvlJc w:val="right"/>
+      <w:pPr>
+        <w:ind w:left="6480" w:hanging="180"/>
+      </w:pPr>
+    </w:lvl>
+  </w:abstractNum>
+  <w:abstractNum w:abstractNumId="9" w15:restartNumberingAfterBreak="0">
+    <w:nsid w:val="2E1803A9"/>
+    <w:multiLevelType w:val="hybridMultilevel"/>
+    <w:tmpl w:val="4DF081DA"/>
+    <w:lvl w:ilvl="0" w:tplc="FFFFFFFF">
+      <w:start w:val="1"/>
+      <w:numFmt w:val="decimal"/>
+      <w:lvlText w:val="%1."/>
+      <w:lvlJc w:val="left"/>
+      <w:pPr>
+        <w:ind w:left="720" w:hanging="360"/>
+      </w:pPr>
+    </w:lvl>
+    <w:lvl w:ilvl="1" w:tplc="FFFFFFFF">
+      <w:start w:val="1"/>
+      <w:numFmt w:val="lowerLetter"/>
+      <w:lvlText w:val="%2."/>
+      <w:lvlJc w:val="left"/>
+      <w:pPr>
+        <w:ind w:left="1440" w:hanging="360"/>
+      </w:pPr>
+    </w:lvl>
+    <w:lvl w:ilvl="2" w:tplc="FFFFFFFF">
+      <w:start w:val="1"/>
+      <w:numFmt w:val="lowerRoman"/>
+      <w:lvlText w:val="%3."/>
+      <w:lvlJc w:val="right"/>
+      <w:pPr>
+        <w:ind w:left="2160" w:hanging="180"/>
+      </w:pPr>
+    </w:lvl>
+    <w:lvl w:ilvl="3" w:tplc="FFFFFFFF">
+      <w:start w:val="1"/>
+      <w:numFmt w:val="decimal"/>
+      <w:lvlText w:val="%4."/>
+      <w:lvlJc w:val="left"/>
+      <w:pPr>
+        <w:ind w:left="2880" w:hanging="360"/>
+      </w:pPr>
+    </w:lvl>
+    <w:lvl w:ilvl="4" w:tplc="FFFFFFFF">
+      <w:start w:val="1"/>
+      <w:numFmt w:val="lowerLetter"/>
+      <w:lvlText w:val="%5."/>
+      <w:lvlJc w:val="left"/>
+      <w:pPr>
+        <w:ind w:left="3600" w:hanging="360"/>
+      </w:pPr>
+    </w:lvl>
+    <w:lvl w:ilvl="5" w:tplc="FFFFFFFF">
+      <w:start w:val="1"/>
+      <w:numFmt w:val="lowerRoman"/>
+      <w:lvlText w:val="%6."/>
+      <w:lvlJc w:val="right"/>
+      <w:pPr>
+        <w:ind w:left="4320" w:hanging="180"/>
+      </w:pPr>
+    </w:lvl>
+    <w:lvl w:ilvl="6" w:tplc="FFFFFFFF">
+      <w:start w:val="1"/>
+      <w:numFmt w:val="decimal"/>
+      <w:lvlText w:val="%7."/>
+      <w:lvlJc w:val="left"/>
+      <w:pPr>
+        <w:ind w:left="5040" w:hanging="360"/>
+      </w:pPr>
+    </w:lvl>
+    <w:lvl w:ilvl="7" w:tplc="FFFFFFFF">
+      <w:start w:val="1"/>
+      <w:numFmt w:val="lowerLetter"/>
+      <w:lvlText w:val="%8."/>
+      <w:lvlJc w:val="left"/>
+      <w:pPr>
+        <w:ind w:left="5760" w:hanging="360"/>
+      </w:pPr>
+    </w:lvl>
+    <w:lvl w:ilvl="8" w:tplc="FFFFFFFF">
+      <w:start w:val="1"/>
+      <w:numFmt w:val="lowerRoman"/>
+      <w:lvlText w:val="%9."/>
+      <w:lvlJc w:val="right"/>
+      <w:pPr>
+        <w:ind w:left="6480" w:hanging="180"/>
+      </w:pPr>
+    </w:lvl>
+  </w:abstractNum>
+  <w:abstractNum w:abstractNumId="10" w15:restartNumberingAfterBreak="0">
     <w:nsid w:val="49783DDA"/>
     <w:multiLevelType w:val="hybridMultilevel"/>
     <w:tmpl w:val="06F07C78"/>
@@ -4304,7 +5045,7 @@
       </w:pPr>
     </w:lvl>
   </w:abstractNum>
-  <w:abstractNum w:abstractNumId="8" w15:restartNumberingAfterBreak="0">
+  <w:abstractNum w:abstractNumId="11" w15:restartNumberingAfterBreak="0">
     <w:nsid w:val="531462F1"/>
     <w:multiLevelType w:val="hybridMultilevel"/>
     <w:tmpl w:val="EFF8B4B4"/>
@@ -4390,7 +5131,7 @@
       </w:pPr>
     </w:lvl>
   </w:abstractNum>
-  <w:abstractNum w:abstractNumId="9" w15:restartNumberingAfterBreak="0">
+  <w:abstractNum w:abstractNumId="12" w15:restartNumberingAfterBreak="0">
     <w:nsid w:val="6CB1136A"/>
     <w:multiLevelType w:val="hybridMultilevel"/>
     <w:tmpl w:val="1F9854D4"/>
@@ -4476,8 +5217,94 @@
       </w:pPr>
     </w:lvl>
   </w:abstractNum>
+  <w:abstractNum w:abstractNumId="13" w15:restartNumberingAfterBreak="0">
+    <w:nsid w:val="767B1777"/>
+    <w:multiLevelType w:val="hybridMultilevel"/>
+    <w:tmpl w:val="48707D7A"/>
+    <w:lvl w:ilvl="0" w:tplc="FFFFFFFF">
+      <w:start w:val="1"/>
+      <w:numFmt w:val="decimal"/>
+      <w:lvlText w:val="%1."/>
+      <w:lvlJc w:val="left"/>
+      <w:pPr>
+        <w:ind w:left="720" w:hanging="360"/>
+      </w:pPr>
+    </w:lvl>
+    <w:lvl w:ilvl="1" w:tplc="FFFFFFFF">
+      <w:start w:val="1"/>
+      <w:numFmt w:val="lowerLetter"/>
+      <w:lvlText w:val="%2."/>
+      <w:lvlJc w:val="left"/>
+      <w:pPr>
+        <w:ind w:left="1440" w:hanging="360"/>
+      </w:pPr>
+    </w:lvl>
+    <w:lvl w:ilvl="2" w:tplc="FFFFFFFF">
+      <w:start w:val="1"/>
+      <w:numFmt w:val="lowerRoman"/>
+      <w:lvlText w:val="%3."/>
+      <w:lvlJc w:val="right"/>
+      <w:pPr>
+        <w:ind w:left="2160" w:hanging="180"/>
+      </w:pPr>
+    </w:lvl>
+    <w:lvl w:ilvl="3" w:tplc="FFFFFFFF">
+      <w:start w:val="1"/>
+      <w:numFmt w:val="decimal"/>
+      <w:lvlText w:val="%4."/>
+      <w:lvlJc w:val="left"/>
+      <w:pPr>
+        <w:ind w:left="2880" w:hanging="360"/>
+      </w:pPr>
+    </w:lvl>
+    <w:lvl w:ilvl="4" w:tplc="FFFFFFFF">
+      <w:start w:val="1"/>
+      <w:numFmt w:val="lowerLetter"/>
+      <w:lvlText w:val="%5."/>
+      <w:lvlJc w:val="left"/>
+      <w:pPr>
+        <w:ind w:left="3600" w:hanging="360"/>
+      </w:pPr>
+    </w:lvl>
+    <w:lvl w:ilvl="5" w:tplc="FFFFFFFF">
+      <w:start w:val="1"/>
+      <w:numFmt w:val="lowerRoman"/>
+      <w:lvlText w:val="%6."/>
+      <w:lvlJc w:val="right"/>
+      <w:pPr>
+        <w:ind w:left="4320" w:hanging="180"/>
+      </w:pPr>
+    </w:lvl>
+    <w:lvl w:ilvl="6" w:tplc="FFFFFFFF">
+      <w:start w:val="1"/>
+      <w:numFmt w:val="decimal"/>
+      <w:lvlText w:val="%7."/>
+      <w:lvlJc w:val="left"/>
+      <w:pPr>
+        <w:ind w:left="5040" w:hanging="360"/>
+      </w:pPr>
+    </w:lvl>
+    <w:lvl w:ilvl="7" w:tplc="FFFFFFFF">
+      <w:start w:val="1"/>
+      <w:numFmt w:val="lowerLetter"/>
+      <w:lvlText w:val="%8."/>
+      <w:lvlJc w:val="left"/>
+      <w:pPr>
+        <w:ind w:left="5760" w:hanging="360"/>
+      </w:pPr>
+    </w:lvl>
+    <w:lvl w:ilvl="8" w:tplc="FFFFFFFF">
+      <w:start w:val="1"/>
+      <w:numFmt w:val="lowerRoman"/>
+      <w:lvlText w:val="%9."/>
+      <w:lvlJc w:val="right"/>
+      <w:pPr>
+        <w:ind w:left="6480" w:hanging="180"/>
+      </w:pPr>
+    </w:lvl>
+  </w:abstractNum>
   <w:num w:numId="1" w16cid:durableId="1617059456">
-    <w:abstractNumId w:val="5"/>
+    <w:abstractNumId w:val="7"/>
   </w:num>
   <w:num w:numId="2" w16cid:durableId="1588881246">
     <w:abstractNumId w:val="0"/>
@@ -4513,19 +5340,19 @@
     <w:abstractNumId w:val="0"/>
   </w:num>
   <w:num w:numId="4" w16cid:durableId="552423818">
-    <w:abstractNumId w:val="6"/>
+    <w:abstractNumId w:val="9"/>
   </w:num>
   <w:num w:numId="5" w16cid:durableId="924846493">
-    <w:abstractNumId w:val="9"/>
+    <w:abstractNumId w:val="12"/>
   </w:num>
   <w:num w:numId="6" w16cid:durableId="621501009">
-    <w:abstractNumId w:val="4"/>
+    <w:abstractNumId w:val="5"/>
   </w:num>
   <w:num w:numId="7" w16cid:durableId="970987322">
-    <w:abstractNumId w:val="8"/>
+    <w:abstractNumId w:val="11"/>
   </w:num>
   <w:num w:numId="8" w16cid:durableId="1213274178">
-    <w:abstractNumId w:val="3"/>
+    <w:abstractNumId w:val="4"/>
   </w:num>
   <w:num w:numId="9" w16cid:durableId="121770381">
     <w:abstractNumId w:val="1"/>
@@ -4534,7 +5361,19 @@
     <w:abstractNumId w:val="2"/>
   </w:num>
   <w:num w:numId="11" w16cid:durableId="305206479">
-    <w:abstractNumId w:val="7"/>
+    <w:abstractNumId w:val="10"/>
+  </w:num>
+  <w:num w:numId="12" w16cid:durableId="594486131">
+    <w:abstractNumId w:val="8"/>
+  </w:num>
+  <w:num w:numId="13" w16cid:durableId="2011904963">
+    <w:abstractNumId w:val="3"/>
+  </w:num>
+  <w:num w:numId="14" w16cid:durableId="1429083337">
+    <w:abstractNumId w:val="13"/>
+  </w:num>
+  <w:num w:numId="15" w16cid:durableId="1349601748">
+    <w:abstractNumId w:val="6"/>
   </w:num>
 </w:numbering>
 </file>
@@ -4939,7 +5778,7 @@
   <w:style w:type="paragraph" w:default="1" w:styleId="Normal">
     <w:name w:val="Normal"/>
     <w:qFormat/>
-    <w:rsid w:val="007C6C05"/>
+    <w:rsid w:val="009D7246"/>
     <w:pPr>
       <w:spacing w:after="200" w:line="276" w:lineRule="auto"/>
     </w:pPr>
@@ -5153,7 +5992,6 @@
   <w:style w:type="character" w:default="1" w:styleId="Policepardfaut">
     <w:name w:val="Default Paragraph Font"/>
     <w:uiPriority w:val="1"/>
-    <w:semiHidden/>
     <w:unhideWhenUsed/>
   </w:style>
   <w:style w:type="table" w:default="1" w:styleId="TableauNormal">

</xml_diff>

<commit_message>
Changer de site pour avoir le 2500 items
Quelques modifications, surtout pour le montage du fichier json

--

Création du fichier prête !
</commit_message>
<xml_diff>
--- a/remise2.docx
+++ b/remise2.docx
@@ -1668,14 +1668,14 @@
         <w:rPr>
           <w:lang w:val="fr-FR" w:eastAsia="en-US"/>
         </w:rPr>
-        <w:t xml:space="preserve">Books to </w:t>
+        <w:t xml:space="preserve">Open </w:t>
       </w:r>
       <w:proofErr w:type="spellStart"/>
       <w:r>
         <w:rPr>
           <w:lang w:val="fr-FR" w:eastAsia="en-US"/>
         </w:rPr>
-        <w:t>Scrape</w:t>
+        <w:t>library</w:t>
       </w:r>
       <w:proofErr w:type="spellEnd"/>
       <w:r>
@@ -1688,23 +1688,7 @@
         <w:rPr>
           <w:lang w:val="fr-FR" w:eastAsia="en-US"/>
         </w:rPr>
-        <w:t xml:space="preserve">site qui est fait pour que les gens puissent se pratiquer à faire du </w:t>
-      </w:r>
-      <w:proofErr w:type="spellStart"/>
-      <w:r>
-        <w:rPr>
-          <w:i/>
-          <w:iCs/>
-          <w:lang w:val="fr-FR" w:eastAsia="en-US"/>
-        </w:rPr>
-        <w:t>Scrapping</w:t>
-      </w:r>
-      <w:proofErr w:type="spellEnd"/>
-      <w:r>
-        <w:rPr>
-          <w:lang w:val="fr-FR" w:eastAsia="en-US"/>
-        </w:rPr>
-        <w:t>. Celui-ci propose une liste de livre</w:t>
+        <w:t>catalogue en ligne de livres disponible à lire.</w:t>
       </w:r>
     </w:p>
     <w:p>
@@ -1725,13 +1709,13 @@
         <w:rPr>
           <w:lang w:val="fr-FR" w:eastAsia="en-US"/>
         </w:rPr>
-        <w:t xml:space="preserve"> Les données choisies sont la liste des </w:t>
-      </w:r>
-      <w:r>
-        <w:rPr>
-          <w:lang w:val="fr-FR" w:eastAsia="en-US"/>
-        </w:rPr>
-        <w:t>tous les livres du site</w:t>
+        <w:t xml:space="preserve"> Les données choisies sont </w:t>
+      </w:r>
+      <w:r>
+        <w:rPr>
+          <w:lang w:val="fr-FR" w:eastAsia="en-US"/>
+        </w:rPr>
+        <w:t>des livres de plusieurs catégorie</w:t>
       </w:r>
       <w:r>
         <w:rPr>
@@ -1760,7 +1744,7 @@
           <w:rPr>
             <w:rStyle w:val="Lienhypertexte"/>
           </w:rPr>
-          <w:t>https://books.toscrape.com/</w:t>
+          <w:t>https://openlibrary.org/</w:t>
         </w:r>
       </w:hyperlink>
     </w:p>
@@ -2712,7 +2696,6 @@
                 <w:bCs/>
                 <w:lang w:val="fr-FR" w:eastAsia="en-US"/>
               </w:rPr>
-              <w:lastRenderedPageBreak/>
               <w:t>Modifier le fichier hl_projet2.py</w:t>
             </w:r>
             <w:r>
@@ -2740,13 +2723,8 @@
               <w:rPr>
                 <w:lang w:val="fr-FR" w:eastAsia="en-US"/>
               </w:rPr>
+              <w:lastRenderedPageBreak/>
               <w:t xml:space="preserve">Plusieurs modifications à faire, beaucoup de recherche </w:t>
-            </w:r>
-            <w:r>
-              <w:rPr>
-                <w:lang w:val="fr-FR" w:eastAsia="en-US"/>
-              </w:rPr>
-              <w:t>(imprime écran 1)</w:t>
             </w:r>
           </w:p>
           <w:p>
@@ -2936,7 +2914,7 @@
               <w:rPr>
                 <w:lang w:val="fr-FR" w:eastAsia="en-US"/>
               </w:rPr>
-              <w:t>2</w:t>
+              <w:t>1</w:t>
             </w:r>
             <w:r>
               <w:rPr>
@@ -3834,46 +3812,60 @@
         <w:rPr>
           <w:lang w:val="fr-FR" w:eastAsia="en-US"/>
         </w:rPr>
-        <w:t xml:space="preserve">, mais même après plus d’une heure, je n’étais pas en mesure de ramasser aucune donnée (à cause des protections et du fait que les informations sont chargées avec du JavaScript et non du HTML). J’ai donc décidé de changer de site, pour en utiliser un moins protégé et qui utilisait moins de JS. Je suis tombé sur le site Books to </w:t>
+        <w:t xml:space="preserve">, mais même après plus d’une heure, je n’étais pas en mesure de ramasser aucune donnée (à cause des protections et du fait que les informations sont chargées avec du JavaScript et non du HTML). J’ai donc décidé de changer de site, pour en utiliser un moins protégé et qui utilisait moins de JS. Je suis tombé sur le site </w:t>
+      </w:r>
+      <w:r>
+        <w:rPr>
+          <w:lang w:val="fr-FR" w:eastAsia="en-US"/>
+        </w:rPr>
+        <w:t xml:space="preserve">Open </w:t>
       </w:r>
       <w:proofErr w:type="spellStart"/>
       <w:r>
         <w:rPr>
           <w:lang w:val="fr-FR" w:eastAsia="en-US"/>
         </w:rPr>
-        <w:t>Scrape</w:t>
+        <w:t>library</w:t>
       </w:r>
       <w:proofErr w:type="spellEnd"/>
       <w:r>
         <w:rPr>
           <w:lang w:val="fr-FR" w:eastAsia="en-US"/>
         </w:rPr>
-        <w:t xml:space="preserve">, et j’ai décidé de l’utiliser. Avec ce site fait pour le </w:t>
+        <w:t xml:space="preserve">, et j’ai décidé de l’utiliser. Avec ce site </w:t>
+      </w:r>
+      <w:r>
+        <w:rPr>
+          <w:lang w:val="fr-FR" w:eastAsia="en-US"/>
+        </w:rPr>
+        <w:t xml:space="preserve">qui ne bloque pas les outils comme </w:t>
       </w:r>
       <w:proofErr w:type="spellStart"/>
       <w:r>
         <w:rPr>
-          <w:i/>
-          <w:iCs/>
-          <w:lang w:val="fr-FR" w:eastAsia="en-US"/>
-        </w:rPr>
-        <w:t>scrapping</w:t>
+          <w:lang w:val="fr-FR" w:eastAsia="en-US"/>
+        </w:rPr>
+        <w:t>Scrapy</w:t>
       </w:r>
       <w:proofErr w:type="spellEnd"/>
       <w:r>
         <w:rPr>
           <w:lang w:val="fr-FR" w:eastAsia="en-US"/>
         </w:rPr>
-        <w:t xml:space="preserve">, c’était vraiment plus facile d’explorer </w:t>
-      </w:r>
-      <w:proofErr w:type="spellStart"/>
-      <w:r>
-        <w:rPr>
-          <w:lang w:val="fr-FR" w:eastAsia="en-US"/>
-        </w:rPr>
-        <w:t>Scrapy</w:t>
-      </w:r>
-      <w:proofErr w:type="spellEnd"/>
+        <w:t xml:space="preserve"> et qui utilise peu de JavaScript</w:t>
+      </w:r>
+      <w:r>
+        <w:rPr>
+          <w:lang w:val="fr-FR" w:eastAsia="en-US"/>
+        </w:rPr>
+        <w:t>, c’était vraiment plus facile d’explorer</w:t>
+      </w:r>
+      <w:r>
+        <w:rPr>
+          <w:lang w:val="fr-FR" w:eastAsia="en-US"/>
+        </w:rPr>
+        <w:t xml:space="preserve"> l’outil</w:t>
+      </w:r>
       <w:r>
         <w:rPr>
           <w:lang w:val="fr-FR" w:eastAsia="en-US"/>
@@ -4579,15 +4571,11 @@
         <w:spacing w:after="0"/>
       </w:pPr>
       <w:r>
-        <w:rPr>
-          <w:noProof/>
-          <w14:ligatures w14:val="standardContextual"/>
-        </w:rPr>
         <w:drawing>
-          <wp:inline distT="0" distB="0" distL="0" distR="0" wp14:anchorId="7D004BE4" wp14:editId="42FBC3A0">
-            <wp:extent cx="4096385" cy="5092838"/>
+          <wp:inline distT="0" distB="0" distL="0" distR="0" wp14:anchorId="7B4BFB08" wp14:editId="2CEA5599">
+            <wp:extent cx="5696745" cy="2781688"/>
             <wp:effectExtent l="0" t="0" r="0" b="0"/>
-            <wp:docPr id="1687113977" name="Image 1" descr="Une image contenant texte, capture d’écran, logiciel&#10;&#10;Le contenu généré par l’IA peut être incorrect."/>
+            <wp:docPr id="2058883719" name="Image 1"/>
             <wp:cNvGraphicFramePr>
               <a:graphicFrameLocks xmlns:a="http://schemas.openxmlformats.org/drawingml/2006/main" noChangeAspect="1"/>
             </wp:cNvGraphicFramePr>
@@ -4595,7 +4583,7 @@
               <a:graphicData uri="http://schemas.openxmlformats.org/drawingml/2006/picture">
                 <pic:pic xmlns:pic="http://schemas.openxmlformats.org/drawingml/2006/picture">
                   <pic:nvPicPr>
-                    <pic:cNvPr id="1687113977" name="Image 1" descr="Une image contenant texte, capture d’écran, logiciel&#10;&#10;Le contenu généré par l’IA peut être incorrect."/>
+                    <pic:cNvPr id="2058883719" name=""/>
                     <pic:cNvPicPr/>
                   </pic:nvPicPr>
                   <pic:blipFill>
@@ -4607,7 +4595,7 @@
                   <pic:spPr>
                     <a:xfrm>
                       <a:off x="0" y="0"/>
-                      <a:ext cx="4107473" cy="5106623"/>
+                      <a:ext cx="5696745" cy="2781688"/>
                     </a:xfrm>
                     <a:prstGeom prst="rect">
                       <a:avLst/>
@@ -4626,15 +4614,11 @@
         <w:spacing w:after="0"/>
       </w:pPr>
       <w:r>
-        <w:rPr>
-          <w:noProof/>
-          <w14:ligatures w14:val="standardContextual"/>
-        </w:rPr>
         <w:drawing>
-          <wp:inline distT="0" distB="0" distL="0" distR="0" wp14:anchorId="32181FAA" wp14:editId="478B130A">
-            <wp:extent cx="4096987" cy="2158660"/>
-            <wp:effectExtent l="0" t="0" r="0" b="0"/>
-            <wp:docPr id="311268959" name="Image 1" descr="Une image contenant texte, capture d’écran, logiciel&#10;&#10;Le contenu généré par l’IA peut être incorrect."/>
+          <wp:inline distT="0" distB="0" distL="0" distR="0" wp14:anchorId="731C5383" wp14:editId="7B52EA1F">
+            <wp:extent cx="5700382" cy="913765"/>
+            <wp:effectExtent l="0" t="0" r="0" b="635"/>
+            <wp:docPr id="2077721216" name="Image 1" descr="Une image contenant texte, capture d’écran, Police&#10;&#10;Le contenu généré par l’IA peut être incorrect."/>
             <wp:cNvGraphicFramePr>
               <a:graphicFrameLocks xmlns:a="http://schemas.openxmlformats.org/drawingml/2006/main" noChangeAspect="1"/>
             </wp:cNvGraphicFramePr>
@@ -4642,7 +4626,7 @@
               <a:graphicData uri="http://schemas.openxmlformats.org/drawingml/2006/picture">
                 <pic:pic xmlns:pic="http://schemas.openxmlformats.org/drawingml/2006/picture">
                   <pic:nvPicPr>
-                    <pic:cNvPr id="311268959" name="Image 1" descr="Une image contenant texte, capture d’écran, logiciel&#10;&#10;Le contenu généré par l’IA peut être incorrect."/>
+                    <pic:cNvPr id="2077721216" name="Image 1" descr="Une image contenant texte, capture d’écran, Police&#10;&#10;Le contenu généré par l’IA peut être incorrect."/>
                     <pic:cNvPicPr/>
                   </pic:nvPicPr>
                   <pic:blipFill>
@@ -4654,7 +4638,7 @@
                   <pic:spPr>
                     <a:xfrm>
                       <a:off x="0" y="0"/>
-                      <a:ext cx="4108331" cy="2164637"/>
+                      <a:ext cx="5809349" cy="931232"/>
                     </a:xfrm>
                     <a:prstGeom prst="rect">
                       <a:avLst/>
@@ -4669,6 +4653,12 @@
     </w:p>
     <w:p>
       <w:pPr>
+        <w:keepNext/>
+        <w:spacing w:after="0"/>
+      </w:pPr>
+    </w:p>
+    <w:p>
+      <w:pPr>
         <w:pStyle w:val="Lgende"/>
       </w:pPr>
       <w:r>
@@ -4679,95 +4669,6 @@
       <w:pPr>
         <w:keepNext/>
       </w:pPr>
-      <w:r>
-        <w:rPr>
-          <w:noProof/>
-        </w:rPr>
-        <w:lastRenderedPageBreak/>
-        <w:drawing>
-          <wp:inline distT="0" distB="0" distL="0" distR="0" wp14:anchorId="3B2173BC" wp14:editId="794A28F0">
-            <wp:extent cx="5944430" cy="5649113"/>
-            <wp:effectExtent l="0" t="0" r="0" b="8890"/>
-            <wp:docPr id="1366921191" name="Image 1" descr="Une image contenant texte, capture d’écran&#10;&#10;Le contenu généré par l’IA peut être incorrect."/>
-            <wp:cNvGraphicFramePr>
-              <a:graphicFrameLocks xmlns:a="http://schemas.openxmlformats.org/drawingml/2006/main" noChangeAspect="1"/>
-            </wp:cNvGraphicFramePr>
-            <a:graphic xmlns:a="http://schemas.openxmlformats.org/drawingml/2006/main">
-              <a:graphicData uri="http://schemas.openxmlformats.org/drawingml/2006/picture">
-                <pic:pic xmlns:pic="http://schemas.openxmlformats.org/drawingml/2006/picture">
-                  <pic:nvPicPr>
-                    <pic:cNvPr id="1366921191" name="Image 1" descr="Une image contenant texte, capture d’écran&#10;&#10;Le contenu généré par l’IA peut être incorrect."/>
-                    <pic:cNvPicPr/>
-                  </pic:nvPicPr>
-                  <pic:blipFill>
-                    <a:blip r:embed="rId15"/>
-                    <a:stretch>
-                      <a:fillRect/>
-                    </a:stretch>
-                  </pic:blipFill>
-                  <pic:spPr>
-                    <a:xfrm>
-                      <a:off x="0" y="0"/>
-                      <a:ext cx="5944430" cy="5649113"/>
-                    </a:xfrm>
-                    <a:prstGeom prst="rect">
-                      <a:avLst/>
-                    </a:prstGeom>
-                  </pic:spPr>
-                </pic:pic>
-              </a:graphicData>
-            </a:graphic>
-          </wp:inline>
-        </w:drawing>
-      </w:r>
-      <w:r>
-        <w:rPr>
-          <w:noProof/>
-        </w:rPr>
-        <w:drawing>
-          <wp:inline distT="0" distB="0" distL="0" distR="0" wp14:anchorId="2C9ED2FB" wp14:editId="2AE646BC">
-            <wp:extent cx="5944235" cy="1760066"/>
-            <wp:effectExtent l="0" t="0" r="0" b="0"/>
-            <wp:docPr id="316009195" name="Image 1" descr="Une image contenant texte, capture d’écran, Police&#10;&#10;Le contenu généré par l’IA peut être incorrect."/>
-            <wp:cNvGraphicFramePr>
-              <a:graphicFrameLocks xmlns:a="http://schemas.openxmlformats.org/drawingml/2006/main" noChangeAspect="1"/>
-            </wp:cNvGraphicFramePr>
-            <a:graphic xmlns:a="http://schemas.openxmlformats.org/drawingml/2006/main">
-              <a:graphicData uri="http://schemas.openxmlformats.org/drawingml/2006/picture">
-                <pic:pic xmlns:pic="http://schemas.openxmlformats.org/drawingml/2006/picture">
-                  <pic:nvPicPr>
-                    <pic:cNvPr id="316009195" name="Image 1" descr="Une image contenant texte, capture d’écran, Police&#10;&#10;Le contenu généré par l’IA peut être incorrect."/>
-                    <pic:cNvPicPr/>
-                  </pic:nvPicPr>
-                  <pic:blipFill>
-                    <a:blip r:embed="rId16"/>
-                    <a:stretch>
-                      <a:fillRect/>
-                    </a:stretch>
-                  </pic:blipFill>
-                  <pic:spPr>
-                    <a:xfrm>
-                      <a:off x="0" y="0"/>
-                      <a:ext cx="5958383" cy="1764255"/>
-                    </a:xfrm>
-                    <a:prstGeom prst="rect">
-                      <a:avLst/>
-                    </a:prstGeom>
-                  </pic:spPr>
-                </pic:pic>
-              </a:graphicData>
-            </a:graphic>
-          </wp:inline>
-        </w:drawing>
-      </w:r>
-    </w:p>
-    <w:p>
-      <w:pPr>
-        <w:pStyle w:val="Lgende"/>
-      </w:pPr>
-      <w:r>
-        <w:t>Imprime écran 2</w:t>
-      </w:r>
     </w:p>
     <w:p>
       <w:pPr>
@@ -4777,7 +4678,7 @@
       </w:pPr>
     </w:p>
     <w:sectPr>
-      <w:footerReference w:type="default" r:id="rId17"/>
+      <w:footerReference w:type="default" r:id="rId15"/>
       <w:pgSz w:w="12240" w:h="15840"/>
       <w:pgMar w:top="1418" w:right="1304" w:bottom="1418" w:left="1304" w:header="709" w:footer="709" w:gutter="0"/>
       <w:cols w:space="708"/>

</xml_diff>

<commit_message>
Ajout des requêtes et schéma
</commit_message>
<xml_diff>
--- a/remise2.docx
+++ b/remise2.docx
@@ -1668,16 +1668,8 @@
         <w:rPr>
           <w:lang w:val="fr-FR" w:eastAsia="en-US"/>
         </w:rPr>
-        <w:t xml:space="preserve">Open </w:t>
-      </w:r>
-      <w:proofErr w:type="spellStart"/>
-      <w:r>
-        <w:rPr>
-          <w:lang w:val="fr-FR" w:eastAsia="en-US"/>
-        </w:rPr>
-        <w:t>library</w:t>
-      </w:r>
-      <w:proofErr w:type="spellEnd"/>
+        <w:t>Open library</w:t>
+      </w:r>
       <w:r>
         <w:rPr>
           <w:lang w:val="fr-FR" w:eastAsia="en-US"/>
@@ -1760,21 +1752,7 @@
         <w:rPr>
           <w:lang w:val="fr-FR"/>
         </w:rPr>
-        <w:t xml:space="preserve">Outil de </w:t>
-      </w:r>
-      <w:proofErr w:type="spellStart"/>
-      <w:r>
-        <w:rPr>
-          <w:lang w:val="fr-FR"/>
-        </w:rPr>
-        <w:t>webscraping</w:t>
-      </w:r>
-      <w:proofErr w:type="spellEnd"/>
-      <w:r>
-        <w:rPr>
-          <w:lang w:val="fr-FR"/>
-        </w:rPr>
-        <w:t xml:space="preserve"> utilisé</w:t>
+        <w:t>Outil de webscraping utilisé</w:t>
       </w:r>
       <w:bookmarkEnd w:id="1"/>
     </w:p>
@@ -1796,21 +1774,7 @@
         <w:rPr>
           <w:lang w:val="fr-FR" w:eastAsia="en-US"/>
         </w:rPr>
-        <w:t xml:space="preserve"> </w:t>
-      </w:r>
-      <w:proofErr w:type="spellStart"/>
-      <w:r>
-        <w:rPr>
-          <w:lang w:val="fr-FR" w:eastAsia="en-US"/>
-        </w:rPr>
-        <w:t>Scrapy</w:t>
-      </w:r>
-      <w:proofErr w:type="spellEnd"/>
-      <w:r>
-        <w:rPr>
-          <w:lang w:val="fr-FR" w:eastAsia="en-US"/>
-        </w:rPr>
-        <w:t xml:space="preserve"> </w:t>
+        <w:t xml:space="preserve"> Scrapy </w:t>
       </w:r>
     </w:p>
     <w:p>
@@ -1899,16 +1863,8 @@
         <w:rPr>
           <w:lang w:val="fr-FR"/>
         </w:rPr>
-        <w:t xml:space="preserve">Création d’un projet </w:t>
-      </w:r>
-      <w:proofErr w:type="spellStart"/>
-      <w:r>
-        <w:rPr>
-          <w:lang w:val="fr-FR"/>
-        </w:rPr>
-        <w:t>Scrapy</w:t>
-      </w:r>
-      <w:proofErr w:type="spellEnd"/>
+        <w:t>Création d’un projet Scrapy</w:t>
+      </w:r>
     </w:p>
     <w:p>
       <w:pPr>
@@ -1927,43 +1883,19 @@
         </w:rPr>
         <w:t>Exécution d’un « </w:t>
       </w:r>
-      <w:proofErr w:type="spellStart"/>
       <w:r>
         <w:rPr>
           <w:i/>
           <w:iCs/>
           <w:lang w:val="fr-FR"/>
         </w:rPr>
-        <w:t>Scrapy</w:t>
-      </w:r>
-      <w:proofErr w:type="spellEnd"/>
-      <w:r>
-        <w:rPr>
-          <w:i/>
-          <w:iCs/>
-          <w:lang w:val="fr-FR"/>
-        </w:rPr>
-        <w:t xml:space="preserve"> spider</w:t>
-      </w:r>
-      <w:r>
-        <w:rPr>
-          <w:lang w:val="fr-FR"/>
-        </w:rPr>
-        <w:t> </w:t>
-      </w:r>
-      <w:proofErr w:type="gramStart"/>
-      <w:r>
-        <w:rPr>
-          <w:lang w:val="fr-FR"/>
-        </w:rPr>
-        <w:t>»  (</w:t>
-      </w:r>
-      <w:proofErr w:type="gramEnd"/>
-      <w:r>
-        <w:rPr>
-          <w:lang w:val="fr-FR"/>
-        </w:rPr>
-        <w:t>pour récupérer les données du site)</w:t>
+        <w:t>Scrapy spider</w:t>
+      </w:r>
+      <w:r>
+        <w:rPr>
+          <w:lang w:val="fr-FR"/>
+        </w:rPr>
+        <w:t> »  (pour récupérer les données du site)</w:t>
       </w:r>
     </w:p>
     <w:p>
@@ -1981,21 +1913,7 @@
         <w:rPr>
           <w:lang w:val="fr-FR"/>
         </w:rPr>
-        <w:t xml:space="preserve">Exporter les données </w:t>
-      </w:r>
-      <w:proofErr w:type="gramStart"/>
-      <w:r>
-        <w:rPr>
-          <w:lang w:val="fr-FR"/>
-        </w:rPr>
-        <w:t>récupérées  (</w:t>
-      </w:r>
-      <w:proofErr w:type="gramEnd"/>
-      <w:r>
-        <w:rPr>
-          <w:lang w:val="fr-FR"/>
-        </w:rPr>
-        <w:t>format JSON, CSV</w:t>
+        <w:t>Exporter les données récupérées  (format JSON, CSV</w:t>
       </w:r>
       <w:r>
         <w:rPr>
@@ -2027,99 +1945,74 @@
         </w:rPr>
         <w:t>Utiliser « </w:t>
       </w:r>
-      <w:proofErr w:type="spellStart"/>
       <w:r>
         <w:rPr>
           <w:i/>
           <w:iCs/>
           <w:lang w:val="fr-FR"/>
         </w:rPr>
-        <w:t>Scrapy</w:t>
-      </w:r>
-      <w:proofErr w:type="spellEnd"/>
+        <w:t>Scrapy Shell</w:t>
+      </w:r>
+      <w:r>
+        <w:rPr>
+          <w:lang w:val="fr-FR"/>
+        </w:rPr>
+        <w:t xml:space="preserve"> »  (pour tester et débugger la logique </w:t>
+      </w:r>
       <w:r>
         <w:rPr>
           <w:i/>
           <w:iCs/>
           <w:lang w:val="fr-FR"/>
         </w:rPr>
-        <w:t xml:space="preserve"> Shell</w:t>
-      </w:r>
-      <w:r>
-        <w:rPr>
-          <w:lang w:val="fr-FR"/>
-        </w:rPr>
-        <w:t> </w:t>
-      </w:r>
-      <w:proofErr w:type="gramStart"/>
-      <w:r>
-        <w:rPr>
-          <w:lang w:val="fr-FR"/>
-        </w:rPr>
-        <w:t>»  (</w:t>
-      </w:r>
-      <w:proofErr w:type="gramEnd"/>
-      <w:r>
-        <w:rPr>
-          <w:lang w:val="fr-FR"/>
-        </w:rPr>
-        <w:t xml:space="preserve">pour tester et débugger la logique </w:t>
-      </w:r>
-      <w:proofErr w:type="spellStart"/>
+        <w:t>Scraping</w:t>
+      </w:r>
+      <w:r>
+        <w:rPr>
+          <w:lang w:val="fr-FR"/>
+        </w:rPr>
+        <w:t>)</w:t>
+      </w:r>
+    </w:p>
+    <w:p>
+      <w:r>
+        <w:t xml:space="preserve">Scrapy est un </w:t>
+      </w:r>
       <w:r>
         <w:rPr>
           <w:i/>
           <w:iCs/>
-          <w:lang w:val="fr-FR"/>
-        </w:rPr>
-        <w:t>Scraping</w:t>
-      </w:r>
-      <w:proofErr w:type="spellEnd"/>
-      <w:r>
-        <w:rPr>
-          <w:lang w:val="fr-FR"/>
-        </w:rPr>
-        <w:t>)</w:t>
-      </w:r>
-    </w:p>
-    <w:p>
-      <w:proofErr w:type="spellStart"/>
-      <w:r>
-        <w:t>Scrapy</w:t>
-      </w:r>
-      <w:proofErr w:type="spellEnd"/>
-      <w:r>
-        <w:t xml:space="preserve"> est un </w:t>
-      </w:r>
-      <w:proofErr w:type="spellStart"/>
+        </w:rPr>
+        <w:t>framework</w:t>
+      </w:r>
+      <w:r>
+        <w:t xml:space="preserve"> Python </w:t>
+      </w:r>
       <w:r>
         <w:rPr>
           <w:i/>
           <w:iCs/>
         </w:rPr>
-        <w:t>framework</w:t>
-      </w:r>
-      <w:proofErr w:type="spellEnd"/>
-      <w:r>
-        <w:t xml:space="preserve"> Python </w:t>
+        <w:t>open-source</w:t>
+      </w:r>
+      <w:r>
+        <w:t xml:space="preserve"> qui extrait des données de sites web en envoyant des requêtes HTTP, en téléchargeant le contenu des pages, en le parsant avec des sélecteurs CSS ou XPath pour en extraire les informations (utilisant les </w:t>
+      </w:r>
+      <w:r>
+        <w:t>« </w:t>
       </w:r>
       <w:r>
         <w:rPr>
           <w:i/>
           <w:iCs/>
         </w:rPr>
-        <w:t>open-source</w:t>
-      </w:r>
-      <w:r>
-        <w:t xml:space="preserve"> qui extrait des données de sites web en envoyant des requêtes HTTP, en téléchargeant le contenu des pages, en le </w:t>
-      </w:r>
-      <w:proofErr w:type="spellStart"/>
-      <w:r>
-        <w:t>parsant</w:t>
-      </w:r>
-      <w:proofErr w:type="spellEnd"/>
-      <w:r>
-        <w:t xml:space="preserve"> avec des sélecteurs CSS ou XPath pour en extraire les informations (utilisant les </w:t>
+        <w:t>Spiders</w:t>
+      </w:r>
+      <w:r>
+        <w:t> »</w:t>
+      </w:r>
+      <w:r>
+        <w:t>), puis en structurant et en stockant ces données via des pipelines. Son fonctionnement est dirigé par un moteur qui coordonne les araignées (</w:t>
       </w:r>
       <w:r>
         <w:t>« </w:t>
@@ -2132,40 +2025,22 @@
         <w:t>Spiders</w:t>
       </w:r>
       <w:r>
-        <w:t> »</w:t>
-      </w:r>
-      <w:r>
-        <w:t>), puis en structurant et en stockant ces données via des pipelines. Son fonctionnement est dirigé par un moteur qui coordonne les araignées (</w:t>
-      </w:r>
-      <w:r>
-        <w:t>« </w:t>
-      </w:r>
-      <w:r>
         <w:rPr>
           <w:i/>
           <w:iCs/>
         </w:rPr>
-        <w:t>Spiders</w:t>
+        <w:t> »</w:t>
+      </w:r>
+      <w:r>
+        <w:t xml:space="preserve">) et l'ordonnanceur pour gérer le flux de requêtes et de réponses, offrant ainsi un moyen efficace et extensible de réaliser du web </w:t>
       </w:r>
       <w:r>
         <w:rPr>
           <w:i/>
           <w:iCs/>
         </w:rPr>
-        <w:t> »</w:t>
-      </w:r>
-      <w:r>
-        <w:t xml:space="preserve">) et l'ordonnanceur pour gérer le flux de requêtes et de réponses, offrant ainsi un moyen efficace et extensible de réaliser du web </w:t>
-      </w:r>
-      <w:proofErr w:type="spellStart"/>
-      <w:r>
-        <w:rPr>
-          <w:i/>
-          <w:iCs/>
-        </w:rPr>
         <w:t>scraping</w:t>
       </w:r>
-      <w:proofErr w:type="spellEnd"/>
       <w:r>
         <w:t xml:space="preserve"> pour des projets de toute envergure. </w:t>
       </w:r>
@@ -2233,25 +2108,7 @@
                 <w:bCs/>
                 <w:lang w:val="fr-FR" w:eastAsia="en-US"/>
               </w:rPr>
-              <w:t xml:space="preserve">Installation de </w:t>
-            </w:r>
-            <w:proofErr w:type="spellStart"/>
-            <w:r>
-              <w:rPr>
-                <w:b/>
-                <w:bCs/>
-                <w:lang w:val="fr-FR" w:eastAsia="en-US"/>
-              </w:rPr>
-              <w:t>Scrapy</w:t>
-            </w:r>
-            <w:proofErr w:type="spellEnd"/>
-            <w:r>
-              <w:rPr>
-                <w:b/>
-                <w:bCs/>
-                <w:lang w:val="fr-FR" w:eastAsia="en-US"/>
-              </w:rPr>
-              <w:t> :</w:t>
+              <w:t>Installation de Scrapy :</w:t>
             </w:r>
           </w:p>
           <w:p>
@@ -2266,44 +2123,12 @@
                 <w:lang w:val="fr-FR" w:eastAsia="en-US"/>
               </w:rPr>
             </w:pPr>
-            <w:proofErr w:type="spellStart"/>
-            <w:proofErr w:type="gramStart"/>
-            <w:r>
-              <w:rPr>
-                <w:lang w:val="fr-FR" w:eastAsia="en-US"/>
-              </w:rPr>
-              <w:t>pip</w:t>
-            </w:r>
-            <w:proofErr w:type="spellEnd"/>
-            <w:proofErr w:type="gramEnd"/>
-            <w:r>
-              <w:rPr>
-                <w:lang w:val="fr-FR" w:eastAsia="en-US"/>
-              </w:rPr>
-              <w:t xml:space="preserve"> </w:t>
-            </w:r>
-            <w:proofErr w:type="spellStart"/>
-            <w:r>
-              <w:rPr>
-                <w:lang w:val="fr-FR" w:eastAsia="en-US"/>
-              </w:rPr>
-              <w:t>install</w:t>
-            </w:r>
-            <w:proofErr w:type="spellEnd"/>
-            <w:r>
-              <w:rPr>
-                <w:lang w:val="fr-FR" w:eastAsia="en-US"/>
-              </w:rPr>
-              <w:t xml:space="preserve"> </w:t>
-            </w:r>
-            <w:proofErr w:type="spellStart"/>
-            <w:r>
-              <w:rPr>
-                <w:lang w:val="fr-FR" w:eastAsia="en-US"/>
-              </w:rPr>
-              <w:t>scrapy</w:t>
-            </w:r>
-            <w:proofErr w:type="spellEnd"/>
+            <w:r>
+              <w:rPr>
+                <w:lang w:val="fr-FR" w:eastAsia="en-US"/>
+              </w:rPr>
+              <w:t>pip install scrapy</w:t>
+            </w:r>
           </w:p>
           <w:p>
             <w:pPr>
@@ -2318,25 +2143,7 @@
                 <w:bCs/>
                 <w:lang w:val="fr-FR" w:eastAsia="en-US"/>
               </w:rPr>
-              <w:t xml:space="preserve">Dans </w:t>
-            </w:r>
-            <w:proofErr w:type="spellStart"/>
-            <w:r>
-              <w:rPr>
-                <w:b/>
-                <w:bCs/>
-                <w:lang w:val="fr-FR" w:eastAsia="en-US"/>
-              </w:rPr>
-              <w:t>VSCode</w:t>
-            </w:r>
-            <w:proofErr w:type="spellEnd"/>
-            <w:r>
-              <w:rPr>
-                <w:b/>
-                <w:bCs/>
-                <w:lang w:val="fr-FR" w:eastAsia="en-US"/>
-              </w:rPr>
-              <w:t> :</w:t>
+              <w:t>Dans VSCode :</w:t>
             </w:r>
             <w:r>
               <w:rPr>
@@ -2357,56 +2164,12 @@
                 <w:lang w:val="fr-FR" w:eastAsia="en-US"/>
               </w:rPr>
             </w:pPr>
-            <w:proofErr w:type="gramStart"/>
-            <w:r>
-              <w:rPr>
-                <w:lang w:val="fr-FR" w:eastAsia="en-US"/>
-              </w:rPr>
-              <w:t>python</w:t>
-            </w:r>
-            <w:proofErr w:type="gramEnd"/>
-            <w:r>
-              <w:rPr>
-                <w:lang w:val="fr-FR" w:eastAsia="en-US"/>
-              </w:rPr>
-              <w:t xml:space="preserve"> -m </w:t>
-            </w:r>
-            <w:proofErr w:type="spellStart"/>
-            <w:r>
-              <w:rPr>
-                <w:lang w:val="fr-FR" w:eastAsia="en-US"/>
-              </w:rPr>
-              <w:t>scrapy</w:t>
-            </w:r>
-            <w:proofErr w:type="spellEnd"/>
-            <w:r>
-              <w:rPr>
-                <w:lang w:val="fr-FR" w:eastAsia="en-US"/>
-              </w:rPr>
-              <w:t xml:space="preserve"> </w:t>
-            </w:r>
-            <w:proofErr w:type="spellStart"/>
-            <w:r>
-              <w:rPr>
-                <w:lang w:val="fr-FR" w:eastAsia="en-US"/>
-              </w:rPr>
-              <w:t>startproject</w:t>
-            </w:r>
-            <w:proofErr w:type="spellEnd"/>
-            <w:r>
-              <w:rPr>
-                <w:lang w:val="fr-FR" w:eastAsia="en-US"/>
-              </w:rPr>
-              <w:t xml:space="preserve"> </w:t>
-            </w:r>
-            <w:proofErr w:type="spellStart"/>
-            <w:r>
-              <w:rPr>
-                <w:lang w:val="fr-FR" w:eastAsia="en-US"/>
-              </w:rPr>
-              <w:t>hl_nouvelles_technos</w:t>
-            </w:r>
-            <w:proofErr w:type="spellEnd"/>
+            <w:r>
+              <w:rPr>
+                <w:lang w:val="fr-FR" w:eastAsia="en-US"/>
+              </w:rPr>
+              <w:t>python -m scrapy startproject hl_nouvelles_technos</w:t>
+            </w:r>
           </w:p>
           <w:p>
             <w:pPr>
@@ -2420,28 +2183,12 @@
                 <w:lang w:val="fr-FR" w:eastAsia="en-US"/>
               </w:rPr>
             </w:pPr>
-            <w:proofErr w:type="gramStart"/>
-            <w:r>
-              <w:rPr>
-                <w:lang w:val="fr-FR" w:eastAsia="en-US"/>
-              </w:rPr>
-              <w:t>cd</w:t>
-            </w:r>
-            <w:proofErr w:type="gramEnd"/>
-            <w:r>
-              <w:rPr>
-                <w:lang w:val="fr-FR" w:eastAsia="en-US"/>
-              </w:rPr>
-              <w:t xml:space="preserve"> </w:t>
-            </w:r>
-            <w:proofErr w:type="spellStart"/>
-            <w:r>
-              <w:rPr>
-                <w:lang w:val="fr-FR" w:eastAsia="en-US"/>
-              </w:rPr>
-              <w:t>hl_nouvelles_technos</w:t>
-            </w:r>
-            <w:proofErr w:type="spellEnd"/>
+            <w:r>
+              <w:rPr>
+                <w:lang w:val="fr-FR" w:eastAsia="en-US"/>
+              </w:rPr>
+              <w:t>cd hl_nouvelles_technos</w:t>
+            </w:r>
           </w:p>
           <w:p>
             <w:pPr>
@@ -2455,47 +2202,11 @@
                 <w:lang w:val="fr-FR" w:eastAsia="en-US"/>
               </w:rPr>
             </w:pPr>
-            <w:proofErr w:type="gramStart"/>
-            <w:r>
-              <w:rPr>
-                <w:lang w:val="fr-FR" w:eastAsia="en-US"/>
-              </w:rPr>
-              <w:t>python</w:t>
-            </w:r>
-            <w:proofErr w:type="gramEnd"/>
-            <w:r>
-              <w:rPr>
-                <w:lang w:val="fr-FR" w:eastAsia="en-US"/>
-              </w:rPr>
-              <w:t xml:space="preserve"> -m </w:t>
-            </w:r>
-            <w:proofErr w:type="spellStart"/>
-            <w:r>
-              <w:rPr>
-                <w:lang w:val="fr-FR" w:eastAsia="en-US"/>
-              </w:rPr>
-              <w:t>scrapy</w:t>
-            </w:r>
-            <w:proofErr w:type="spellEnd"/>
-            <w:r>
-              <w:rPr>
-                <w:lang w:val="fr-FR" w:eastAsia="en-US"/>
-              </w:rPr>
-              <w:t xml:space="preserve"> </w:t>
-            </w:r>
-            <w:proofErr w:type="spellStart"/>
-            <w:r>
-              <w:rPr>
-                <w:lang w:val="fr-FR" w:eastAsia="en-US"/>
-              </w:rPr>
-              <w:t>genspider</w:t>
-            </w:r>
-            <w:proofErr w:type="spellEnd"/>
-            <w:r>
-              <w:rPr>
-                <w:lang w:val="fr-FR" w:eastAsia="en-US"/>
-              </w:rPr>
-              <w:t xml:space="preserve"> </w:t>
+            <w:r>
+              <w:rPr>
+                <w:lang w:val="fr-FR" w:eastAsia="en-US"/>
+              </w:rPr>
+              <w:t xml:space="preserve">python -m scrapy genspider </w:t>
             </w:r>
             <w:r>
               <w:rPr>
@@ -2587,33 +2298,11 @@
                 <w:lang w:val="fr-FR" w:eastAsia="en-US"/>
               </w:rPr>
             </w:pPr>
-            <w:proofErr w:type="gramStart"/>
-            <w:r>
-              <w:rPr>
-                <w:lang w:val="fr-FR" w:eastAsia="en-US"/>
-              </w:rPr>
-              <w:t>python</w:t>
-            </w:r>
-            <w:proofErr w:type="gramEnd"/>
-            <w:r>
-              <w:rPr>
-                <w:lang w:val="fr-FR" w:eastAsia="en-US"/>
-              </w:rPr>
-              <w:t xml:space="preserve"> -m </w:t>
-            </w:r>
-            <w:proofErr w:type="spellStart"/>
-            <w:r>
-              <w:rPr>
-                <w:lang w:val="fr-FR" w:eastAsia="en-US"/>
-              </w:rPr>
-              <w:t>scrapy</w:t>
-            </w:r>
-            <w:proofErr w:type="spellEnd"/>
-            <w:r>
-              <w:rPr>
-                <w:lang w:val="fr-FR" w:eastAsia="en-US"/>
-              </w:rPr>
-              <w:t xml:space="preserve"> crawl </w:t>
+            <w:r>
+              <w:rPr>
+                <w:lang w:val="fr-FR" w:eastAsia="en-US"/>
+              </w:rPr>
+              <w:t xml:space="preserve">python -m scrapy crawl </w:t>
             </w:r>
             <w:r>
               <w:rPr>
@@ -2627,8 +2316,6 @@
               </w:rPr>
               <w:t xml:space="preserve"> -O </w:t>
             </w:r>
-            <w:proofErr w:type="spellStart"/>
-            <w:proofErr w:type="gramStart"/>
             <w:r>
               <w:rPr>
                 <w:lang w:val="fr-FR" w:eastAsia="en-US"/>
@@ -2641,8 +2328,6 @@
               </w:rPr>
               <w:t>.json</w:t>
             </w:r>
-            <w:proofErr w:type="spellEnd"/>
-            <w:proofErr w:type="gramEnd"/>
           </w:p>
           <w:p>
             <w:pPr>
@@ -2757,49 +2442,11 @@
                 <w:lang w:val="fr-FR" w:eastAsia="en-US"/>
               </w:rPr>
             </w:pPr>
-            <w:proofErr w:type="spellStart"/>
-            <w:proofErr w:type="gramStart"/>
-            <w:r>
-              <w:rPr>
-                <w:lang w:val="fr-FR" w:eastAsia="en-US"/>
-              </w:rPr>
-              <w:t>pip</w:t>
-            </w:r>
-            <w:proofErr w:type="spellEnd"/>
-            <w:proofErr w:type="gramEnd"/>
-            <w:r>
-              <w:rPr>
-                <w:lang w:val="fr-FR" w:eastAsia="en-US"/>
-              </w:rPr>
-              <w:t xml:space="preserve"> </w:t>
-            </w:r>
-            <w:proofErr w:type="spellStart"/>
-            <w:r>
-              <w:rPr>
-                <w:lang w:val="fr-FR" w:eastAsia="en-US"/>
-              </w:rPr>
-              <w:t>install</w:t>
-            </w:r>
-            <w:proofErr w:type="spellEnd"/>
-            <w:r>
-              <w:rPr>
-                <w:lang w:val="fr-FR" w:eastAsia="en-US"/>
-              </w:rPr>
-              <w:t xml:space="preserve"> </w:t>
-            </w:r>
-            <w:proofErr w:type="spellStart"/>
-            <w:r>
-              <w:rPr>
-                <w:lang w:val="fr-FR" w:eastAsia="en-US"/>
-              </w:rPr>
-              <w:t>deep</w:t>
-            </w:r>
-            <w:proofErr w:type="spellEnd"/>
-            <w:r>
-              <w:rPr>
-                <w:lang w:val="fr-FR" w:eastAsia="en-US"/>
-              </w:rPr>
-              <w:t>-translator</w:t>
+            <w:r>
+              <w:rPr>
+                <w:lang w:val="fr-FR" w:eastAsia="en-US"/>
+              </w:rPr>
+              <w:t>pip install deep-translator</w:t>
             </w:r>
           </w:p>
           <w:p>
@@ -2936,25 +2583,7 @@
                 <w:bCs/>
                 <w:lang w:val="fr-FR" w:eastAsia="en-US"/>
               </w:rPr>
-              <w:t xml:space="preserve">Dans </w:t>
-            </w:r>
-            <w:proofErr w:type="spellStart"/>
-            <w:r>
-              <w:rPr>
-                <w:b/>
-                <w:bCs/>
-                <w:lang w:val="fr-FR" w:eastAsia="en-US"/>
-              </w:rPr>
-              <w:t>VSCode</w:t>
-            </w:r>
-            <w:proofErr w:type="spellEnd"/>
-            <w:r>
-              <w:rPr>
-                <w:b/>
-                <w:bCs/>
-                <w:lang w:val="fr-FR" w:eastAsia="en-US"/>
-              </w:rPr>
-              <w:t> :</w:t>
+              <w:t>Dans VSCode :</w:t>
             </w:r>
             <w:r>
               <w:rPr>
@@ -2975,36 +2604,12 @@
                 <w:lang w:val="fr-FR" w:eastAsia="en-US"/>
               </w:rPr>
             </w:pPr>
-            <w:proofErr w:type="gramStart"/>
-            <w:r>
-              <w:rPr>
-                <w:lang w:val="fr-FR" w:eastAsia="en-US"/>
-              </w:rPr>
-              <w:t>python</w:t>
-            </w:r>
-            <w:proofErr w:type="gramEnd"/>
-            <w:r>
-              <w:rPr>
-                <w:lang w:val="fr-FR" w:eastAsia="en-US"/>
-              </w:rPr>
-              <w:t xml:space="preserve"> -m </w:t>
-            </w:r>
-            <w:proofErr w:type="spellStart"/>
-            <w:r>
-              <w:rPr>
-                <w:lang w:val="fr-FR" w:eastAsia="en-US"/>
-              </w:rPr>
-              <w:t>scrapy</w:t>
-            </w:r>
-            <w:proofErr w:type="spellEnd"/>
-            <w:r>
-              <w:rPr>
-                <w:lang w:val="fr-FR" w:eastAsia="en-US"/>
-              </w:rPr>
-              <w:t xml:space="preserve"> crawl hl_projet2 -o </w:t>
-            </w:r>
-            <w:proofErr w:type="spellStart"/>
-            <w:proofErr w:type="gramStart"/>
+            <w:r>
+              <w:rPr>
+                <w:lang w:val="fr-FR" w:eastAsia="en-US"/>
+              </w:rPr>
+              <w:t xml:space="preserve">python -m scrapy crawl hl_projet2 -o </w:t>
+            </w:r>
             <w:r>
               <w:rPr>
                 <w:lang w:val="fr-FR" w:eastAsia="en-US"/>
@@ -3017,8 +2622,6 @@
               </w:rPr>
               <w:t>.json</w:t>
             </w:r>
-            <w:proofErr w:type="spellEnd"/>
-            <w:proofErr w:type="gramEnd"/>
           </w:p>
           <w:p>
             <w:pPr>
@@ -3066,19 +2669,11 @@
                 <w:lang w:val="fr-FR" w:eastAsia="en-US"/>
               </w:rPr>
             </w:pPr>
-            <w:proofErr w:type="spellStart"/>
-            <w:r>
-              <w:rPr>
-                <w:lang w:val="fr-FR" w:eastAsia="en-US"/>
-              </w:rPr>
-              <w:t>Scrape</w:t>
-            </w:r>
-            <w:proofErr w:type="spellEnd"/>
-            <w:r>
-              <w:rPr>
-                <w:lang w:val="fr-FR" w:eastAsia="en-US"/>
-              </w:rPr>
-              <w:t xml:space="preserve"> une dizaine de données</w:t>
+            <w:r>
+              <w:rPr>
+                <w:lang w:val="fr-FR" w:eastAsia="en-US"/>
+              </w:rPr>
+              <w:t>Scrape une dizaine de données</w:t>
             </w:r>
             <w:r>
               <w:rPr>
@@ -3090,24 +2685,8 @@
               <w:rPr>
                 <w:lang w:val="fr-FR" w:eastAsia="en-US"/>
               </w:rPr>
-              <w:t xml:space="preserve">python -m </w:t>
-            </w:r>
-            <w:proofErr w:type="spellStart"/>
-            <w:r>
-              <w:rPr>
-                <w:lang w:val="fr-FR" w:eastAsia="en-US"/>
-              </w:rPr>
-              <w:t>scrapy</w:t>
-            </w:r>
-            <w:proofErr w:type="spellEnd"/>
-            <w:r>
-              <w:rPr>
-                <w:lang w:val="fr-FR" w:eastAsia="en-US"/>
-              </w:rPr>
-              <w:t xml:space="preserve"> crawl hl_projet2 -o </w:t>
-            </w:r>
-            <w:proofErr w:type="spellStart"/>
-            <w:proofErr w:type="gramStart"/>
+              <w:t xml:space="preserve">python -m scrapy crawl hl_projet2 -o </w:t>
+            </w:r>
             <w:r>
               <w:rPr>
                 <w:lang w:val="fr-FR" w:eastAsia="en-US"/>
@@ -3120,8 +2699,6 @@
               </w:rPr>
               <w:t>.json</w:t>
             </w:r>
-            <w:proofErr w:type="spellEnd"/>
-            <w:proofErr w:type="gramEnd"/>
             <w:r>
               <w:rPr>
                 <w:lang w:val="fr-FR" w:eastAsia="en-US"/>
@@ -3164,21 +2741,7 @@
               <w:rPr>
                 <w:lang w:val="fr-FR" w:eastAsia="en-US"/>
               </w:rPr>
-              <w:t xml:space="preserve">Quelques modifications pour faciliter l’import dans </w:t>
-            </w:r>
-            <w:proofErr w:type="spellStart"/>
-            <w:r>
-              <w:rPr>
-                <w:lang w:val="fr-FR" w:eastAsia="en-US"/>
-              </w:rPr>
-              <w:t>MondoBD</w:t>
-            </w:r>
-            <w:proofErr w:type="spellEnd"/>
-            <w:r>
-              <w:rPr>
-                <w:lang w:val="fr-FR" w:eastAsia="en-US"/>
-              </w:rPr>
-              <w:t xml:space="preserve"> Atlas</w:t>
+              <w:t>Quelques modifications pour faciliter l’import dans MondoBD Atlas</w:t>
             </w:r>
           </w:p>
           <w:p>
@@ -3211,19 +2774,11 @@
                 <w:lang w:val="fr-FR" w:eastAsia="en-US"/>
               </w:rPr>
             </w:pPr>
-            <w:proofErr w:type="spellStart"/>
-            <w:r>
-              <w:rPr>
-                <w:lang w:val="fr-FR" w:eastAsia="en-US"/>
-              </w:rPr>
-              <w:t>Scrape</w:t>
-            </w:r>
-            <w:proofErr w:type="spellEnd"/>
-            <w:r>
-              <w:rPr>
-                <w:lang w:val="fr-FR" w:eastAsia="en-US"/>
-              </w:rPr>
-              <w:t xml:space="preserve"> 2500 données</w:t>
+            <w:r>
+              <w:rPr>
+                <w:lang w:val="fr-FR" w:eastAsia="en-US"/>
+              </w:rPr>
+              <w:t>Scrape 2500 données</w:t>
             </w:r>
             <w:r>
               <w:rPr>
@@ -3248,21 +2803,7 @@
               <w:rPr>
                 <w:lang w:val="fr-FR" w:eastAsia="en-US"/>
               </w:rPr>
-              <w:t xml:space="preserve">Fichier </w:t>
-            </w:r>
-            <w:proofErr w:type="spellStart"/>
-            <w:r>
-              <w:rPr>
-                <w:lang w:val="fr-FR" w:eastAsia="en-US"/>
-              </w:rPr>
-              <w:t>json</w:t>
-            </w:r>
-            <w:proofErr w:type="spellEnd"/>
-            <w:r>
-              <w:rPr>
-                <w:lang w:val="fr-FR" w:eastAsia="en-US"/>
-              </w:rPr>
-              <w:t xml:space="preserve"> -&gt; csv</w:t>
+              <w:t>Fichier json -&gt; csv</w:t>
             </w:r>
           </w:p>
         </w:tc>
@@ -3316,6 +2857,48 @@
           <w:lang w:val="fr-FR" w:eastAsia="en-US"/>
         </w:rPr>
       </w:pPr>
+      <w:r>
+        <w:rPr>
+          <w:lang w:val="fr-FR" w:eastAsia="en-US"/>
+        </w:rPr>
+        <w:t xml:space="preserve">Les données obtenus à partir du Scraping ont été </w:t>
+      </w:r>
+      <w:r>
+        <w:rPr>
+          <w:lang w:val="fr-FR" w:eastAsia="en-US"/>
+        </w:rPr>
+        <w:t>importé</w:t>
+      </w:r>
+      <w:r>
+        <w:rPr>
+          <w:lang w:val="fr-FR" w:eastAsia="en-US"/>
+        </w:rPr>
+        <w:t xml:space="preserve"> directement dans MongoDB </w:t>
+      </w:r>
+      <w:r>
+        <w:rPr>
+          <w:lang w:val="fr-FR" w:eastAsia="en-US"/>
+        </w:rPr>
+        <w:t xml:space="preserve">Compass </w:t>
+      </w:r>
+      <w:r>
+        <w:rPr>
+          <w:lang w:val="fr-FR" w:eastAsia="en-US"/>
+        </w:rPr>
+        <w:t>via l’option « </w:t>
+      </w:r>
+      <w:r>
+        <w:rPr>
+          <w:lang w:val="fr-FR" w:eastAsia="en-US"/>
+        </w:rPr>
+        <w:t>Add data</w:t>
+      </w:r>
+      <w:r>
+        <w:rPr>
+          <w:lang w:val="fr-FR" w:eastAsia="en-US"/>
+        </w:rPr>
+        <w:t> », puis importé dans un collection nommée « Livres » du projet « projet2 ».</w:t>
+      </w:r>
     </w:p>
     <w:p>
       <w:pPr>
@@ -3354,6 +2937,12 @@
           <w:lang w:val="fr-FR" w:eastAsia="en-US"/>
         </w:rPr>
       </w:pPr>
+      <w:r>
+        <w:rPr>
+          <w:lang w:val="fr-FR" w:eastAsia="en-US"/>
+        </w:rPr>
+        <w:t xml:space="preserve">Chaque document dans la collection « Livres » contient les champs suivants : </w:t>
+      </w:r>
     </w:p>
     <w:p>
       <w:pPr>
@@ -3362,6 +2951,208 @@
           <w:lang w:val="fr-FR" w:eastAsia="en-US"/>
         </w:rPr>
       </w:pPr>
+      <w:r>
+        <w:rPr>
+          <w:lang w:val="fr-FR" w:eastAsia="en-US"/>
+        </w:rPr>
+        <w:t>_id : ObjectId (identifiant</w:t>
+      </w:r>
+      <w:r>
+        <w:rPr>
+          <w:lang w:val="fr-FR" w:eastAsia="en-US"/>
+        </w:rPr>
+        <w:t xml:space="preserve"> </w:t>
+      </w:r>
+      <w:r>
+        <w:rPr>
+          <w:lang w:val="fr-FR" w:eastAsia="en-US"/>
+        </w:rPr>
+        <w:t xml:space="preserve">généré automatiquement par MongoDB) </w:t>
+      </w:r>
+    </w:p>
+    <w:p>
+      <w:pPr>
+        <w:spacing w:after="160" w:line="278" w:lineRule="auto"/>
+        <w:rPr>
+          <w:lang w:val="fr-FR" w:eastAsia="en-US"/>
+        </w:rPr>
+      </w:pPr>
+      <w:r>
+        <w:rPr>
+          <w:lang w:val="fr-FR" w:eastAsia="en-US"/>
+        </w:rPr>
+        <w:t xml:space="preserve">id_livre : </w:t>
+      </w:r>
+      <w:r>
+        <w:rPr>
+          <w:lang w:val="fr-FR" w:eastAsia="en-US"/>
+        </w:rPr>
+        <w:t xml:space="preserve">nombre </w:t>
+      </w:r>
+      <w:r>
+        <w:rPr>
+          <w:lang w:val="fr-FR" w:eastAsia="en-US"/>
+        </w:rPr>
+        <w:t>entier</w:t>
+      </w:r>
+    </w:p>
+    <w:p>
+      <w:pPr>
+        <w:spacing w:after="160" w:line="278" w:lineRule="auto"/>
+        <w:rPr>
+          <w:lang w:val="fr-FR" w:eastAsia="en-US"/>
+        </w:rPr>
+      </w:pPr>
+      <w:r>
+        <w:rPr>
+          <w:lang w:val="fr-FR" w:eastAsia="en-US"/>
+        </w:rPr>
+        <w:t xml:space="preserve">titre : chaîne de caractères </w:t>
+      </w:r>
+    </w:p>
+    <w:p>
+      <w:pPr>
+        <w:spacing w:after="160" w:line="278" w:lineRule="auto"/>
+        <w:rPr>
+          <w:lang w:val="fr-FR" w:eastAsia="en-US"/>
+        </w:rPr>
+      </w:pPr>
+      <w:r>
+        <w:rPr>
+          <w:lang w:val="fr-FR" w:eastAsia="en-US"/>
+        </w:rPr>
+        <w:t>auteur : chaîne</w:t>
+      </w:r>
+      <w:r>
+        <w:rPr>
+          <w:lang w:val="fr-FR" w:eastAsia="en-US"/>
+        </w:rPr>
+        <w:t xml:space="preserve"> </w:t>
+      </w:r>
+      <w:r>
+        <w:rPr>
+          <w:lang w:val="fr-FR" w:eastAsia="en-US"/>
+        </w:rPr>
+        <w:t xml:space="preserve">de caractères </w:t>
+      </w:r>
+    </w:p>
+    <w:p>
+      <w:pPr>
+        <w:spacing w:after="160" w:line="278" w:lineRule="auto"/>
+        <w:rPr>
+          <w:lang w:val="fr-FR" w:eastAsia="en-US"/>
+        </w:rPr>
+      </w:pPr>
+      <w:r>
+        <w:rPr>
+          <w:lang w:val="fr-FR" w:eastAsia="en-US"/>
+        </w:rPr>
+        <w:t xml:space="preserve">categorie : chaîne de caractères </w:t>
+      </w:r>
+    </w:p>
+    <w:p>
+      <w:pPr>
+        <w:spacing w:after="160" w:line="278" w:lineRule="auto"/>
+        <w:rPr>
+          <w:lang w:val="fr-FR" w:eastAsia="en-US"/>
+        </w:rPr>
+      </w:pPr>
+      <w:r>
+        <w:rPr>
+          <w:lang w:val="fr-FR" w:eastAsia="en-US"/>
+        </w:rPr>
+        <w:t>sous_categorie : tableau de chaînes</w:t>
+      </w:r>
+      <w:r>
+        <w:rPr>
+          <w:lang w:val="fr-FR" w:eastAsia="en-US"/>
+        </w:rPr>
+        <w:t xml:space="preserve"> </w:t>
+      </w:r>
+    </w:p>
+    <w:p>
+      <w:pPr>
+        <w:spacing w:after="160" w:line="278" w:lineRule="auto"/>
+        <w:rPr>
+          <w:lang w:val="fr-FR" w:eastAsia="en-US"/>
+        </w:rPr>
+      </w:pPr>
+      <w:r>
+        <w:rPr>
+          <w:lang w:val="fr-FR" w:eastAsia="en-US"/>
+        </w:rPr>
+        <w:t xml:space="preserve">nombre_editions : </w:t>
+      </w:r>
+      <w:r>
+        <w:rPr>
+          <w:lang w:val="fr-FR" w:eastAsia="en-US"/>
+        </w:rPr>
+        <w:t xml:space="preserve">nombre </w:t>
+      </w:r>
+      <w:r>
+        <w:rPr>
+          <w:lang w:val="fr-FR" w:eastAsia="en-US"/>
+        </w:rPr>
+        <w:t xml:space="preserve">entier </w:t>
+      </w:r>
+    </w:p>
+    <w:p>
+      <w:pPr>
+        <w:spacing w:after="160" w:line="278" w:lineRule="auto"/>
+        <w:rPr>
+          <w:lang w:val="fr-FR" w:eastAsia="en-US"/>
+        </w:rPr>
+      </w:pPr>
+      <w:r>
+        <w:rPr>
+          <w:lang w:val="fr-FR" w:eastAsia="en-US"/>
+        </w:rPr>
+        <w:t>note_popularite : nombre (float)</w:t>
+      </w:r>
+    </w:p>
+    <w:p>
+      <w:pPr>
+        <w:spacing w:after="160" w:line="278" w:lineRule="auto"/>
+        <w:rPr>
+          <w:lang w:val="fr-FR" w:eastAsia="en-US"/>
+        </w:rPr>
+      </w:pPr>
+      <w:r>
+        <w:rPr>
+          <w:lang w:val="fr-FR" w:eastAsia="en-US"/>
+        </w:rPr>
+        <w:t>image_url : chaîne (URL</w:t>
+      </w:r>
+      <w:r>
+        <w:rPr>
+          <w:lang w:val="fr-FR" w:eastAsia="en-US"/>
+        </w:rPr>
+        <w:t xml:space="preserve"> de l’image</w:t>
+      </w:r>
+      <w:r>
+        <w:rPr>
+          <w:lang w:val="fr-FR" w:eastAsia="en-US"/>
+        </w:rPr>
+        <w:t xml:space="preserve"> de la couverture</w:t>
+      </w:r>
+      <w:r>
+        <w:rPr>
+          <w:lang w:val="fr-FR" w:eastAsia="en-US"/>
+        </w:rPr>
+        <w:t xml:space="preserve"> du livre</w:t>
+      </w:r>
+      <w:r>
+        <w:rPr>
+          <w:lang w:val="fr-FR" w:eastAsia="en-US"/>
+        </w:rPr>
+        <w:t>)</w:t>
+      </w:r>
+      <w:r>
+        <w:rPr>
+          <w:lang w:val="fr-FR" w:eastAsia="en-US"/>
+        </w:rPr>
+        <w:cr/>
+      </w:r>
       <w:r>
         <w:rPr>
           <w:lang w:val="fr-FR" w:eastAsia="en-US"/>
@@ -3450,6 +3241,42 @@
               </w:rPr>
               <w:t>Requête :</w:t>
             </w:r>
+            <w:r>
+              <w:rPr>
+                <w:lang w:val="fr-FR" w:eastAsia="en-US"/>
+              </w:rPr>
+              <w:t xml:space="preserve"> </w:t>
+            </w:r>
+            <w:r>
+              <w:rPr>
+                <w:lang w:val="fr-FR" w:eastAsia="en-US"/>
+              </w:rPr>
+              <w:t xml:space="preserve">db.Livres.find( { </w:t>
+            </w:r>
+            <w:r>
+              <w:rPr>
+                <w:lang w:val="fr-FR" w:eastAsia="en-US"/>
+              </w:rPr>
+              <w:t>auteur</w:t>
+            </w:r>
+            <w:r>
+              <w:rPr>
+                <w:lang w:val="fr-FR" w:eastAsia="en-US"/>
+              </w:rPr>
+              <w:t>: "</w:t>
+            </w:r>
+            <w:r>
+              <w:rPr>
+                <w:lang w:val="fr-FR" w:eastAsia="en-US"/>
+              </w:rPr>
+              <w:t>Stephen King</w:t>
+            </w:r>
+            <w:r>
+              <w:rPr>
+                <w:lang w:val="fr-FR" w:eastAsia="en-US"/>
+              </w:rPr>
+              <w:t>" })</w:t>
+            </w:r>
           </w:p>
           <w:p>
             <w:pPr>
@@ -3462,6 +3289,12 @@
                 <w:lang w:val="fr-FR" w:eastAsia="en-US"/>
               </w:rPr>
               <w:t>Explication :</w:t>
+            </w:r>
+            <w:r>
+              <w:rPr>
+                <w:lang w:val="fr-FR" w:eastAsia="en-US"/>
+              </w:rPr>
+              <w:t xml:space="preserve"> La requête sort tous les livres dont l’auteur est Stephen King.</w:t>
             </w:r>
           </w:p>
         </w:tc>
@@ -3507,6 +3340,18 @@
               </w:rPr>
               <w:t>Requête :</w:t>
             </w:r>
+            <w:r>
+              <w:rPr>
+                <w:lang w:val="fr-FR" w:eastAsia="en-US"/>
+              </w:rPr>
+              <w:t xml:space="preserve"> </w:t>
+            </w:r>
+            <w:r>
+              <w:rPr>
+                <w:lang w:val="fr-FR" w:eastAsia="en-US"/>
+              </w:rPr>
+              <w:t>db.Livres.find({ sous_categorie: "Romans classiques" })</w:t>
+            </w:r>
           </w:p>
           <w:p>
             <w:pPr>
@@ -3519,6 +3364,12 @@
                 <w:lang w:val="fr-FR" w:eastAsia="en-US"/>
               </w:rPr>
               <w:t>Explication :</w:t>
+            </w:r>
+            <w:r>
+              <w:rPr>
+                <w:lang w:val="fr-FR" w:eastAsia="en-US"/>
+              </w:rPr>
+              <w:t xml:space="preserve"> La requête sort tous les livres ayant comme sous-catégorie « Roman classique ».</w:t>
             </w:r>
           </w:p>
         </w:tc>
@@ -3564,6 +3415,42 @@
               </w:rPr>
               <w:t>Requête :</w:t>
             </w:r>
+            <w:r>
+              <w:rPr>
+                <w:lang w:val="fr-FR" w:eastAsia="en-US"/>
+              </w:rPr>
+              <w:t xml:space="preserve"> </w:t>
+            </w:r>
+            <w:r>
+              <w:rPr>
+                <w:lang w:val="fr-FR" w:eastAsia="en-US"/>
+              </w:rPr>
+              <w:t xml:space="preserve">db.Livres.find().sort({ </w:t>
+            </w:r>
+            <w:r>
+              <w:rPr>
+                <w:lang w:val="fr-FR" w:eastAsia="en-US"/>
+              </w:rPr>
+              <w:t>note_popularite</w:t>
+            </w:r>
+            <w:r>
+              <w:rPr>
+                <w:lang w:val="fr-FR" w:eastAsia="en-US"/>
+              </w:rPr>
+              <w:t xml:space="preserve">: </w:t>
+            </w:r>
+            <w:r>
+              <w:rPr>
+                <w:lang w:val="fr-FR" w:eastAsia="en-US"/>
+              </w:rPr>
+              <w:t>-1</w:t>
+            </w:r>
+            <w:r>
+              <w:rPr>
+                <w:lang w:val="fr-FR" w:eastAsia="en-US"/>
+              </w:rPr>
+              <w:t xml:space="preserve"> })</w:t>
+            </w:r>
           </w:p>
           <w:p>
             <w:pPr>
@@ -3576,6 +3463,12 @@
                 <w:lang w:val="fr-FR" w:eastAsia="en-US"/>
               </w:rPr>
               <w:t>Explication :</w:t>
+            </w:r>
+            <w:r>
+              <w:rPr>
+                <w:lang w:val="fr-FR" w:eastAsia="en-US"/>
+              </w:rPr>
+              <w:t xml:space="preserve"> La requête trie les livres du plus populaire au moins populaire.</w:t>
             </w:r>
           </w:p>
         </w:tc>
@@ -3742,7 +3635,6 @@
         </w:rPr>
       </w:pPr>
       <w:bookmarkStart w:id="9" w:name="_Toc211255954"/>
-      <w:proofErr w:type="spellStart"/>
       <w:r>
         <w:rPr>
           <w:lang w:val="fr-FR" w:eastAsia="en-US"/>
@@ -3750,7 +3642,6 @@
         <w:t>Scrapy</w:t>
       </w:r>
       <w:bookmarkEnd w:id="9"/>
-      <w:proofErr w:type="spellEnd"/>
       <w:r>
         <w:rPr>
           <w:lang w:val="fr-FR" w:eastAsia="en-US"/>
@@ -3764,76 +3655,18 @@
           <w:lang w:val="fr-FR" w:eastAsia="en-US"/>
         </w:rPr>
       </w:pPr>
-      <w:proofErr w:type="spellStart"/>
-      <w:r>
-        <w:rPr>
-          <w:lang w:val="fr-FR" w:eastAsia="en-US"/>
-        </w:rPr>
-        <w:t>Scrapy</w:t>
-      </w:r>
-      <w:proofErr w:type="spellEnd"/>
-      <w:r>
-        <w:rPr>
-          <w:lang w:val="fr-FR" w:eastAsia="en-US"/>
-        </w:rPr>
-        <w:t xml:space="preserve"> a quand même été facile à utiliser, surtout parce qu’il y a beaucoup de documentation. Il y a quand même eu quelques défis, au début nous avions choisi le site Best </w:t>
-      </w:r>
-      <w:proofErr w:type="spellStart"/>
-      <w:r>
-        <w:rPr>
-          <w:lang w:val="fr-FR" w:eastAsia="en-US"/>
-        </w:rPr>
-        <w:t>Buy</w:t>
-      </w:r>
-      <w:proofErr w:type="spellEnd"/>
-      <w:r>
-        <w:rPr>
-          <w:lang w:val="fr-FR" w:eastAsia="en-US"/>
-        </w:rPr>
-        <w:t xml:space="preserve">, mais Best </w:t>
-      </w:r>
-      <w:proofErr w:type="spellStart"/>
-      <w:r>
-        <w:rPr>
-          <w:lang w:val="fr-FR" w:eastAsia="en-US"/>
-        </w:rPr>
-        <w:t>Buy</w:t>
-      </w:r>
-      <w:proofErr w:type="spellEnd"/>
-      <w:r>
-        <w:rPr>
-          <w:lang w:val="fr-FR" w:eastAsia="en-US"/>
-        </w:rPr>
-        <w:t xml:space="preserve"> bloque ce genre d’outil, donc j’ai essayé de contourner les protections avec </w:t>
-      </w:r>
-      <w:proofErr w:type="spellStart"/>
-      <w:r>
-        <w:rPr>
-          <w:lang w:val="fr-FR" w:eastAsia="en-US"/>
-        </w:rPr>
-        <w:t>Playwright</w:t>
-      </w:r>
-      <w:proofErr w:type="spellEnd"/>
-      <w:r>
-        <w:rPr>
-          <w:lang w:val="fr-FR" w:eastAsia="en-US"/>
-        </w:rPr>
-        <w:t xml:space="preserve">, mais même après plus d’une heure, je n’étais pas en mesure de ramasser aucune donnée (à cause des protections et du fait que les informations sont chargées avec du JavaScript et non du HTML). J’ai donc décidé de changer de site, pour en utiliser un moins protégé et qui utilisait moins de JS. Je suis tombé sur le site </w:t>
-      </w:r>
-      <w:r>
-        <w:rPr>
-          <w:lang w:val="fr-FR" w:eastAsia="en-US"/>
-        </w:rPr>
-        <w:t xml:space="preserve">Open </w:t>
-      </w:r>
-      <w:proofErr w:type="spellStart"/>
-      <w:r>
-        <w:rPr>
-          <w:lang w:val="fr-FR" w:eastAsia="en-US"/>
-        </w:rPr>
-        <w:t>library</w:t>
-      </w:r>
-      <w:proofErr w:type="spellEnd"/>
+      <w:r>
+        <w:rPr>
+          <w:lang w:val="fr-FR" w:eastAsia="en-US"/>
+        </w:rPr>
+        <w:t xml:space="preserve">Scrapy a quand même été facile à utiliser, surtout parce qu’il y a beaucoup de documentation. Il y a quand même eu quelques défis, au début nous avions choisi le site Best Buy, mais Best Buy bloque ce genre d’outil, donc j’ai essayé de contourner les protections avec Playwright, mais même après plus d’une heure, je n’étais pas en mesure de ramasser aucune donnée (à cause des protections et du fait que les informations sont chargées avec du JavaScript et non du HTML). J’ai donc décidé de changer de site, pour en utiliser un moins protégé et qui utilisait moins de JS. Je suis tombé sur le site </w:t>
+      </w:r>
+      <w:r>
+        <w:rPr>
+          <w:lang w:val="fr-FR" w:eastAsia="en-US"/>
+        </w:rPr>
+        <w:t>Open library</w:t>
+      </w:r>
       <w:r>
         <w:rPr>
           <w:lang w:val="fr-FR" w:eastAsia="en-US"/>
@@ -3844,21 +3677,7 @@
         <w:rPr>
           <w:lang w:val="fr-FR" w:eastAsia="en-US"/>
         </w:rPr>
-        <w:t xml:space="preserve">qui ne bloque pas les outils comme </w:t>
-      </w:r>
-      <w:proofErr w:type="spellStart"/>
-      <w:r>
-        <w:rPr>
-          <w:lang w:val="fr-FR" w:eastAsia="en-US"/>
-        </w:rPr>
-        <w:t>Scrapy</w:t>
-      </w:r>
-      <w:proofErr w:type="spellEnd"/>
-      <w:r>
-        <w:rPr>
-          <w:lang w:val="fr-FR" w:eastAsia="en-US"/>
-        </w:rPr>
-        <w:t xml:space="preserve"> et qui utilise peu de JavaScript</w:t>
+        <w:t>qui ne bloque pas les outils comme Scrapy et qui utilise peu de JavaScript</w:t>
       </w:r>
       <w:r>
         <w:rPr>
@@ -3882,21 +3701,7 @@
         <w:rPr>
           <w:lang w:val="fr-FR" w:eastAsia="en-US"/>
         </w:rPr>
-        <w:t xml:space="preserve">Ensuite, même si je donnais l’URL du site en français, les données recueillies étaient en anglais, mais </w:t>
-      </w:r>
-      <w:proofErr w:type="spellStart"/>
-      <w:r>
-        <w:rPr>
-          <w:lang w:val="fr-FR" w:eastAsia="en-US"/>
-        </w:rPr>
-        <w:t>Scrapy</w:t>
-      </w:r>
-      <w:proofErr w:type="spellEnd"/>
-      <w:r>
-        <w:rPr>
-          <w:lang w:val="fr-FR" w:eastAsia="en-US"/>
-        </w:rPr>
-        <w:t xml:space="preserve"> </w:t>
+        <w:t xml:space="preserve">Ensuite, même si je donnais l’URL du site en français, les données recueillies étaient en anglais, mais Scrapy </w:t>
       </w:r>
       <w:r>
         <w:rPr>
@@ -3948,21 +3753,7 @@
         <w:rPr>
           <w:lang w:val="fr-FR" w:eastAsia="en-US"/>
         </w:rPr>
-        <w:t xml:space="preserve">Donc pour le projet, j’ai eu quelques problèmes, mais avec un site plus accessible, </w:t>
-      </w:r>
-      <w:proofErr w:type="spellStart"/>
-      <w:r>
-        <w:rPr>
-          <w:lang w:val="fr-FR" w:eastAsia="en-US"/>
-        </w:rPr>
-        <w:t>Scrapy</w:t>
-      </w:r>
-      <w:proofErr w:type="spellEnd"/>
-      <w:r>
-        <w:rPr>
-          <w:lang w:val="fr-FR" w:eastAsia="en-US"/>
-        </w:rPr>
-        <w:t xml:space="preserve"> est facile à utiliser et beaucoup de choses sont possibles avec l’outil.</w:t>
+        <w:t>Donc pour le projet, j’ai eu quelques problèmes, mais avec un site plus accessible, Scrapy est facile à utiliser et beaucoup de choses sont possibles avec l’outil.</w:t>
       </w:r>
     </w:p>
     <w:p>
@@ -4143,19 +3934,7 @@
               <w:rPr>
                 <w:lang w:val="fr-FR" w:eastAsia="en-US"/>
               </w:rPr>
-              <w:t>Création</w:t>
-            </w:r>
-            <w:r>
-              <w:rPr>
-                <w:lang w:val="fr-FR" w:eastAsia="en-US"/>
-              </w:rPr>
-              <w:t xml:space="preserve"> et rédaction</w:t>
-            </w:r>
-            <w:r>
-              <w:rPr>
-                <w:lang w:val="fr-FR" w:eastAsia="en-US"/>
-              </w:rPr>
-              <w:t xml:space="preserve"> du </w:t>
+              <w:t xml:space="preserve">Création du </w:t>
             </w:r>
             <w:r>
               <w:rPr>
@@ -4309,7 +4088,7 @@
           <w:p>
             <w:pPr>
               <w:rPr>
-                <w:lang w:val="fr-FR" w:eastAsia="en-US"/>
+                <w:lang w:eastAsia="en-US"/>
               </w:rPr>
             </w:pPr>
             <w:r>
@@ -4321,6 +4100,38 @@
             <w:r>
               <w:rPr>
                 <w:lang w:eastAsia="en-US"/>
+              </w:rPr>
+              <w:tab/>
+            </w:r>
+          </w:p>
+          <w:p>
+            <w:pPr>
+              <w:rPr>
+                <w:lang w:val="fr-FR" w:eastAsia="en-US"/>
+              </w:rPr>
+            </w:pPr>
+            <w:r>
+              <w:rPr>
+                <w:lang w:val="fr-FR" w:eastAsia="en-US"/>
+              </w:rPr>
+              <w:t>Production de 3 requêtes de sélection (find)</w:t>
+            </w:r>
+          </w:p>
+          <w:p>
+            <w:pPr>
+              <w:rPr>
+                <w:lang w:val="fr-FR" w:eastAsia="en-US"/>
+              </w:rPr>
+            </w:pPr>
+            <w:r>
+              <w:rPr>
+                <w:lang w:val="fr-FR" w:eastAsia="en-US"/>
+              </w:rPr>
+              <w:t>Schéma des documents dans la collection</w:t>
+            </w:r>
+            <w:r>
+              <w:rPr>
+                <w:lang w:val="fr-FR" w:eastAsia="en-US"/>
               </w:rPr>
               <w:tab/>
             </w:r>
@@ -4409,27 +4220,13 @@
               <w:rPr>
                 <w:lang w:val="fr-FR" w:eastAsia="en-US"/>
               </w:rPr>
-              <w:t xml:space="preserve">Recherche de l’outil de </w:t>
-            </w:r>
-            <w:proofErr w:type="spellStart"/>
-            <w:r>
-              <w:rPr>
-                <w:lang w:val="fr-FR" w:eastAsia="en-US"/>
-              </w:rPr>
-              <w:t>webscraping</w:t>
-            </w:r>
-            <w:proofErr w:type="spellEnd"/>
+              <w:t>Recherche de l’outil de webscraping</w:t>
+            </w:r>
             <w:r>
               <w:rPr>
                 <w:lang w:val="fr-FR" w:eastAsia="en-US"/>
               </w:rPr>
               <w:t xml:space="preserve"> </w:t>
-            </w:r>
-            <w:r>
-              <w:rPr>
-                <w:lang w:val="fr-FR" w:eastAsia="en-US"/>
-              </w:rPr>
-              <w:tab/>
             </w:r>
             <w:r>
               <w:rPr>
@@ -4448,34 +4245,7 @@
               <w:rPr>
                 <w:lang w:val="fr-FR" w:eastAsia="en-US"/>
               </w:rPr>
-              <w:t>Production de 3 requêtes de sélection (</w:t>
-            </w:r>
-            <w:proofErr w:type="spellStart"/>
-            <w:r>
-              <w:rPr>
-                <w:lang w:val="fr-FR" w:eastAsia="en-US"/>
-              </w:rPr>
-              <w:t>find</w:t>
-            </w:r>
-            <w:proofErr w:type="spellEnd"/>
-            <w:r>
-              <w:rPr>
-                <w:lang w:val="fr-FR" w:eastAsia="en-US"/>
-              </w:rPr>
-              <w:t>)</w:t>
-            </w:r>
-          </w:p>
-          <w:p>
-            <w:pPr>
-              <w:rPr>
-                <w:lang w:val="fr-FR" w:eastAsia="en-US"/>
-              </w:rPr>
-            </w:pPr>
-            <w:r>
-              <w:rPr>
-                <w:lang w:val="fr-FR" w:eastAsia="en-US"/>
-              </w:rPr>
-              <w:t>Schéma des documents dans la collection</w:t>
+              <w:t>Rédaction du rapport</w:t>
             </w:r>
             <w:r>
               <w:rPr>
@@ -4552,6 +4322,9 @@
         <w:spacing w:after="0"/>
       </w:pPr>
       <w:r>
+        <w:rPr>
+          <w:noProof/>
+        </w:rPr>
         <w:drawing>
           <wp:inline distT="0" distB="0" distL="0" distR="0" wp14:anchorId="7B4BFB08" wp14:editId="2CEA5599">
             <wp:extent cx="5696745" cy="2781688"/>
@@ -4595,6 +4368,9 @@
         <w:spacing w:after="0"/>
       </w:pPr>
       <w:r>
+        <w:rPr>
+          <w:noProof/>
+        </w:rPr>
         <w:drawing>
           <wp:inline distT="0" distB="0" distL="0" distR="0" wp14:anchorId="731C5383" wp14:editId="7B52EA1F">
             <wp:extent cx="5700382" cy="913765"/>
@@ -6739,7 +6515,6 @@
   <w:style w:type="character" w:default="1" w:styleId="Policepardfaut">
     <w:name w:val="Default Paragraph Font"/>
     <w:uiPriority w:val="1"/>
-    <w:semiHidden/>
     <w:unhideWhenUsed/>
   </w:style>
   <w:style w:type="table" w:default="1" w:styleId="TableauNormal">

</xml_diff>

<commit_message>
Ajout du lien mongoDB
</commit_message>
<xml_diff>
--- a/remise2.docx
+++ b/remise2.docx
@@ -1668,8 +1668,16 @@
         <w:rPr>
           <w:lang w:val="fr-FR" w:eastAsia="en-US"/>
         </w:rPr>
-        <w:t>Open library</w:t>
-      </w:r>
+        <w:t xml:space="preserve">Open </w:t>
+      </w:r>
+      <w:proofErr w:type="spellStart"/>
+      <w:r>
+        <w:rPr>
+          <w:lang w:val="fr-FR" w:eastAsia="en-US"/>
+        </w:rPr>
+        <w:t>library</w:t>
+      </w:r>
+      <w:proofErr w:type="spellEnd"/>
       <w:r>
         <w:rPr>
           <w:lang w:val="fr-FR" w:eastAsia="en-US"/>
@@ -1752,7 +1760,21 @@
         <w:rPr>
           <w:lang w:val="fr-FR"/>
         </w:rPr>
-        <w:t>Outil de webscraping utilisé</w:t>
+        <w:t xml:space="preserve">Outil de </w:t>
+      </w:r>
+      <w:proofErr w:type="spellStart"/>
+      <w:r>
+        <w:rPr>
+          <w:lang w:val="fr-FR"/>
+        </w:rPr>
+        <w:t>webscraping</w:t>
+      </w:r>
+      <w:proofErr w:type="spellEnd"/>
+      <w:r>
+        <w:rPr>
+          <w:lang w:val="fr-FR"/>
+        </w:rPr>
+        <w:t xml:space="preserve"> utilisé</w:t>
       </w:r>
       <w:bookmarkEnd w:id="1"/>
     </w:p>
@@ -1774,7 +1796,21 @@
         <w:rPr>
           <w:lang w:val="fr-FR" w:eastAsia="en-US"/>
         </w:rPr>
-        <w:t xml:space="preserve"> Scrapy </w:t>
+        <w:t xml:space="preserve"> </w:t>
+      </w:r>
+      <w:proofErr w:type="spellStart"/>
+      <w:r>
+        <w:rPr>
+          <w:lang w:val="fr-FR" w:eastAsia="en-US"/>
+        </w:rPr>
+        <w:t>Scrapy</w:t>
+      </w:r>
+      <w:proofErr w:type="spellEnd"/>
+      <w:r>
+        <w:rPr>
+          <w:lang w:val="fr-FR" w:eastAsia="en-US"/>
+        </w:rPr>
+        <w:t xml:space="preserve"> </w:t>
       </w:r>
     </w:p>
     <w:p>
@@ -1863,8 +1899,16 @@
         <w:rPr>
           <w:lang w:val="fr-FR"/>
         </w:rPr>
-        <w:t>Création d’un projet Scrapy</w:t>
-      </w:r>
+        <w:t xml:space="preserve">Création d’un projet </w:t>
+      </w:r>
+      <w:proofErr w:type="spellStart"/>
+      <w:r>
+        <w:rPr>
+          <w:lang w:val="fr-FR"/>
+        </w:rPr>
+        <w:t>Scrapy</w:t>
+      </w:r>
+      <w:proofErr w:type="spellEnd"/>
     </w:p>
     <w:p>
       <w:pPr>
@@ -1883,19 +1927,43 @@
         </w:rPr>
         <w:t>Exécution d’un « </w:t>
       </w:r>
+      <w:proofErr w:type="spellStart"/>
       <w:r>
         <w:rPr>
           <w:i/>
           <w:iCs/>
           <w:lang w:val="fr-FR"/>
         </w:rPr>
-        <w:t>Scrapy spider</w:t>
-      </w:r>
-      <w:r>
-        <w:rPr>
-          <w:lang w:val="fr-FR"/>
-        </w:rPr>
-        <w:t> »  (pour récupérer les données du site)</w:t>
+        <w:t>Scrapy</w:t>
+      </w:r>
+      <w:proofErr w:type="spellEnd"/>
+      <w:r>
+        <w:rPr>
+          <w:i/>
+          <w:iCs/>
+          <w:lang w:val="fr-FR"/>
+        </w:rPr>
+        <w:t xml:space="preserve"> spider</w:t>
+      </w:r>
+      <w:r>
+        <w:rPr>
+          <w:lang w:val="fr-FR"/>
+        </w:rPr>
+        <w:t> </w:t>
+      </w:r>
+      <w:proofErr w:type="gramStart"/>
+      <w:r>
+        <w:rPr>
+          <w:lang w:val="fr-FR"/>
+        </w:rPr>
+        <w:t>»  (</w:t>
+      </w:r>
+      <w:proofErr w:type="gramEnd"/>
+      <w:r>
+        <w:rPr>
+          <w:lang w:val="fr-FR"/>
+        </w:rPr>
+        <w:t>pour récupérer les données du site)</w:t>
       </w:r>
     </w:p>
     <w:p>
@@ -1913,7 +1981,21 @@
         <w:rPr>
           <w:lang w:val="fr-FR"/>
         </w:rPr>
-        <w:t>Exporter les données récupérées  (format JSON, CSV</w:t>
+        <w:t xml:space="preserve">Exporter les données </w:t>
+      </w:r>
+      <w:proofErr w:type="gramStart"/>
+      <w:r>
+        <w:rPr>
+          <w:lang w:val="fr-FR"/>
+        </w:rPr>
+        <w:t>récupérées  (</w:t>
+      </w:r>
+      <w:proofErr w:type="gramEnd"/>
+      <w:r>
+        <w:rPr>
+          <w:lang w:val="fr-FR"/>
+        </w:rPr>
+        <w:t>format JSON, CSV</w:t>
       </w:r>
       <w:r>
         <w:rPr>
@@ -1945,74 +2027,99 @@
         </w:rPr>
         <w:t>Utiliser « </w:t>
       </w:r>
+      <w:proofErr w:type="spellStart"/>
       <w:r>
         <w:rPr>
           <w:i/>
           <w:iCs/>
           <w:lang w:val="fr-FR"/>
         </w:rPr>
-        <w:t>Scrapy Shell</w:t>
-      </w:r>
-      <w:r>
-        <w:rPr>
-          <w:lang w:val="fr-FR"/>
-        </w:rPr>
-        <w:t xml:space="preserve"> »  (pour tester et débugger la logique </w:t>
-      </w:r>
+        <w:t>Scrapy</w:t>
+      </w:r>
+      <w:proofErr w:type="spellEnd"/>
       <w:r>
         <w:rPr>
           <w:i/>
           <w:iCs/>
           <w:lang w:val="fr-FR"/>
         </w:rPr>
-        <w:t>Scraping</w:t>
-      </w:r>
-      <w:r>
-        <w:rPr>
-          <w:lang w:val="fr-FR"/>
-        </w:rPr>
-        <w:t>)</w:t>
-      </w:r>
-    </w:p>
-    <w:p>
-      <w:r>
-        <w:t xml:space="preserve">Scrapy est un </w:t>
-      </w:r>
+        <w:t xml:space="preserve"> Shell</w:t>
+      </w:r>
+      <w:r>
+        <w:rPr>
+          <w:lang w:val="fr-FR"/>
+        </w:rPr>
+        <w:t> </w:t>
+      </w:r>
+      <w:proofErr w:type="gramStart"/>
+      <w:r>
+        <w:rPr>
+          <w:lang w:val="fr-FR"/>
+        </w:rPr>
+        <w:t>»  (</w:t>
+      </w:r>
+      <w:proofErr w:type="gramEnd"/>
+      <w:r>
+        <w:rPr>
+          <w:lang w:val="fr-FR"/>
+        </w:rPr>
+        <w:t xml:space="preserve">pour tester et débugger la logique </w:t>
+      </w:r>
+      <w:proofErr w:type="spellStart"/>
       <w:r>
         <w:rPr>
           <w:i/>
           <w:iCs/>
-        </w:rPr>
-        <w:t>framework</w:t>
-      </w:r>
-      <w:r>
-        <w:t xml:space="preserve"> Python </w:t>
-      </w:r>
+          <w:lang w:val="fr-FR"/>
+        </w:rPr>
+        <w:t>Scraping</w:t>
+      </w:r>
+      <w:proofErr w:type="spellEnd"/>
+      <w:r>
+        <w:rPr>
+          <w:lang w:val="fr-FR"/>
+        </w:rPr>
+        <w:t>)</w:t>
+      </w:r>
+    </w:p>
+    <w:p>
+      <w:proofErr w:type="spellStart"/>
+      <w:r>
+        <w:t>Scrapy</w:t>
+      </w:r>
+      <w:proofErr w:type="spellEnd"/>
+      <w:r>
+        <w:t xml:space="preserve"> est un </w:t>
+      </w:r>
+      <w:proofErr w:type="spellStart"/>
       <w:r>
         <w:rPr>
           <w:i/>
           <w:iCs/>
         </w:rPr>
-        <w:t>open-source</w:t>
-      </w:r>
-      <w:r>
-        <w:t xml:space="preserve"> qui extrait des données de sites web en envoyant des requêtes HTTP, en téléchargeant le contenu des pages, en le parsant avec des sélecteurs CSS ou XPath pour en extraire les informations (utilisant les </w:t>
-      </w:r>
-      <w:r>
-        <w:t>« </w:t>
+        <w:t>framework</w:t>
+      </w:r>
+      <w:proofErr w:type="spellEnd"/>
+      <w:r>
+        <w:t xml:space="preserve"> Python </w:t>
       </w:r>
       <w:r>
         <w:rPr>
           <w:i/>
           <w:iCs/>
         </w:rPr>
-        <w:t>Spiders</w:t>
-      </w:r>
-      <w:r>
-        <w:t> »</w:t>
-      </w:r>
-      <w:r>
-        <w:t>), puis en structurant et en stockant ces données via des pipelines. Son fonctionnement est dirigé par un moteur qui coordonne les araignées (</w:t>
+        <w:t>open-source</w:t>
+      </w:r>
+      <w:r>
+        <w:t xml:space="preserve"> qui extrait des données de sites web en envoyant des requêtes HTTP, en téléchargeant le contenu des pages, en le </w:t>
+      </w:r>
+      <w:proofErr w:type="spellStart"/>
+      <w:r>
+        <w:t>parsant</w:t>
+      </w:r>
+      <w:proofErr w:type="spellEnd"/>
+      <w:r>
+        <w:t xml:space="preserve"> avec des sélecteurs CSS ou XPath pour en extraire les informations (utilisant les </w:t>
       </w:r>
       <w:r>
         <w:t>« </w:t>
@@ -2025,22 +2132,40 @@
         <w:t>Spiders</w:t>
       </w:r>
       <w:r>
+        <w:t> »</w:t>
+      </w:r>
+      <w:r>
+        <w:t>), puis en structurant et en stockant ces données via des pipelines. Son fonctionnement est dirigé par un moteur qui coordonne les araignées (</w:t>
+      </w:r>
+      <w:r>
+        <w:t>« </w:t>
+      </w:r>
+      <w:r>
         <w:rPr>
           <w:i/>
           <w:iCs/>
         </w:rPr>
-        <w:t> »</w:t>
-      </w:r>
-      <w:r>
-        <w:t xml:space="preserve">) et l'ordonnanceur pour gérer le flux de requêtes et de réponses, offrant ainsi un moyen efficace et extensible de réaliser du web </w:t>
+        <w:t>Spiders</w:t>
       </w:r>
       <w:r>
         <w:rPr>
           <w:i/>
           <w:iCs/>
         </w:rPr>
+        <w:t> »</w:t>
+      </w:r>
+      <w:r>
+        <w:t xml:space="preserve">) et l'ordonnanceur pour gérer le flux de requêtes et de réponses, offrant ainsi un moyen efficace et extensible de réaliser du web </w:t>
+      </w:r>
+      <w:proofErr w:type="spellStart"/>
+      <w:r>
+        <w:rPr>
+          <w:i/>
+          <w:iCs/>
+        </w:rPr>
         <w:t>scraping</w:t>
       </w:r>
+      <w:proofErr w:type="spellEnd"/>
       <w:r>
         <w:t xml:space="preserve"> pour des projets de toute envergure. </w:t>
       </w:r>
@@ -2108,7 +2233,25 @@
                 <w:bCs/>
                 <w:lang w:val="fr-FR" w:eastAsia="en-US"/>
               </w:rPr>
-              <w:t>Installation de Scrapy :</w:t>
+              <w:t xml:space="preserve">Installation de </w:t>
+            </w:r>
+            <w:proofErr w:type="spellStart"/>
+            <w:r>
+              <w:rPr>
+                <w:b/>
+                <w:bCs/>
+                <w:lang w:val="fr-FR" w:eastAsia="en-US"/>
+              </w:rPr>
+              <w:t>Scrapy</w:t>
+            </w:r>
+            <w:proofErr w:type="spellEnd"/>
+            <w:r>
+              <w:rPr>
+                <w:b/>
+                <w:bCs/>
+                <w:lang w:val="fr-FR" w:eastAsia="en-US"/>
+              </w:rPr>
+              <w:t> :</w:t>
             </w:r>
           </w:p>
           <w:p>
@@ -2123,12 +2266,44 @@
                 <w:lang w:val="fr-FR" w:eastAsia="en-US"/>
               </w:rPr>
             </w:pPr>
-            <w:r>
-              <w:rPr>
-                <w:lang w:val="fr-FR" w:eastAsia="en-US"/>
-              </w:rPr>
-              <w:t>pip install scrapy</w:t>
-            </w:r>
+            <w:proofErr w:type="spellStart"/>
+            <w:proofErr w:type="gramStart"/>
+            <w:r>
+              <w:rPr>
+                <w:lang w:val="fr-FR" w:eastAsia="en-US"/>
+              </w:rPr>
+              <w:t>pip</w:t>
+            </w:r>
+            <w:proofErr w:type="spellEnd"/>
+            <w:proofErr w:type="gramEnd"/>
+            <w:r>
+              <w:rPr>
+                <w:lang w:val="fr-FR" w:eastAsia="en-US"/>
+              </w:rPr>
+              <w:t xml:space="preserve"> </w:t>
+            </w:r>
+            <w:proofErr w:type="spellStart"/>
+            <w:r>
+              <w:rPr>
+                <w:lang w:val="fr-FR" w:eastAsia="en-US"/>
+              </w:rPr>
+              <w:t>install</w:t>
+            </w:r>
+            <w:proofErr w:type="spellEnd"/>
+            <w:r>
+              <w:rPr>
+                <w:lang w:val="fr-FR" w:eastAsia="en-US"/>
+              </w:rPr>
+              <w:t xml:space="preserve"> </w:t>
+            </w:r>
+            <w:proofErr w:type="spellStart"/>
+            <w:r>
+              <w:rPr>
+                <w:lang w:val="fr-FR" w:eastAsia="en-US"/>
+              </w:rPr>
+              <w:t>scrapy</w:t>
+            </w:r>
+            <w:proofErr w:type="spellEnd"/>
           </w:p>
           <w:p>
             <w:pPr>
@@ -2143,7 +2318,25 @@
                 <w:bCs/>
                 <w:lang w:val="fr-FR" w:eastAsia="en-US"/>
               </w:rPr>
-              <w:t>Dans VSCode :</w:t>
+              <w:t xml:space="preserve">Dans </w:t>
+            </w:r>
+            <w:proofErr w:type="spellStart"/>
+            <w:r>
+              <w:rPr>
+                <w:b/>
+                <w:bCs/>
+                <w:lang w:val="fr-FR" w:eastAsia="en-US"/>
+              </w:rPr>
+              <w:t>VSCode</w:t>
+            </w:r>
+            <w:proofErr w:type="spellEnd"/>
+            <w:r>
+              <w:rPr>
+                <w:b/>
+                <w:bCs/>
+                <w:lang w:val="fr-FR" w:eastAsia="en-US"/>
+              </w:rPr>
+              <w:t> :</w:t>
             </w:r>
             <w:r>
               <w:rPr>
@@ -2164,12 +2357,56 @@
                 <w:lang w:val="fr-FR" w:eastAsia="en-US"/>
               </w:rPr>
             </w:pPr>
-            <w:r>
-              <w:rPr>
-                <w:lang w:val="fr-FR" w:eastAsia="en-US"/>
-              </w:rPr>
-              <w:t>python -m scrapy startproject hl_nouvelles_technos</w:t>
-            </w:r>
+            <w:proofErr w:type="gramStart"/>
+            <w:r>
+              <w:rPr>
+                <w:lang w:val="fr-FR" w:eastAsia="en-US"/>
+              </w:rPr>
+              <w:t>python</w:t>
+            </w:r>
+            <w:proofErr w:type="gramEnd"/>
+            <w:r>
+              <w:rPr>
+                <w:lang w:val="fr-FR" w:eastAsia="en-US"/>
+              </w:rPr>
+              <w:t xml:space="preserve"> -m </w:t>
+            </w:r>
+            <w:proofErr w:type="spellStart"/>
+            <w:r>
+              <w:rPr>
+                <w:lang w:val="fr-FR" w:eastAsia="en-US"/>
+              </w:rPr>
+              <w:t>scrapy</w:t>
+            </w:r>
+            <w:proofErr w:type="spellEnd"/>
+            <w:r>
+              <w:rPr>
+                <w:lang w:val="fr-FR" w:eastAsia="en-US"/>
+              </w:rPr>
+              <w:t xml:space="preserve"> </w:t>
+            </w:r>
+            <w:proofErr w:type="spellStart"/>
+            <w:r>
+              <w:rPr>
+                <w:lang w:val="fr-FR" w:eastAsia="en-US"/>
+              </w:rPr>
+              <w:t>startproject</w:t>
+            </w:r>
+            <w:proofErr w:type="spellEnd"/>
+            <w:r>
+              <w:rPr>
+                <w:lang w:val="fr-FR" w:eastAsia="en-US"/>
+              </w:rPr>
+              <w:t xml:space="preserve"> </w:t>
+            </w:r>
+            <w:proofErr w:type="spellStart"/>
+            <w:r>
+              <w:rPr>
+                <w:lang w:val="fr-FR" w:eastAsia="en-US"/>
+              </w:rPr>
+              <w:t>hl_nouvelles_technos</w:t>
+            </w:r>
+            <w:proofErr w:type="spellEnd"/>
           </w:p>
           <w:p>
             <w:pPr>
@@ -2183,12 +2420,28 @@
                 <w:lang w:val="fr-FR" w:eastAsia="en-US"/>
               </w:rPr>
             </w:pPr>
-            <w:r>
-              <w:rPr>
-                <w:lang w:val="fr-FR" w:eastAsia="en-US"/>
-              </w:rPr>
-              <w:t>cd hl_nouvelles_technos</w:t>
-            </w:r>
+            <w:proofErr w:type="gramStart"/>
+            <w:r>
+              <w:rPr>
+                <w:lang w:val="fr-FR" w:eastAsia="en-US"/>
+              </w:rPr>
+              <w:t>cd</w:t>
+            </w:r>
+            <w:proofErr w:type="gramEnd"/>
+            <w:r>
+              <w:rPr>
+                <w:lang w:val="fr-FR" w:eastAsia="en-US"/>
+              </w:rPr>
+              <w:t xml:space="preserve"> </w:t>
+            </w:r>
+            <w:proofErr w:type="spellStart"/>
+            <w:r>
+              <w:rPr>
+                <w:lang w:val="fr-FR" w:eastAsia="en-US"/>
+              </w:rPr>
+              <w:t>hl_nouvelles_technos</w:t>
+            </w:r>
+            <w:proofErr w:type="spellEnd"/>
           </w:p>
           <w:p>
             <w:pPr>
@@ -2202,11 +2455,47 @@
                 <w:lang w:val="fr-FR" w:eastAsia="en-US"/>
               </w:rPr>
             </w:pPr>
-            <w:r>
-              <w:rPr>
-                <w:lang w:val="fr-FR" w:eastAsia="en-US"/>
-              </w:rPr>
-              <w:t xml:space="preserve">python -m scrapy genspider </w:t>
+            <w:proofErr w:type="gramStart"/>
+            <w:r>
+              <w:rPr>
+                <w:lang w:val="fr-FR" w:eastAsia="en-US"/>
+              </w:rPr>
+              <w:t>python</w:t>
+            </w:r>
+            <w:proofErr w:type="gramEnd"/>
+            <w:r>
+              <w:rPr>
+                <w:lang w:val="fr-FR" w:eastAsia="en-US"/>
+              </w:rPr>
+              <w:t xml:space="preserve"> -m </w:t>
+            </w:r>
+            <w:proofErr w:type="spellStart"/>
+            <w:r>
+              <w:rPr>
+                <w:lang w:val="fr-FR" w:eastAsia="en-US"/>
+              </w:rPr>
+              <w:t>scrapy</w:t>
+            </w:r>
+            <w:proofErr w:type="spellEnd"/>
+            <w:r>
+              <w:rPr>
+                <w:lang w:val="fr-FR" w:eastAsia="en-US"/>
+              </w:rPr>
+              <w:t xml:space="preserve"> </w:t>
+            </w:r>
+            <w:proofErr w:type="spellStart"/>
+            <w:r>
+              <w:rPr>
+                <w:lang w:val="fr-FR" w:eastAsia="en-US"/>
+              </w:rPr>
+              <w:t>genspider</w:t>
+            </w:r>
+            <w:proofErr w:type="spellEnd"/>
+            <w:r>
+              <w:rPr>
+                <w:lang w:val="fr-FR" w:eastAsia="en-US"/>
+              </w:rPr>
+              <w:t xml:space="preserve"> </w:t>
             </w:r>
             <w:r>
               <w:rPr>
@@ -2298,11 +2587,33 @@
                 <w:lang w:val="fr-FR" w:eastAsia="en-US"/>
               </w:rPr>
             </w:pPr>
-            <w:r>
-              <w:rPr>
-                <w:lang w:val="fr-FR" w:eastAsia="en-US"/>
-              </w:rPr>
-              <w:t xml:space="preserve">python -m scrapy crawl </w:t>
+            <w:proofErr w:type="gramStart"/>
+            <w:r>
+              <w:rPr>
+                <w:lang w:val="fr-FR" w:eastAsia="en-US"/>
+              </w:rPr>
+              <w:t>python</w:t>
+            </w:r>
+            <w:proofErr w:type="gramEnd"/>
+            <w:r>
+              <w:rPr>
+                <w:lang w:val="fr-FR" w:eastAsia="en-US"/>
+              </w:rPr>
+              <w:t xml:space="preserve"> -m </w:t>
+            </w:r>
+            <w:proofErr w:type="spellStart"/>
+            <w:r>
+              <w:rPr>
+                <w:lang w:val="fr-FR" w:eastAsia="en-US"/>
+              </w:rPr>
+              <w:t>scrapy</w:t>
+            </w:r>
+            <w:proofErr w:type="spellEnd"/>
+            <w:r>
+              <w:rPr>
+                <w:lang w:val="fr-FR" w:eastAsia="en-US"/>
+              </w:rPr>
+              <w:t xml:space="preserve"> crawl </w:t>
             </w:r>
             <w:r>
               <w:rPr>
@@ -2316,6 +2627,8 @@
               </w:rPr>
               <w:t xml:space="preserve"> -O </w:t>
             </w:r>
+            <w:proofErr w:type="spellStart"/>
+            <w:proofErr w:type="gramStart"/>
             <w:r>
               <w:rPr>
                 <w:lang w:val="fr-FR" w:eastAsia="en-US"/>
@@ -2328,6 +2641,8 @@
               </w:rPr>
               <w:t>.json</w:t>
             </w:r>
+            <w:proofErr w:type="spellEnd"/>
+            <w:proofErr w:type="gramEnd"/>
           </w:p>
           <w:p>
             <w:pPr>
@@ -2442,11 +2757,49 @@
                 <w:lang w:val="fr-FR" w:eastAsia="en-US"/>
               </w:rPr>
             </w:pPr>
-            <w:r>
-              <w:rPr>
-                <w:lang w:val="fr-FR" w:eastAsia="en-US"/>
-              </w:rPr>
-              <w:t>pip install deep-translator</w:t>
+            <w:proofErr w:type="spellStart"/>
+            <w:proofErr w:type="gramStart"/>
+            <w:r>
+              <w:rPr>
+                <w:lang w:val="fr-FR" w:eastAsia="en-US"/>
+              </w:rPr>
+              <w:t>pip</w:t>
+            </w:r>
+            <w:proofErr w:type="spellEnd"/>
+            <w:proofErr w:type="gramEnd"/>
+            <w:r>
+              <w:rPr>
+                <w:lang w:val="fr-FR" w:eastAsia="en-US"/>
+              </w:rPr>
+              <w:t xml:space="preserve"> </w:t>
+            </w:r>
+            <w:proofErr w:type="spellStart"/>
+            <w:r>
+              <w:rPr>
+                <w:lang w:val="fr-FR" w:eastAsia="en-US"/>
+              </w:rPr>
+              <w:t>install</w:t>
+            </w:r>
+            <w:proofErr w:type="spellEnd"/>
+            <w:r>
+              <w:rPr>
+                <w:lang w:val="fr-FR" w:eastAsia="en-US"/>
+              </w:rPr>
+              <w:t xml:space="preserve"> </w:t>
+            </w:r>
+            <w:proofErr w:type="spellStart"/>
+            <w:r>
+              <w:rPr>
+                <w:lang w:val="fr-FR" w:eastAsia="en-US"/>
+              </w:rPr>
+              <w:t>deep</w:t>
+            </w:r>
+            <w:proofErr w:type="spellEnd"/>
+            <w:r>
+              <w:rPr>
+                <w:lang w:val="fr-FR" w:eastAsia="en-US"/>
+              </w:rPr>
+              <w:t>-translator</w:t>
             </w:r>
           </w:p>
           <w:p>
@@ -2583,7 +2936,25 @@
                 <w:bCs/>
                 <w:lang w:val="fr-FR" w:eastAsia="en-US"/>
               </w:rPr>
-              <w:t>Dans VSCode :</w:t>
+              <w:t xml:space="preserve">Dans </w:t>
+            </w:r>
+            <w:proofErr w:type="spellStart"/>
+            <w:r>
+              <w:rPr>
+                <w:b/>
+                <w:bCs/>
+                <w:lang w:val="fr-FR" w:eastAsia="en-US"/>
+              </w:rPr>
+              <w:t>VSCode</w:t>
+            </w:r>
+            <w:proofErr w:type="spellEnd"/>
+            <w:r>
+              <w:rPr>
+                <w:b/>
+                <w:bCs/>
+                <w:lang w:val="fr-FR" w:eastAsia="en-US"/>
+              </w:rPr>
+              <w:t> :</w:t>
             </w:r>
             <w:r>
               <w:rPr>
@@ -2604,12 +2975,36 @@
                 <w:lang w:val="fr-FR" w:eastAsia="en-US"/>
               </w:rPr>
             </w:pPr>
-            <w:r>
-              <w:rPr>
-                <w:lang w:val="fr-FR" w:eastAsia="en-US"/>
-              </w:rPr>
-              <w:t xml:space="preserve">python -m scrapy crawl hl_projet2 -o </w:t>
-            </w:r>
+            <w:proofErr w:type="gramStart"/>
+            <w:r>
+              <w:rPr>
+                <w:lang w:val="fr-FR" w:eastAsia="en-US"/>
+              </w:rPr>
+              <w:t>python</w:t>
+            </w:r>
+            <w:proofErr w:type="gramEnd"/>
+            <w:r>
+              <w:rPr>
+                <w:lang w:val="fr-FR" w:eastAsia="en-US"/>
+              </w:rPr>
+              <w:t xml:space="preserve"> -m </w:t>
+            </w:r>
+            <w:proofErr w:type="spellStart"/>
+            <w:r>
+              <w:rPr>
+                <w:lang w:val="fr-FR" w:eastAsia="en-US"/>
+              </w:rPr>
+              <w:t>scrapy</w:t>
+            </w:r>
+            <w:proofErr w:type="spellEnd"/>
+            <w:r>
+              <w:rPr>
+                <w:lang w:val="fr-FR" w:eastAsia="en-US"/>
+              </w:rPr>
+              <w:t xml:space="preserve"> crawl hl_projet2 -o </w:t>
+            </w:r>
+            <w:proofErr w:type="spellStart"/>
+            <w:proofErr w:type="gramStart"/>
             <w:r>
               <w:rPr>
                 <w:lang w:val="fr-FR" w:eastAsia="en-US"/>
@@ -2622,6 +3017,8 @@
               </w:rPr>
               <w:t>.json</w:t>
             </w:r>
+            <w:proofErr w:type="spellEnd"/>
+            <w:proofErr w:type="gramEnd"/>
           </w:p>
           <w:p>
             <w:pPr>
@@ -2669,11 +3066,19 @@
                 <w:lang w:val="fr-FR" w:eastAsia="en-US"/>
               </w:rPr>
             </w:pPr>
-            <w:r>
-              <w:rPr>
-                <w:lang w:val="fr-FR" w:eastAsia="en-US"/>
-              </w:rPr>
-              <w:t>Scrape une dizaine de données</w:t>
+            <w:proofErr w:type="spellStart"/>
+            <w:r>
+              <w:rPr>
+                <w:lang w:val="fr-FR" w:eastAsia="en-US"/>
+              </w:rPr>
+              <w:t>Scrape</w:t>
+            </w:r>
+            <w:proofErr w:type="spellEnd"/>
+            <w:r>
+              <w:rPr>
+                <w:lang w:val="fr-FR" w:eastAsia="en-US"/>
+              </w:rPr>
+              <w:t xml:space="preserve"> une dizaine de données</w:t>
             </w:r>
             <w:r>
               <w:rPr>
@@ -2685,8 +3090,24 @@
               <w:rPr>
                 <w:lang w:val="fr-FR" w:eastAsia="en-US"/>
               </w:rPr>
-              <w:t xml:space="preserve">python -m scrapy crawl hl_projet2 -o </w:t>
-            </w:r>
+              <w:t xml:space="preserve">python -m </w:t>
+            </w:r>
+            <w:proofErr w:type="spellStart"/>
+            <w:r>
+              <w:rPr>
+                <w:lang w:val="fr-FR" w:eastAsia="en-US"/>
+              </w:rPr>
+              <w:t>scrapy</w:t>
+            </w:r>
+            <w:proofErr w:type="spellEnd"/>
+            <w:r>
+              <w:rPr>
+                <w:lang w:val="fr-FR" w:eastAsia="en-US"/>
+              </w:rPr>
+              <w:t xml:space="preserve"> crawl hl_projet2 -o </w:t>
+            </w:r>
+            <w:proofErr w:type="spellStart"/>
+            <w:proofErr w:type="gramStart"/>
             <w:r>
               <w:rPr>
                 <w:lang w:val="fr-FR" w:eastAsia="en-US"/>
@@ -2699,6 +3120,8 @@
               </w:rPr>
               <w:t>.json</w:t>
             </w:r>
+            <w:proofErr w:type="spellEnd"/>
+            <w:proofErr w:type="gramEnd"/>
             <w:r>
               <w:rPr>
                 <w:lang w:val="fr-FR" w:eastAsia="en-US"/>
@@ -2741,7 +3164,21 @@
               <w:rPr>
                 <w:lang w:val="fr-FR" w:eastAsia="en-US"/>
               </w:rPr>
-              <w:t>Quelques modifications pour faciliter l’import dans MondoBD Atlas</w:t>
+              <w:t xml:space="preserve">Quelques modifications pour faciliter l’import dans </w:t>
+            </w:r>
+            <w:proofErr w:type="spellStart"/>
+            <w:r>
+              <w:rPr>
+                <w:lang w:val="fr-FR" w:eastAsia="en-US"/>
+              </w:rPr>
+              <w:t>MondoBD</w:t>
+            </w:r>
+            <w:proofErr w:type="spellEnd"/>
+            <w:r>
+              <w:rPr>
+                <w:lang w:val="fr-FR" w:eastAsia="en-US"/>
+              </w:rPr>
+              <w:t xml:space="preserve"> Atlas</w:t>
             </w:r>
           </w:p>
           <w:p>
@@ -2774,11 +3211,19 @@
                 <w:lang w:val="fr-FR" w:eastAsia="en-US"/>
               </w:rPr>
             </w:pPr>
-            <w:r>
-              <w:rPr>
-                <w:lang w:val="fr-FR" w:eastAsia="en-US"/>
-              </w:rPr>
-              <w:t>Scrape 2500 données</w:t>
+            <w:proofErr w:type="spellStart"/>
+            <w:r>
+              <w:rPr>
+                <w:lang w:val="fr-FR" w:eastAsia="en-US"/>
+              </w:rPr>
+              <w:t>Scrape</w:t>
+            </w:r>
+            <w:proofErr w:type="spellEnd"/>
+            <w:r>
+              <w:rPr>
+                <w:lang w:val="fr-FR" w:eastAsia="en-US"/>
+              </w:rPr>
+              <w:t xml:space="preserve"> 2500 données</w:t>
             </w:r>
             <w:r>
               <w:rPr>
@@ -2803,7 +3248,21 @@
               <w:rPr>
                 <w:lang w:val="fr-FR" w:eastAsia="en-US"/>
               </w:rPr>
-              <w:t>Fichier json -&gt; csv</w:t>
+              <w:t xml:space="preserve">Fichier </w:t>
+            </w:r>
+            <w:proofErr w:type="spellStart"/>
+            <w:r>
+              <w:rPr>
+                <w:lang w:val="fr-FR" w:eastAsia="en-US"/>
+              </w:rPr>
+              <w:t>json</w:t>
+            </w:r>
+            <w:proofErr w:type="spellEnd"/>
+            <w:r>
+              <w:rPr>
+                <w:lang w:val="fr-FR" w:eastAsia="en-US"/>
+              </w:rPr>
+              <w:t xml:space="preserve"> -&gt; csv</w:t>
             </w:r>
           </w:p>
         </w:tc>
@@ -2857,11 +3316,33 @@
           <w:lang w:val="fr-FR" w:eastAsia="en-US"/>
         </w:rPr>
       </w:pPr>
-      <w:r>
-        <w:rPr>
-          <w:lang w:val="fr-FR" w:eastAsia="en-US"/>
-        </w:rPr>
-        <w:t xml:space="preserve">Les données obtenus à partir du Scraping ont été </w:t>
+      <w:proofErr w:type="gramStart"/>
+      <w:r>
+        <w:rPr>
+          <w:lang w:val="fr-FR" w:eastAsia="en-US"/>
+        </w:rPr>
+        <w:t>Les données obtenus</w:t>
+      </w:r>
+      <w:proofErr w:type="gramEnd"/>
+      <w:r>
+        <w:rPr>
+          <w:lang w:val="fr-FR" w:eastAsia="en-US"/>
+        </w:rPr>
+        <w:t xml:space="preserve"> à partir du </w:t>
+      </w:r>
+      <w:proofErr w:type="spellStart"/>
+      <w:r>
+        <w:rPr>
+          <w:lang w:val="fr-FR" w:eastAsia="en-US"/>
+        </w:rPr>
+        <w:t>Scraping</w:t>
+      </w:r>
+      <w:proofErr w:type="spellEnd"/>
+      <w:r>
+        <w:rPr>
+          <w:lang w:val="fr-FR" w:eastAsia="en-US"/>
+        </w:rPr>
+        <w:t xml:space="preserve"> ont été </w:t>
       </w:r>
       <w:r>
         <w:rPr>
@@ -2887,11 +3368,19 @@
         </w:rPr>
         <w:t>via l’option « </w:t>
       </w:r>
-      <w:r>
-        <w:rPr>
-          <w:lang w:val="fr-FR" w:eastAsia="en-US"/>
-        </w:rPr>
-        <w:t>Add data</w:t>
+      <w:proofErr w:type="spellStart"/>
+      <w:r>
+        <w:rPr>
+          <w:lang w:val="fr-FR" w:eastAsia="en-US"/>
+        </w:rPr>
+        <w:t>Add</w:t>
+      </w:r>
+      <w:proofErr w:type="spellEnd"/>
+      <w:r>
+        <w:rPr>
+          <w:lang w:val="fr-FR" w:eastAsia="en-US"/>
+        </w:rPr>
+        <w:t xml:space="preserve"> data</w:t>
       </w:r>
       <w:r>
         <w:rPr>
@@ -2955,7 +3444,21 @@
         <w:rPr>
           <w:lang w:val="fr-FR" w:eastAsia="en-US"/>
         </w:rPr>
-        <w:t>_id : ObjectId (identifiant</w:t>
+        <w:t xml:space="preserve">_id : </w:t>
+      </w:r>
+      <w:proofErr w:type="spellStart"/>
+      <w:r>
+        <w:rPr>
+          <w:lang w:val="fr-FR" w:eastAsia="en-US"/>
+        </w:rPr>
+        <w:t>ObjectId</w:t>
+      </w:r>
+      <w:proofErr w:type="spellEnd"/>
+      <w:r>
+        <w:rPr>
+          <w:lang w:val="fr-FR" w:eastAsia="en-US"/>
+        </w:rPr>
+        <w:t xml:space="preserve"> (identifiant</w:t>
       </w:r>
       <w:r>
         <w:rPr>
@@ -2977,11 +3480,27 @@
           <w:lang w:val="fr-FR" w:eastAsia="en-US"/>
         </w:rPr>
       </w:pPr>
-      <w:r>
-        <w:rPr>
-          <w:lang w:val="fr-FR" w:eastAsia="en-US"/>
-        </w:rPr>
-        <w:t xml:space="preserve">id_livre : </w:t>
+      <w:proofErr w:type="spellStart"/>
+      <w:proofErr w:type="gramStart"/>
+      <w:r>
+        <w:rPr>
+          <w:lang w:val="fr-FR" w:eastAsia="en-US"/>
+        </w:rPr>
+        <w:t>id</w:t>
+      </w:r>
+      <w:proofErr w:type="gramEnd"/>
+      <w:r>
+        <w:rPr>
+          <w:lang w:val="fr-FR" w:eastAsia="en-US"/>
+        </w:rPr>
+        <w:t>_livre</w:t>
+      </w:r>
+      <w:proofErr w:type="spellEnd"/>
+      <w:r>
+        <w:rPr>
+          <w:lang w:val="fr-FR" w:eastAsia="en-US"/>
+        </w:rPr>
+        <w:t xml:space="preserve"> : </w:t>
       </w:r>
       <w:r>
         <w:rPr>
@@ -3003,11 +3522,19 @@
           <w:lang w:val="fr-FR" w:eastAsia="en-US"/>
         </w:rPr>
       </w:pPr>
-      <w:r>
-        <w:rPr>
-          <w:lang w:val="fr-FR" w:eastAsia="en-US"/>
-        </w:rPr>
-        <w:t xml:space="preserve">titre : chaîne de caractères </w:t>
+      <w:proofErr w:type="gramStart"/>
+      <w:r>
+        <w:rPr>
+          <w:lang w:val="fr-FR" w:eastAsia="en-US"/>
+        </w:rPr>
+        <w:t>titre</w:t>
+      </w:r>
+      <w:proofErr w:type="gramEnd"/>
+      <w:r>
+        <w:rPr>
+          <w:lang w:val="fr-FR" w:eastAsia="en-US"/>
+        </w:rPr>
+        <w:t xml:space="preserve"> : chaîne de caractères </w:t>
       </w:r>
     </w:p>
     <w:p>
@@ -3017,11 +3544,19 @@
           <w:lang w:val="fr-FR" w:eastAsia="en-US"/>
         </w:rPr>
       </w:pPr>
-      <w:r>
-        <w:rPr>
-          <w:lang w:val="fr-FR" w:eastAsia="en-US"/>
-        </w:rPr>
-        <w:t>auteur : chaîne</w:t>
+      <w:proofErr w:type="gramStart"/>
+      <w:r>
+        <w:rPr>
+          <w:lang w:val="fr-FR" w:eastAsia="en-US"/>
+        </w:rPr>
+        <w:t>auteur</w:t>
+      </w:r>
+      <w:proofErr w:type="gramEnd"/>
+      <w:r>
+        <w:rPr>
+          <w:lang w:val="fr-FR" w:eastAsia="en-US"/>
+        </w:rPr>
+        <w:t xml:space="preserve"> : chaîne</w:t>
       </w:r>
       <w:r>
         <w:rPr>
@@ -3043,11 +3578,21 @@
           <w:lang w:val="fr-FR" w:eastAsia="en-US"/>
         </w:rPr>
       </w:pPr>
-      <w:r>
-        <w:rPr>
-          <w:lang w:val="fr-FR" w:eastAsia="en-US"/>
-        </w:rPr>
-        <w:t xml:space="preserve">categorie : chaîne de caractères </w:t>
+      <w:proofErr w:type="spellStart"/>
+      <w:proofErr w:type="gramStart"/>
+      <w:r>
+        <w:rPr>
+          <w:lang w:val="fr-FR" w:eastAsia="en-US"/>
+        </w:rPr>
+        <w:t>categorie</w:t>
+      </w:r>
+      <w:proofErr w:type="spellEnd"/>
+      <w:proofErr w:type="gramEnd"/>
+      <w:r>
+        <w:rPr>
+          <w:lang w:val="fr-FR" w:eastAsia="en-US"/>
+        </w:rPr>
+        <w:t xml:space="preserve"> : chaîne de caractères </w:t>
       </w:r>
     </w:p>
     <w:p>
@@ -3057,11 +3602,27 @@
           <w:lang w:val="fr-FR" w:eastAsia="en-US"/>
         </w:rPr>
       </w:pPr>
-      <w:r>
-        <w:rPr>
-          <w:lang w:val="fr-FR" w:eastAsia="en-US"/>
-        </w:rPr>
-        <w:t>sous_categorie : tableau de chaînes</w:t>
+      <w:proofErr w:type="spellStart"/>
+      <w:proofErr w:type="gramStart"/>
+      <w:r>
+        <w:rPr>
+          <w:lang w:val="fr-FR" w:eastAsia="en-US"/>
+        </w:rPr>
+        <w:t>sous</w:t>
+      </w:r>
+      <w:proofErr w:type="gramEnd"/>
+      <w:r>
+        <w:rPr>
+          <w:lang w:val="fr-FR" w:eastAsia="en-US"/>
+        </w:rPr>
+        <w:t>_categorie</w:t>
+      </w:r>
+      <w:proofErr w:type="spellEnd"/>
+      <w:r>
+        <w:rPr>
+          <w:lang w:val="fr-FR" w:eastAsia="en-US"/>
+        </w:rPr>
+        <w:t xml:space="preserve"> : tableau de chaînes</w:t>
       </w:r>
       <w:r>
         <w:rPr>
@@ -3077,11 +3638,27 @@
           <w:lang w:val="fr-FR" w:eastAsia="en-US"/>
         </w:rPr>
       </w:pPr>
-      <w:r>
-        <w:rPr>
-          <w:lang w:val="fr-FR" w:eastAsia="en-US"/>
-        </w:rPr>
-        <w:t xml:space="preserve">nombre_editions : </w:t>
+      <w:proofErr w:type="spellStart"/>
+      <w:proofErr w:type="gramStart"/>
+      <w:r>
+        <w:rPr>
+          <w:lang w:val="fr-FR" w:eastAsia="en-US"/>
+        </w:rPr>
+        <w:t>nombre</w:t>
+      </w:r>
+      <w:proofErr w:type="gramEnd"/>
+      <w:r>
+        <w:rPr>
+          <w:lang w:val="fr-FR" w:eastAsia="en-US"/>
+        </w:rPr>
+        <w:t>_editions</w:t>
+      </w:r>
+      <w:proofErr w:type="spellEnd"/>
+      <w:r>
+        <w:rPr>
+          <w:lang w:val="fr-FR" w:eastAsia="en-US"/>
+        </w:rPr>
+        <w:t xml:space="preserve"> : </w:t>
       </w:r>
       <w:r>
         <w:rPr>
@@ -3103,11 +3680,41 @@
           <w:lang w:val="fr-FR" w:eastAsia="en-US"/>
         </w:rPr>
       </w:pPr>
-      <w:r>
-        <w:rPr>
-          <w:lang w:val="fr-FR" w:eastAsia="en-US"/>
-        </w:rPr>
-        <w:t>note_popularite : nombre (float)</w:t>
+      <w:proofErr w:type="spellStart"/>
+      <w:proofErr w:type="gramStart"/>
+      <w:r>
+        <w:rPr>
+          <w:lang w:val="fr-FR" w:eastAsia="en-US"/>
+        </w:rPr>
+        <w:t>note</w:t>
+      </w:r>
+      <w:proofErr w:type="gramEnd"/>
+      <w:r>
+        <w:rPr>
+          <w:lang w:val="fr-FR" w:eastAsia="en-US"/>
+        </w:rPr>
+        <w:t>_popularite</w:t>
+      </w:r>
+      <w:proofErr w:type="spellEnd"/>
+      <w:r>
+        <w:rPr>
+          <w:lang w:val="fr-FR" w:eastAsia="en-US"/>
+        </w:rPr>
+        <w:t xml:space="preserve"> : nombre (</w:t>
+      </w:r>
+      <w:proofErr w:type="spellStart"/>
+      <w:r>
+        <w:rPr>
+          <w:lang w:val="fr-FR" w:eastAsia="en-US"/>
+        </w:rPr>
+        <w:t>float</w:t>
+      </w:r>
+      <w:proofErr w:type="spellEnd"/>
+      <w:r>
+        <w:rPr>
+          <w:lang w:val="fr-FR" w:eastAsia="en-US"/>
+        </w:rPr>
+        <w:t>)</w:t>
       </w:r>
     </w:p>
     <w:p>
@@ -3117,11 +3724,27 @@
           <w:lang w:val="fr-FR" w:eastAsia="en-US"/>
         </w:rPr>
       </w:pPr>
-      <w:r>
-        <w:rPr>
-          <w:lang w:val="fr-FR" w:eastAsia="en-US"/>
-        </w:rPr>
-        <w:t>image_url : chaîne (URL</w:t>
+      <w:proofErr w:type="spellStart"/>
+      <w:proofErr w:type="gramStart"/>
+      <w:r>
+        <w:rPr>
+          <w:lang w:val="fr-FR" w:eastAsia="en-US"/>
+        </w:rPr>
+        <w:t>image</w:t>
+      </w:r>
+      <w:proofErr w:type="gramEnd"/>
+      <w:r>
+        <w:rPr>
+          <w:lang w:val="fr-FR" w:eastAsia="en-US"/>
+        </w:rPr>
+        <w:t>_url</w:t>
+      </w:r>
+      <w:proofErr w:type="spellEnd"/>
+      <w:r>
+        <w:rPr>
+          <w:lang w:val="fr-FR" w:eastAsia="en-US"/>
+        </w:rPr>
+        <w:t xml:space="preserve"> : chaîne (URL</w:t>
       </w:r>
       <w:r>
         <w:rPr>
@@ -3247,12 +3870,29 @@
               </w:rPr>
               <w:t xml:space="preserve"> </w:t>
             </w:r>
-            <w:r>
-              <w:rPr>
-                <w:lang w:val="fr-FR" w:eastAsia="en-US"/>
-              </w:rPr>
-              <w:t xml:space="preserve">db.Livres.find( { </w:t>
-            </w:r>
+            <w:proofErr w:type="spellStart"/>
+            <w:proofErr w:type="gramStart"/>
+            <w:r>
+              <w:rPr>
+                <w:lang w:val="fr-FR" w:eastAsia="en-US"/>
+              </w:rPr>
+              <w:t>db.Livres.find</w:t>
+            </w:r>
+            <w:proofErr w:type="spellEnd"/>
+            <w:r>
+              <w:rPr>
+                <w:lang w:val="fr-FR" w:eastAsia="en-US"/>
+              </w:rPr>
+              <w:t>( {</w:t>
+            </w:r>
+            <w:proofErr w:type="gramEnd"/>
+            <w:r>
+              <w:rPr>
+                <w:lang w:val="fr-FR" w:eastAsia="en-US"/>
+              </w:rPr>
+              <w:t xml:space="preserve"> </w:t>
+            </w:r>
+            <w:proofErr w:type="gramStart"/>
             <w:r>
               <w:rPr>
                 <w:lang w:val="fr-FR" w:eastAsia="en-US"/>
@@ -3263,7 +3903,14 @@
               <w:rPr>
                 <w:lang w:val="fr-FR" w:eastAsia="en-US"/>
               </w:rPr>
-              <w:t>: "</w:t>
+              <w:t>:</w:t>
+            </w:r>
+            <w:proofErr w:type="gramEnd"/>
+            <w:r>
+              <w:rPr>
+                <w:lang w:val="fr-FR" w:eastAsia="en-US"/>
+              </w:rPr>
+              <w:t xml:space="preserve"> "</w:t>
             </w:r>
             <w:r>
               <w:rPr>
@@ -3271,11 +3918,19 @@
               </w:rPr>
               <w:t>Stephen King</w:t>
             </w:r>
-            <w:r>
-              <w:rPr>
-                <w:lang w:val="fr-FR" w:eastAsia="en-US"/>
-              </w:rPr>
-              <w:t>" })</w:t>
+            <w:proofErr w:type="gramStart"/>
+            <w:r>
+              <w:rPr>
+                <w:lang w:val="fr-FR" w:eastAsia="en-US"/>
+              </w:rPr>
+              <w:t>" }</w:t>
+            </w:r>
+            <w:proofErr w:type="gramEnd"/>
+            <w:r>
+              <w:rPr>
+                <w:lang w:val="fr-FR" w:eastAsia="en-US"/>
+              </w:rPr>
+              <w:t>)</w:t>
             </w:r>
           </w:p>
           <w:p>
@@ -3346,11 +4001,69 @@
               </w:rPr>
               <w:t xml:space="preserve"> </w:t>
             </w:r>
-            <w:r>
-              <w:rPr>
-                <w:lang w:val="fr-FR" w:eastAsia="en-US"/>
-              </w:rPr>
-              <w:t>db.Livres.find({ sous_categorie: "Romans classiques" })</w:t>
+            <w:proofErr w:type="spellStart"/>
+            <w:proofErr w:type="gramStart"/>
+            <w:r>
+              <w:rPr>
+                <w:lang w:val="fr-FR" w:eastAsia="en-US"/>
+              </w:rPr>
+              <w:t>db.Livres.find</w:t>
+            </w:r>
+            <w:proofErr w:type="spellEnd"/>
+            <w:r>
+              <w:rPr>
+                <w:lang w:val="fr-FR" w:eastAsia="en-US"/>
+              </w:rPr>
+              <w:t xml:space="preserve">({ </w:t>
+            </w:r>
+            <w:proofErr w:type="spellStart"/>
+            <w:r>
+              <w:rPr>
+                <w:lang w:val="fr-FR" w:eastAsia="en-US"/>
+              </w:rPr>
+              <w:t>sous</w:t>
+            </w:r>
+            <w:proofErr w:type="gramEnd"/>
+            <w:r>
+              <w:rPr>
+                <w:lang w:val="fr-FR" w:eastAsia="en-US"/>
+              </w:rPr>
+              <w:t>_</w:t>
+            </w:r>
+            <w:proofErr w:type="gramStart"/>
+            <w:r>
+              <w:rPr>
+                <w:lang w:val="fr-FR" w:eastAsia="en-US"/>
+              </w:rPr>
+              <w:t>categorie</w:t>
+            </w:r>
+            <w:proofErr w:type="spellEnd"/>
+            <w:r>
+              <w:rPr>
+                <w:lang w:val="fr-FR" w:eastAsia="en-US"/>
+              </w:rPr>
+              <w:t>:</w:t>
+            </w:r>
+            <w:proofErr w:type="gramEnd"/>
+            <w:r>
+              <w:rPr>
+                <w:lang w:val="fr-FR" w:eastAsia="en-US"/>
+              </w:rPr>
+              <w:t xml:space="preserve"> "Romans classiques</w:t>
+            </w:r>
+            <w:proofErr w:type="gramStart"/>
+            <w:r>
+              <w:rPr>
+                <w:lang w:val="fr-FR" w:eastAsia="en-US"/>
+              </w:rPr>
+              <w:t>" }</w:t>
+            </w:r>
+            <w:proofErr w:type="gramEnd"/>
+            <w:r>
+              <w:rPr>
+                <w:lang w:val="fr-FR" w:eastAsia="en-US"/>
+              </w:rPr>
+              <w:t>)</w:t>
             </w:r>
           </w:p>
           <w:p>
@@ -3421,35 +4134,89 @@
               </w:rPr>
               <w:t xml:space="preserve"> </w:t>
             </w:r>
-            <w:r>
-              <w:rPr>
-                <w:lang w:val="fr-FR" w:eastAsia="en-US"/>
-              </w:rPr>
-              <w:t xml:space="preserve">db.Livres.find().sort({ </w:t>
-            </w:r>
-            <w:r>
-              <w:rPr>
-                <w:lang w:val="fr-FR" w:eastAsia="en-US"/>
-              </w:rPr>
-              <w:t>note_popularite</w:t>
-            </w:r>
-            <w:r>
-              <w:rPr>
-                <w:lang w:val="fr-FR" w:eastAsia="en-US"/>
-              </w:rPr>
-              <w:t xml:space="preserve">: </w:t>
-            </w:r>
-            <w:r>
-              <w:rPr>
-                <w:lang w:val="fr-FR" w:eastAsia="en-US"/>
-              </w:rPr>
-              <w:t>-1</w:t>
-            </w:r>
-            <w:r>
-              <w:rPr>
-                <w:lang w:val="fr-FR" w:eastAsia="en-US"/>
-              </w:rPr>
-              <w:t xml:space="preserve"> })</w:t>
+            <w:proofErr w:type="spellStart"/>
+            <w:proofErr w:type="gramStart"/>
+            <w:r>
+              <w:rPr>
+                <w:lang w:val="fr-FR" w:eastAsia="en-US"/>
+              </w:rPr>
+              <w:t>db.Livres.find</w:t>
+            </w:r>
+            <w:proofErr w:type="spellEnd"/>
+            <w:proofErr w:type="gramEnd"/>
+            <w:r>
+              <w:rPr>
+                <w:lang w:val="fr-FR" w:eastAsia="en-US"/>
+              </w:rPr>
+              <w:t>(</w:t>
+            </w:r>
+            <w:proofErr w:type="gramStart"/>
+            <w:r>
+              <w:rPr>
+                <w:lang w:val="fr-FR" w:eastAsia="en-US"/>
+              </w:rPr>
+              <w:t xml:space="preserve">).sort({ </w:t>
+            </w:r>
+            <w:proofErr w:type="spellStart"/>
+            <w:r>
+              <w:rPr>
+                <w:lang w:val="fr-FR" w:eastAsia="en-US"/>
+              </w:rPr>
+              <w:t>note</w:t>
+            </w:r>
+            <w:proofErr w:type="gramEnd"/>
+            <w:r>
+              <w:rPr>
+                <w:lang w:val="fr-FR" w:eastAsia="en-US"/>
+              </w:rPr>
+              <w:t>_</w:t>
+            </w:r>
+            <w:proofErr w:type="gramStart"/>
+            <w:r>
+              <w:rPr>
+                <w:lang w:val="fr-FR" w:eastAsia="en-US"/>
+              </w:rPr>
+              <w:t>popularite</w:t>
+            </w:r>
+            <w:proofErr w:type="spellEnd"/>
+            <w:r>
+              <w:rPr>
+                <w:lang w:val="fr-FR" w:eastAsia="en-US"/>
+              </w:rPr>
+              <w:t>:</w:t>
+            </w:r>
+            <w:proofErr w:type="gramEnd"/>
+            <w:r>
+              <w:rPr>
+                <w:lang w:val="fr-FR" w:eastAsia="en-US"/>
+              </w:rPr>
+              <w:t xml:space="preserve"> </w:t>
+            </w:r>
+            <w:r>
+              <w:rPr>
+                <w:lang w:val="fr-FR" w:eastAsia="en-US"/>
+              </w:rPr>
+              <w:t>-</w:t>
+            </w:r>
+            <w:proofErr w:type="gramStart"/>
+            <w:r>
+              <w:rPr>
+                <w:lang w:val="fr-FR" w:eastAsia="en-US"/>
+              </w:rPr>
+              <w:t>1</w:t>
+            </w:r>
+            <w:r>
+              <w:rPr>
+                <w:lang w:val="fr-FR" w:eastAsia="en-US"/>
+              </w:rPr>
+              <w:t xml:space="preserve"> }</w:t>
+            </w:r>
+            <w:proofErr w:type="gramEnd"/>
+            <w:r>
+              <w:rPr>
+                <w:lang w:val="fr-FR" w:eastAsia="en-US"/>
+              </w:rPr>
+              <w:t>)</w:t>
             </w:r>
           </w:p>
           <w:p>
@@ -3544,6 +4311,34 @@
           <w:lang w:val="fr-FR"/>
         </w:rPr>
       </w:pPr>
+      <w:r>
+        <w:rPr>
+          <w:lang w:val="fr-FR"/>
+        </w:rPr>
+        <w:t>Une invitation a été envoyé à l’adresse courriel indiqué dans l’énoncé du projet.</w:t>
+      </w:r>
+    </w:p>
+    <w:p>
+      <w:pPr>
+        <w:rPr>
+          <w:lang w:val="fr-FR"/>
+        </w:rPr>
+      </w:pPr>
+      <w:hyperlink r:id="rId11" w:history="1">
+        <w:r>
+          <w:rPr>
+            <w:rStyle w:val="Lienhypertexte"/>
+            <w:lang w:val="fr-FR"/>
+          </w:rPr>
+          <w:t>https://cloud.mongodb.com/v2/68e3cdbdd5d52669661afa9a#/metrics/replicaSet/68ec63e96644d00b04753e17/explorer/projet2/Livres/find</w:t>
+        </w:r>
+      </w:hyperlink>
+      <w:r>
+        <w:rPr>
+          <w:lang w:val="fr-FR"/>
+        </w:rPr>
+        <w:t xml:space="preserve"> </w:t>
+      </w:r>
     </w:p>
     <w:p>
       <w:pPr>
@@ -3568,7 +4363,7 @@
           <w:lang w:val="fr-FR"/>
         </w:rPr>
       </w:pPr>
-      <w:hyperlink r:id="rId11" w:history="1">
+      <w:hyperlink r:id="rId12" w:history="1">
         <w:r>
           <w:rPr>
             <w:rStyle w:val="Lienhypertexte"/>
@@ -3584,7 +4379,7 @@
           <w:lang w:val="fr-FR"/>
         </w:rPr>
       </w:pPr>
-      <w:hyperlink r:id="rId12" w:history="1">
+      <w:hyperlink r:id="rId13" w:history="1">
         <w:r>
           <w:rPr>
             <w:rStyle w:val="Lienhypertexte"/>
@@ -3635,6 +4430,7 @@
         </w:rPr>
       </w:pPr>
       <w:bookmarkStart w:id="9" w:name="_Toc211255954"/>
+      <w:proofErr w:type="spellStart"/>
       <w:r>
         <w:rPr>
           <w:lang w:val="fr-FR" w:eastAsia="en-US"/>
@@ -3642,6 +4438,7 @@
         <w:t>Scrapy</w:t>
       </w:r>
       <w:bookmarkEnd w:id="9"/>
+      <w:proofErr w:type="spellEnd"/>
       <w:r>
         <w:rPr>
           <w:lang w:val="fr-FR" w:eastAsia="en-US"/>
@@ -3655,18 +4452,76 @@
           <w:lang w:val="fr-FR" w:eastAsia="en-US"/>
         </w:rPr>
       </w:pPr>
-      <w:r>
-        <w:rPr>
-          <w:lang w:val="fr-FR" w:eastAsia="en-US"/>
-        </w:rPr>
-        <w:t xml:space="preserve">Scrapy a quand même été facile à utiliser, surtout parce qu’il y a beaucoup de documentation. Il y a quand même eu quelques défis, au début nous avions choisi le site Best Buy, mais Best Buy bloque ce genre d’outil, donc j’ai essayé de contourner les protections avec Playwright, mais même après plus d’une heure, je n’étais pas en mesure de ramasser aucune donnée (à cause des protections et du fait que les informations sont chargées avec du JavaScript et non du HTML). J’ai donc décidé de changer de site, pour en utiliser un moins protégé et qui utilisait moins de JS. Je suis tombé sur le site </w:t>
-      </w:r>
-      <w:r>
-        <w:rPr>
-          <w:lang w:val="fr-FR" w:eastAsia="en-US"/>
-        </w:rPr>
-        <w:t>Open library</w:t>
-      </w:r>
+      <w:proofErr w:type="spellStart"/>
+      <w:r>
+        <w:rPr>
+          <w:lang w:val="fr-FR" w:eastAsia="en-US"/>
+        </w:rPr>
+        <w:t>Scrapy</w:t>
+      </w:r>
+      <w:proofErr w:type="spellEnd"/>
+      <w:r>
+        <w:rPr>
+          <w:lang w:val="fr-FR" w:eastAsia="en-US"/>
+        </w:rPr>
+        <w:t xml:space="preserve"> a quand même été facile à utiliser, surtout parce qu’il y a beaucoup de documentation. Il y a quand même eu quelques défis, au début nous avions choisi le site Best </w:t>
+      </w:r>
+      <w:proofErr w:type="spellStart"/>
+      <w:r>
+        <w:rPr>
+          <w:lang w:val="fr-FR" w:eastAsia="en-US"/>
+        </w:rPr>
+        <w:t>Buy</w:t>
+      </w:r>
+      <w:proofErr w:type="spellEnd"/>
+      <w:r>
+        <w:rPr>
+          <w:lang w:val="fr-FR" w:eastAsia="en-US"/>
+        </w:rPr>
+        <w:t xml:space="preserve">, mais Best </w:t>
+      </w:r>
+      <w:proofErr w:type="spellStart"/>
+      <w:r>
+        <w:rPr>
+          <w:lang w:val="fr-FR" w:eastAsia="en-US"/>
+        </w:rPr>
+        <w:t>Buy</w:t>
+      </w:r>
+      <w:proofErr w:type="spellEnd"/>
+      <w:r>
+        <w:rPr>
+          <w:lang w:val="fr-FR" w:eastAsia="en-US"/>
+        </w:rPr>
+        <w:t xml:space="preserve"> bloque ce genre d’outil, donc j’ai essayé de contourner les protections avec </w:t>
+      </w:r>
+      <w:proofErr w:type="spellStart"/>
+      <w:r>
+        <w:rPr>
+          <w:lang w:val="fr-FR" w:eastAsia="en-US"/>
+        </w:rPr>
+        <w:t>Playwright</w:t>
+      </w:r>
+      <w:proofErr w:type="spellEnd"/>
+      <w:r>
+        <w:rPr>
+          <w:lang w:val="fr-FR" w:eastAsia="en-US"/>
+        </w:rPr>
+        <w:t xml:space="preserve">, mais même après plus d’une heure, je n’étais pas en mesure de ramasser aucune donnée (à cause des protections et du fait que les informations sont chargées avec du JavaScript et non du HTML). J’ai donc décidé de changer de site, pour en utiliser un moins protégé et qui utilisait moins de JS. Je suis tombé sur le site </w:t>
+      </w:r>
+      <w:r>
+        <w:rPr>
+          <w:lang w:val="fr-FR" w:eastAsia="en-US"/>
+        </w:rPr>
+        <w:t xml:space="preserve">Open </w:t>
+      </w:r>
+      <w:proofErr w:type="spellStart"/>
+      <w:r>
+        <w:rPr>
+          <w:lang w:val="fr-FR" w:eastAsia="en-US"/>
+        </w:rPr>
+        <w:t>library</w:t>
+      </w:r>
+      <w:proofErr w:type="spellEnd"/>
       <w:r>
         <w:rPr>
           <w:lang w:val="fr-FR" w:eastAsia="en-US"/>
@@ -3677,7 +4532,21 @@
         <w:rPr>
           <w:lang w:val="fr-FR" w:eastAsia="en-US"/>
         </w:rPr>
-        <w:t>qui ne bloque pas les outils comme Scrapy et qui utilise peu de JavaScript</w:t>
+        <w:t xml:space="preserve">qui ne bloque pas les outils comme </w:t>
+      </w:r>
+      <w:proofErr w:type="spellStart"/>
+      <w:r>
+        <w:rPr>
+          <w:lang w:val="fr-FR" w:eastAsia="en-US"/>
+        </w:rPr>
+        <w:t>Scrapy</w:t>
+      </w:r>
+      <w:proofErr w:type="spellEnd"/>
+      <w:r>
+        <w:rPr>
+          <w:lang w:val="fr-FR" w:eastAsia="en-US"/>
+        </w:rPr>
+        <w:t xml:space="preserve"> et qui utilise peu de JavaScript</w:t>
       </w:r>
       <w:r>
         <w:rPr>
@@ -3701,7 +4570,21 @@
         <w:rPr>
           <w:lang w:val="fr-FR" w:eastAsia="en-US"/>
         </w:rPr>
-        <w:t xml:space="preserve">Ensuite, même si je donnais l’URL du site en français, les données recueillies étaient en anglais, mais Scrapy </w:t>
+        <w:t xml:space="preserve">Ensuite, même si je donnais l’URL du site en français, les données recueillies étaient en anglais, mais </w:t>
+      </w:r>
+      <w:proofErr w:type="spellStart"/>
+      <w:r>
+        <w:rPr>
+          <w:lang w:val="fr-FR" w:eastAsia="en-US"/>
+        </w:rPr>
+        <w:t>Scrapy</w:t>
+      </w:r>
+      <w:proofErr w:type="spellEnd"/>
+      <w:r>
+        <w:rPr>
+          <w:lang w:val="fr-FR" w:eastAsia="en-US"/>
+        </w:rPr>
+        <w:t xml:space="preserve"> </w:t>
       </w:r>
       <w:r>
         <w:rPr>
@@ -3753,7 +4636,21 @@
         <w:rPr>
           <w:lang w:val="fr-FR" w:eastAsia="en-US"/>
         </w:rPr>
-        <w:t>Donc pour le projet, j’ai eu quelques problèmes, mais avec un site plus accessible, Scrapy est facile à utiliser et beaucoup de choses sont possibles avec l’outil.</w:t>
+        <w:t xml:space="preserve">Donc pour le projet, j’ai eu quelques problèmes, mais avec un site plus accessible, </w:t>
+      </w:r>
+      <w:proofErr w:type="spellStart"/>
+      <w:r>
+        <w:rPr>
+          <w:lang w:val="fr-FR" w:eastAsia="en-US"/>
+        </w:rPr>
+        <w:t>Scrapy</w:t>
+      </w:r>
+      <w:proofErr w:type="spellEnd"/>
+      <w:r>
+        <w:rPr>
+          <w:lang w:val="fr-FR" w:eastAsia="en-US"/>
+        </w:rPr>
+        <w:t xml:space="preserve"> est facile à utiliser et beaucoup de choses sont possibles avec l’outil.</w:t>
       </w:r>
     </w:p>
     <w:p>
@@ -4114,7 +5011,21 @@
               <w:rPr>
                 <w:lang w:val="fr-FR" w:eastAsia="en-US"/>
               </w:rPr>
-              <w:t>Production de 3 requêtes de sélection (find)</w:t>
+              <w:t>Production de 3 requêtes de sélection (</w:t>
+            </w:r>
+            <w:proofErr w:type="spellStart"/>
+            <w:r>
+              <w:rPr>
+                <w:lang w:val="fr-FR" w:eastAsia="en-US"/>
+              </w:rPr>
+              <w:t>find</w:t>
+            </w:r>
+            <w:proofErr w:type="spellEnd"/>
+            <w:r>
+              <w:rPr>
+                <w:lang w:val="fr-FR" w:eastAsia="en-US"/>
+              </w:rPr>
+              <w:t>)</w:t>
             </w:r>
           </w:p>
           <w:p>
@@ -4220,8 +5131,16 @@
               <w:rPr>
                 <w:lang w:val="fr-FR" w:eastAsia="en-US"/>
               </w:rPr>
-              <w:t>Recherche de l’outil de webscraping</w:t>
-            </w:r>
+              <w:t xml:space="preserve">Recherche de l’outil de </w:t>
+            </w:r>
+            <w:proofErr w:type="spellStart"/>
+            <w:r>
+              <w:rPr>
+                <w:lang w:val="fr-FR" w:eastAsia="en-US"/>
+              </w:rPr>
+              <w:t>webscraping</w:t>
+            </w:r>
+            <w:proofErr w:type="spellEnd"/>
             <w:r>
               <w:rPr>
                 <w:lang w:val="fr-FR" w:eastAsia="en-US"/>
@@ -4341,7 +5260,7 @@
                     <pic:cNvPicPr/>
                   </pic:nvPicPr>
                   <pic:blipFill>
-                    <a:blip r:embed="rId13"/>
+                    <a:blip r:embed="rId14"/>
                     <a:stretch>
                       <a:fillRect/>
                     </a:stretch>
@@ -4387,7 +5306,7 @@
                     <pic:cNvPicPr/>
                   </pic:nvPicPr>
                   <pic:blipFill>
-                    <a:blip r:embed="rId14"/>
+                    <a:blip r:embed="rId15"/>
                     <a:stretch>
                       <a:fillRect/>
                     </a:stretch>
@@ -4425,7 +5344,7 @@
       </w:pPr>
     </w:p>
     <w:sectPr>
-      <w:footerReference w:type="default" r:id="rId15"/>
+      <w:footerReference w:type="default" r:id="rId16"/>
       <w:pgSz w:w="12240" w:h="15840"/>
       <w:pgMar w:top="1418" w:right="1304" w:bottom="1418" w:left="1304" w:header="709" w:footer="709" w:gutter="0"/>
       <w:cols w:space="708"/>

</xml_diff>